<commit_message>
GOV: Define autonomous ticket approval controls
</commit_message>
<xml_diff>
--- a/docs/reference-source/Wesnoth_Agent_Development_Functional_Specification.docx
+++ b/docs/reference-source/Wesnoth_Agent_Development_Functional_Specification.docx
@@ -1901,6 +1901,188 @@
         <w:pStyle w:val="Heading3"/>
       </w:pPr>
       <w:r>
+        <w:t>Optional continuous automation mode</w:t>
+      </w:r>
+    </w:p>
+    <w:p>
+      <w:pPr/>
+      <w:r>
+        <w:t>The localhost Agent Manager may offer a human-controlled automation toggle for the selected Sol coordinator mode. This is an alternate ticket-scheduling mode, not an exemption from deterministic governance.</w:t>
+      </w:r>
+    </w:p>
+    <w:p>
+      <w:pPr/>
+      <w:r>
+        <w:t>When automation is enabled:</w:t>
+      </w:r>
+    </w:p>
+    <w:p>
+      <w:pPr>
+        <w:pStyle w:val="ListBullet"/>
+      </w:pPr>
+      <w:r>
+        <w:t>Sol may read the controlled references and continuity ledger, prioritize the planned backlog, and propose one bounded ticket at a time;</w:t>
+      </w:r>
+    </w:p>
+    <w:p>
+      <w:pPr>
+        <w:pStyle w:val="ListBullet"/>
+      </w:pPr>
+      <w:r>
+        <w:t>Python remains the authoritative state machine and must validate each ticket, create its isolated worktree, enforce path scope, and run every applicable deterministic, engine, tester, and reviewer gate;</w:t>
+      </w:r>
+    </w:p>
+    <w:p>
+      <w:pPr>
+        <w:pStyle w:val="ListBullet"/>
+      </w:pPr>
+      <w:r>
+        <w:t>a passing ticket may be committed locally to its ticket branch and added to a FIFO approval queue, but it must not be pushed, opened as a PR, merged, or applied to protected main without a separate explicit human approval for that exact queued commit;</w:t>
+      </w:r>
+    </w:p>
+    <w:p>
+      <w:pPr>
+        <w:pStyle w:val="ListBullet"/>
+      </w:pPr>
+      <w:r>
+        <w:t>subsequent dependent tickets may be based on the preceding queued head so unattended work can continue, but approvals and publication must occur in dependency order; rejecting or invalidating an upstream item makes dependent queue entries stale and requires deterministic replanning;</w:t>
+      </w:r>
+    </w:p>
+    <w:p>
+      <w:pPr>
+        <w:pStyle w:val="ListBullet"/>
+      </w:pPr>
+      <w:r>
+        <w:t>turning automation off prevents another ticket from starting. An active ticket proceeds only to its next safe deterministic stopping point before control returns to the manual Python/Bash workflow; and</w:t>
+      </w:r>
+    </w:p>
+    <w:p>
+      <w:pPr>
+        <w:pStyle w:val="ListBullet"/>
+      </w:pPr>
+      <w:r>
+        <w:t>any failed mandatory gate, unresolved reviewer result, scope violation, provider failure outside established retry policy, dirty or unexpected Git state, publication failure, or approval mismatch pauses automation and is recorded as an error. Automation must never reinterpret failure as approval.</w:t>
+      </w:r>
+    </w:p>
+    <w:p>
+      <w:pPr/>
+      <w:r>
+        <w:t>Automation does not grant a worker shell access, ownership of main, access to credentials, or authority to weaken branch protection. Planning models remain nondeterministic inputs to the Python coordinator.</w:t>
+      </w:r>
+    </w:p>
+    <w:p>
+      <w:pPr>
+        <w:pStyle w:val="Heading4"/>
+      </w:pPr>
+      <w:r>
+        <w:t>Ticket approval queue and publication</w:t>
+      </w:r>
+    </w:p>
+    <w:p>
+      <w:pPr/>
+      <w:r>
+        <w:t>Each passing local commit enters a repository-owned approval record containing at minimum the ticket ID, purpose, expected mod impact, dependency position, changed paths, branch, base SHA, exact commit SHA, validation evidence, reviewer verdict, and publication state. Queue records must expose no credential values.</w:t>
+      </w:r>
+    </w:p>
+    <w:p>
+      <w:pPr/>
+      <w:r>
+        <w:t>The dashboard may present one approval action for the fixed publication pipeline. That action is authorization for the exact queued commit only. The deterministic controller must then, in order:</w:t>
+      </w:r>
+    </w:p>
+    <w:p>
+      <w:pPr/>
+      <w:r>
+        <w:t>1. verify that the queue record, branch, commit, diff, dependency order, and local PASS evidence are unchanged;</w:t>
+      </w:r>
+    </w:p>
+    <w:p>
+      <w:pPr/>
+      <w:r>
+        <w:t>2. push the ticket branch without force;</w:t>
+      </w:r>
+    </w:p>
+    <w:p>
+      <w:pPr/>
+      <w:r>
+        <w:t>3. create or update its pull request with validation evidence;</w:t>
+      </w:r>
+    </w:p>
+    <w:p>
+      <w:pPr/>
+      <w:r>
+        <w:t>4. wait for required GitHub checks on the exact PR head;</w:t>
+      </w:r>
+    </w:p>
+    <w:p>
+      <w:pPr/>
+      <w:r>
+        <w:t>5. merge only through protected-branch policy after every required check and conversation rule passes; and</w:t>
+      </w:r>
+    </w:p>
+    <w:p>
+      <w:pPr/>
+      <w:r>
+        <w:t>6. synchronize local main and update structured queue evidence.</w:t>
+      </w:r>
+    </w:p>
+    <w:p>
+      <w:pPr/>
+      <w:r>
+        <w:t>A single approval does not authorize later commits, other queue items, direct pushes to main, force pushes, branch-protection bypass, or credential access. Any head change, failed check, merge conflict, unexpected remote state, or policy rejection terminates the pipeline and requires a new review/approval.</w:t>
+      </w:r>
+    </w:p>
+    <w:p>
+      <w:pPr>
+        <w:pStyle w:val="Heading4"/>
+      </w:pPr>
+      <w:r>
+        <w:t>File deletion approval</w:t>
+      </w:r>
+    </w:p>
+    <w:p>
+      <w:pPr/>
+      <w:r>
+        <w:t>Before creating a local ticket commit, Python must inspect the actual Git diff for deleted files. If any deletion exists, the ticket and continuous scheduler pause and a dedicated deletion manifest is created. The manifest must bind the ticket ID, branch, base SHA, candidate tree identity, exact deleted paths, prior blob identities, stated reasons, and expected impact to a unique request ID.</w:t>
+      </w:r>
+    </w:p>
+    <w:p>
+      <w:pPr/>
+      <w:r>
+        <w:t>The request is routed to a Codex-hosted approval task or automation so the project owner can receive a mobile notification when supported by the signed-in Codex/ChatGPT client. Notification delivery is advisory; the local fail-closed gate is authoritative. Codex must record an explicit approve or reject decision for the exact manifest. A changed path set, candidate tree, branch, or request identity invalidates the decision. No deletion commit, later ticket, push, PR, or merge may proceed while this gate is unresolved.</w:t>
+      </w:r>
+    </w:p>
+    <w:p>
+      <w:pPr>
+        <w:pStyle w:val="Heading4"/>
+      </w:pPr>
+      <w:r>
+        <w:t>Dashboard presentation</w:t>
+      </w:r>
+    </w:p>
+    <w:p>
+      <w:pPr/>
+      <w:r>
+        <w:t>The dashboard places validated local commits in a Ticket approval queue. Each item has an expandable summary of purpose, expected mod impact, files, gates, dependencies, and publication state. The per-ticket approval action is enabled only when deterministic prerequisites are satisfied.</w:t>
+      </w:r>
+    </w:p>
+    <w:p>
+      <w:pPr/>
+      <w:r>
+        <w:t>The former routing-history surface becomes Activity log and errors. It combines structured coordinator, routing, validation, approval, and publication events. Error-bearing entries use the established red alert treatment and open an accessible detail dialog when selected. Secrets, environment values, raw credential-bearing logs, and arbitrary filesystem content must never be shown.</w:t>
+      </w:r>
+    </w:p>
+    <w:p>
+      <w:pPr/>
+      <w:r>
+        <w:t>Ordinary tickets remain unable to modify controlled references. A controlled reference change must be a clearly identified governance ticket, synchronize all affected Markdown/DOCX representations and manifest values, pass the reference-package self-test, and receive its own exact-commit publication approval through the queue.</w:t>
+      </w:r>
+    </w:p>
+    <w:p>
+      <w:pPr>
+        <w:pStyle w:val="Heading3"/>
+      </w:pPr>
+      <w:r>
         <w:t>Stage 8 - Commit and GitHub publication</w:t>
       </w:r>
     </w:p>
@@ -3196,6 +3378,30 @@
     </w:p>
     <w:p>
       <w:pPr>
+        <w:pStyle w:val="ListBullet"/>
+      </w:pPr>
+      <w:r>
+        <w:t>bind a dashboard publication approval to one exact queued commit and execute the fixed push/PR/exact-head-CI/protected-merge sequence without broad shell input from the browser;</w:t>
+      </w:r>
+    </w:p>
+    <w:p>
+      <w:pPr>
+        <w:pStyle w:val="ListBullet"/>
+      </w:pPr>
+      <w:r>
+        <w:t>maintain FIFO dependency ordering for queued autonomous tickets; and</w:t>
+      </w:r>
+    </w:p>
+    <w:p>
+      <w:pPr>
+        <w:pStyle w:val="ListBullet"/>
+      </w:pPr>
+      <w:r>
+        <w:t>pause before any file deletion until an exact deletion manifest is explicitly approved through the Codex-routed approval channel.</w:t>
+      </w:r>
+    </w:p>
+    <w:p>
+      <w:pPr>
         <w:pStyle w:val="Heading3"/>
       </w:pPr>
       <w:r>
@@ -3276,7 +3482,15 @@
         <w:pStyle w:val="ListBullet"/>
       </w:pPr>
       <w:r>
-        <w:t>task history;</w:t>
+        <w:t>ticket approval queue with expandable purpose and impact summaries;</w:t>
+      </w:r>
+    </w:p>
+    <w:p>
+      <w:pPr>
+        <w:pStyle w:val="ListBullet"/>
+      </w:pPr>
+      <w:r>
+        <w:t>activity log and errors with accessible error-detail dialogs;</w:t>
       </w:r>
     </w:p>
     <w:p>

</xml_diff>

<commit_message>
GOV: Define autonomous ticket approval controls (#17)
Co-authored-by: Your Name <your-email@example.com>
</commit_message>
<xml_diff>
--- a/docs/reference-source/Wesnoth_Agent_Development_Functional_Specification.docx
+++ b/docs/reference-source/Wesnoth_Agent_Development_Functional_Specification.docx
@@ -1901,6 +1901,188 @@
         <w:pStyle w:val="Heading3"/>
       </w:pPr>
       <w:r>
+        <w:t>Optional continuous automation mode</w:t>
+      </w:r>
+    </w:p>
+    <w:p>
+      <w:pPr/>
+      <w:r>
+        <w:t>The localhost Agent Manager may offer a human-controlled automation toggle for the selected Sol coordinator mode. This is an alternate ticket-scheduling mode, not an exemption from deterministic governance.</w:t>
+      </w:r>
+    </w:p>
+    <w:p>
+      <w:pPr/>
+      <w:r>
+        <w:t>When automation is enabled:</w:t>
+      </w:r>
+    </w:p>
+    <w:p>
+      <w:pPr>
+        <w:pStyle w:val="ListBullet"/>
+      </w:pPr>
+      <w:r>
+        <w:t>Sol may read the controlled references and continuity ledger, prioritize the planned backlog, and propose one bounded ticket at a time;</w:t>
+      </w:r>
+    </w:p>
+    <w:p>
+      <w:pPr>
+        <w:pStyle w:val="ListBullet"/>
+      </w:pPr>
+      <w:r>
+        <w:t>Python remains the authoritative state machine and must validate each ticket, create its isolated worktree, enforce path scope, and run every applicable deterministic, engine, tester, and reviewer gate;</w:t>
+      </w:r>
+    </w:p>
+    <w:p>
+      <w:pPr>
+        <w:pStyle w:val="ListBullet"/>
+      </w:pPr>
+      <w:r>
+        <w:t>a passing ticket may be committed locally to its ticket branch and added to a FIFO approval queue, but it must not be pushed, opened as a PR, merged, or applied to protected main without a separate explicit human approval for that exact queued commit;</w:t>
+      </w:r>
+    </w:p>
+    <w:p>
+      <w:pPr>
+        <w:pStyle w:val="ListBullet"/>
+      </w:pPr>
+      <w:r>
+        <w:t>subsequent dependent tickets may be based on the preceding queued head so unattended work can continue, but approvals and publication must occur in dependency order; rejecting or invalidating an upstream item makes dependent queue entries stale and requires deterministic replanning;</w:t>
+      </w:r>
+    </w:p>
+    <w:p>
+      <w:pPr>
+        <w:pStyle w:val="ListBullet"/>
+      </w:pPr>
+      <w:r>
+        <w:t>turning automation off prevents another ticket from starting. An active ticket proceeds only to its next safe deterministic stopping point before control returns to the manual Python/Bash workflow; and</w:t>
+      </w:r>
+    </w:p>
+    <w:p>
+      <w:pPr>
+        <w:pStyle w:val="ListBullet"/>
+      </w:pPr>
+      <w:r>
+        <w:t>any failed mandatory gate, unresolved reviewer result, scope violation, provider failure outside established retry policy, dirty or unexpected Git state, publication failure, or approval mismatch pauses automation and is recorded as an error. Automation must never reinterpret failure as approval.</w:t>
+      </w:r>
+    </w:p>
+    <w:p>
+      <w:pPr/>
+      <w:r>
+        <w:t>Automation does not grant a worker shell access, ownership of main, access to credentials, or authority to weaken branch protection. Planning models remain nondeterministic inputs to the Python coordinator.</w:t>
+      </w:r>
+    </w:p>
+    <w:p>
+      <w:pPr>
+        <w:pStyle w:val="Heading4"/>
+      </w:pPr>
+      <w:r>
+        <w:t>Ticket approval queue and publication</w:t>
+      </w:r>
+    </w:p>
+    <w:p>
+      <w:pPr/>
+      <w:r>
+        <w:t>Each passing local commit enters a repository-owned approval record containing at minimum the ticket ID, purpose, expected mod impact, dependency position, changed paths, branch, base SHA, exact commit SHA, validation evidence, reviewer verdict, and publication state. Queue records must expose no credential values.</w:t>
+      </w:r>
+    </w:p>
+    <w:p>
+      <w:pPr/>
+      <w:r>
+        <w:t>The dashboard may present one approval action for the fixed publication pipeline. That action is authorization for the exact queued commit only. The deterministic controller must then, in order:</w:t>
+      </w:r>
+    </w:p>
+    <w:p>
+      <w:pPr/>
+      <w:r>
+        <w:t>1. verify that the queue record, branch, commit, diff, dependency order, and local PASS evidence are unchanged;</w:t>
+      </w:r>
+    </w:p>
+    <w:p>
+      <w:pPr/>
+      <w:r>
+        <w:t>2. push the ticket branch without force;</w:t>
+      </w:r>
+    </w:p>
+    <w:p>
+      <w:pPr/>
+      <w:r>
+        <w:t>3. create or update its pull request with validation evidence;</w:t>
+      </w:r>
+    </w:p>
+    <w:p>
+      <w:pPr/>
+      <w:r>
+        <w:t>4. wait for required GitHub checks on the exact PR head;</w:t>
+      </w:r>
+    </w:p>
+    <w:p>
+      <w:pPr/>
+      <w:r>
+        <w:t>5. merge only through protected-branch policy after every required check and conversation rule passes; and</w:t>
+      </w:r>
+    </w:p>
+    <w:p>
+      <w:pPr/>
+      <w:r>
+        <w:t>6. synchronize local main and update structured queue evidence.</w:t>
+      </w:r>
+    </w:p>
+    <w:p>
+      <w:pPr/>
+      <w:r>
+        <w:t>A single approval does not authorize later commits, other queue items, direct pushes to main, force pushes, branch-protection bypass, or credential access. Any head change, failed check, merge conflict, unexpected remote state, or policy rejection terminates the pipeline and requires a new review/approval.</w:t>
+      </w:r>
+    </w:p>
+    <w:p>
+      <w:pPr>
+        <w:pStyle w:val="Heading4"/>
+      </w:pPr>
+      <w:r>
+        <w:t>File deletion approval</w:t>
+      </w:r>
+    </w:p>
+    <w:p>
+      <w:pPr/>
+      <w:r>
+        <w:t>Before creating a local ticket commit, Python must inspect the actual Git diff for deleted files. If any deletion exists, the ticket and continuous scheduler pause and a dedicated deletion manifest is created. The manifest must bind the ticket ID, branch, base SHA, candidate tree identity, exact deleted paths, prior blob identities, stated reasons, and expected impact to a unique request ID.</w:t>
+      </w:r>
+    </w:p>
+    <w:p>
+      <w:pPr/>
+      <w:r>
+        <w:t>The request is routed to a Codex-hosted approval task or automation so the project owner can receive a mobile notification when supported by the signed-in Codex/ChatGPT client. Notification delivery is advisory; the local fail-closed gate is authoritative. Codex must record an explicit approve or reject decision for the exact manifest. A changed path set, candidate tree, branch, or request identity invalidates the decision. No deletion commit, later ticket, push, PR, or merge may proceed while this gate is unresolved.</w:t>
+      </w:r>
+    </w:p>
+    <w:p>
+      <w:pPr>
+        <w:pStyle w:val="Heading4"/>
+      </w:pPr>
+      <w:r>
+        <w:t>Dashboard presentation</w:t>
+      </w:r>
+    </w:p>
+    <w:p>
+      <w:pPr/>
+      <w:r>
+        <w:t>The dashboard places validated local commits in a Ticket approval queue. Each item has an expandable summary of purpose, expected mod impact, files, gates, dependencies, and publication state. The per-ticket approval action is enabled only when deterministic prerequisites are satisfied.</w:t>
+      </w:r>
+    </w:p>
+    <w:p>
+      <w:pPr/>
+      <w:r>
+        <w:t>The former routing-history surface becomes Activity log and errors. It combines structured coordinator, routing, validation, approval, and publication events. Error-bearing entries use the established red alert treatment and open an accessible detail dialog when selected. Secrets, environment values, raw credential-bearing logs, and arbitrary filesystem content must never be shown.</w:t>
+      </w:r>
+    </w:p>
+    <w:p>
+      <w:pPr/>
+      <w:r>
+        <w:t>Ordinary tickets remain unable to modify controlled references. A controlled reference change must be a clearly identified governance ticket, synchronize all affected Markdown/DOCX representations and manifest values, pass the reference-package self-test, and receive its own exact-commit publication approval through the queue.</w:t>
+      </w:r>
+    </w:p>
+    <w:p>
+      <w:pPr>
+        <w:pStyle w:val="Heading3"/>
+      </w:pPr>
+      <w:r>
         <w:t>Stage 8 - Commit and GitHub publication</w:t>
       </w:r>
     </w:p>
@@ -3196,6 +3378,30 @@
     </w:p>
     <w:p>
       <w:pPr>
+        <w:pStyle w:val="ListBullet"/>
+      </w:pPr>
+      <w:r>
+        <w:t>bind a dashboard publication approval to one exact queued commit and execute the fixed push/PR/exact-head-CI/protected-merge sequence without broad shell input from the browser;</w:t>
+      </w:r>
+    </w:p>
+    <w:p>
+      <w:pPr>
+        <w:pStyle w:val="ListBullet"/>
+      </w:pPr>
+      <w:r>
+        <w:t>maintain FIFO dependency ordering for queued autonomous tickets; and</w:t>
+      </w:r>
+    </w:p>
+    <w:p>
+      <w:pPr>
+        <w:pStyle w:val="ListBullet"/>
+      </w:pPr>
+      <w:r>
+        <w:t>pause before any file deletion until an exact deletion manifest is explicitly approved through the Codex-routed approval channel.</w:t>
+      </w:r>
+    </w:p>
+    <w:p>
+      <w:pPr>
         <w:pStyle w:val="Heading3"/>
       </w:pPr>
       <w:r>
@@ -3276,7 +3482,15 @@
         <w:pStyle w:val="ListBullet"/>
       </w:pPr>
       <w:r>
-        <w:t>task history;</w:t>
+        <w:t>ticket approval queue with expandable purpose and impact summaries;</w:t>
+      </w:r>
+    </w:p>
+    <w:p>
+      <w:pPr>
+        <w:pStyle w:val="ListBullet"/>
+      </w:pPr>
+      <w:r>
+        <w:t>activity log and errors with accessible error-detail dialogs;</w:t>
       </w:r>
     </w:p>
     <w:p>

</xml_diff>

<commit_message>
GOV: bound autonomous error recovery
</commit_message>
<xml_diff>
--- a/docs/reference-source/Wesnoth_Agent_Development_Functional_Specification.docx
+++ b/docs/reference-source/Wesnoth_Agent_Development_Functional_Specification.docx
@@ -1961,7 +1961,15 @@
         <w:pStyle w:val="ListBullet"/>
       </w:pPr>
       <w:r>
-        <w:t>any failed mandatory gate, unresolved reviewer result, scope violation, provider failure outside established retry policy, dirty or unexpected Git state, publication failure, or approval mismatch pauses automation and is recorded as an error. Automation must never reinterpret failure as approval.</w:t>
+        <w:t>an eligible implementation, validation, tester, or reviewer error may enter the bounded recovery policy below before it becomes a final failure; and</w:t>
+      </w:r>
+    </w:p>
+    <w:p>
+      <w:pPr>
+        <w:pStyle w:val="ListBullet"/>
+      </w:pPr>
+      <w:r>
+        <w:t>any unrecovered mandatory-gate failure, scope violation, provider failure outside established retry policy, dirty or unexpected Git state, publication failure, or approval mismatch pauses automation and is recorded as an error. Automation must never reinterpret failure as approval.</w:t>
       </w:r>
     </w:p>
     <w:p>
@@ -1975,6 +1983,38 @@
         <w:pStyle w:val="Heading4"/>
       </w:pPr>
       <w:r>
+        <w:t>Bounded autonomous error recovery</w:t>
+      </w:r>
+    </w:p>
+    <w:p>
+      <w:pPr/>
+      <w:r>
+        <w:t>When continuous automation is enabled, the deterministic coordinator may ask the selected coordinator model to diagnose and address an error only when the error is supported by structured, secret-free evidence and can be corrected inside the active ticket's existing allowed paths. Eligible errors are limited to implementation defects, deterministic validation failures attributable to the candidate change, tester failures, and reviewer requests for changes.</w:t>
+      </w:r>
+    </w:p>
+    <w:p>
+      <w:pPr/>
+      <w:r>
+        <w:t>Recovery is limited to two attempts per ticket. Each attempt must record the failure class, safe diagnostic summary, attempt number, proposed corrective action, changed paths, and resulting gate evidence. The coordinator must use a narrow corrective brief, preserve the original ticket scope, reject protected or expanded paths, and rerun every applicable deterministic, engine, tester, and reviewer gate. A complete PASS resets the recovery counter. Failure after the second attempt pauses automation and leaves the candidate uncommitted.</w:t>
+      </w:r>
+    </w:p>
+    <w:p>
+      <w:pPr/>
+      <w:r>
+        <w:t>The coordinator must stop immediately, without spending recovery attempts, for errors an implementation ticket cannot safely resolve: dirty or unexpected repository state; deletion approval; missing human approval; protected-path, scope, governance, or security violations; missing credentials or secure bridge; unavailable planner/provider outside existing retry policy; ambiguous or credential-bearing diagnostics; publication, branch-protection, remote-head, merge, or approval mismatch; and explicit user stop. These are recorded with a specific safe reason and required human action.</w:t>
+      </w:r>
+    </w:p>
+    <w:p>
+      <w:pPr/>
+      <w:r>
+        <w:t>Before planning new or recovery work, the coordinator must include structured local queue and open pull-request/branch context so it does not duplicate an existing ticket. If that inventory cannot be established reliably, automation pauses instead of guessing.</w:t>
+      </w:r>
+    </w:p>
+    <w:p>
+      <w:pPr>
+        <w:pStyle w:val="Heading4"/>
+      </w:pPr>
+      <w:r>
         <w:t>Ticket approval queue and publication</w:t>
       </w:r>
     </w:p>
@@ -2069,7 +2109,7 @@
     <w:p>
       <w:pPr/>
       <w:r>
-        <w:t>The former routing-history surface becomes Activity log and errors. It combines structured coordinator, routing, validation, approval, and publication events. Error-bearing entries use the established red alert treatment and open an accessible detail dialog when selected. Secrets, environment values, raw credential-bearing logs, and arbitrary filesystem content must never be shown.</w:t>
+        <w:t>The former routing-history surface becomes Activity log and errors. It combines structured coordinator, routing, validation, approval, and publication events. Recovery entries show the error class, current attempt out of two, corrective action, and resulting state. Error-bearing entries use the established red alert treatment and open an accessible detail dialog containing the specific safe diagnostic and required next action when selected. Secrets, environment values, raw credential-bearing logs, and arbitrary filesystem content must never be shown.</w:t>
       </w:r>
     </w:p>
     <w:p>

</xml_diff>

<commit_message>
DASH-005: add Terra implementer fallback
</commit_message>
<xml_diff>
--- a/docs/reference-source/Wesnoth_Agent_Development_Functional_Specification.docx
+++ b/docs/reference-source/Wesnoth_Agent_Development_Functional_Specification.docx
@@ -850,7 +850,7 @@
           </w:tcPr>
           <w:p>
             <w:r>
-              <w:t>Groq - `groq/openai/gpt-oss-120b`</w:t>
+              <w:t>Groq - `groq/openai/gpt-oss-120b`; one fallback: OpenAI `gpt-5.6-terra` at medium reasoning</w:t>
             </w:r>
           </w:p>
         </w:tc>
@@ -1017,6 +1017,22 @@
         <w:pStyle w:val="ListBullet"/>
       </w:pPr>
       <w:r>
+        <w:t>When the primary GPT-OSS Implementer process fails, the coordinator may invoke exactly one GPT-5.6 Terra fallback at medium reasoning in the same isolated worktree. The fallback uses workspace-write sandboxing, disabled web search, an ephemeral session, a credential-stripped environment, the original objective, and the original allowed-path boundary. It may not commit, merge, push, broaden scope, or run as a Fast-Fix fallback.</w:t>
+      </w:r>
+    </w:p>
+    <w:p>
+      <w:pPr>
+        <w:pStyle w:val="ListBullet"/>
+      </w:pPr>
+      <w:r>
+        <w:t>A failed Terra fallback is an immediate provider/worker hard stop and does not consume either of the two bounded code-recovery attempts. If Terra produces a candidate but a later deterministic, test, or review gate fails, the normal bounded recovery policy applies.</w:t>
+      </w:r>
+    </w:p>
+    <w:p>
+      <w:pPr>
+        <w:pStyle w:val="ListBullet"/>
+      </w:pPr>
+      <w:r>
         <w:t>Gemini reviewer may hit free-tier 429 RESOURCE_EXHAUSTED limits and time out.</w:t>
       </w:r>
     </w:p>
@@ -1182,6 +1198,14 @@
       </w:pPr>
       <w:r>
         <w:t>deterministic test execution belongs to Python, not the LLM worker.</w:t>
+      </w:r>
+    </w:p>
+    <w:p>
+      <w:pPr>
+        <w:pStyle w:val="ListBullet"/>
+      </w:pPr>
+      <w:r>
+        <w:t>The Terra Implementer fallback is a narrowly authorized exception to the OpenCode worker tool profile. Codex runs with its workspace-write sandbox, no web search, no forwarded provider credentials, and explicit instructions to edit only the allowed project paths. Deterministic scope and protected-path gates remain authoritative immediately after it returns; sandbox access never grants publication or governance authority.</w:t>
       </w:r>
     </w:p>
     <w:p>

</xml_diff>

<commit_message>
DASH-005: bounded autonomous error recovery (#19)
* GOV: bound autonomous error recovery

* DASH-005: add bounded autonomous error recovery

* DASH-005: add Terra implementer fallback

---------

Co-authored-by: Your Name <your-email@example.com>
</commit_message>
<xml_diff>
--- a/docs/reference-source/Wesnoth_Agent_Development_Functional_Specification.docx
+++ b/docs/reference-source/Wesnoth_Agent_Development_Functional_Specification.docx
@@ -850,7 +850,7 @@
           </w:tcPr>
           <w:p>
             <w:r>
-              <w:t>Groq - `groq/openai/gpt-oss-120b`</w:t>
+              <w:t>Groq - `groq/openai/gpt-oss-120b`; one fallback: OpenAI `gpt-5.6-terra` at medium reasoning</w:t>
             </w:r>
           </w:p>
         </w:tc>
@@ -1017,6 +1017,22 @@
         <w:pStyle w:val="ListBullet"/>
       </w:pPr>
       <w:r>
+        <w:t>When the primary GPT-OSS Implementer process fails, the coordinator may invoke exactly one GPT-5.6 Terra fallback at medium reasoning in the same isolated worktree. The fallback uses workspace-write sandboxing, disabled web search, an ephemeral session, a credential-stripped environment, the original objective, and the original allowed-path boundary. It may not commit, merge, push, broaden scope, or run as a Fast-Fix fallback.</w:t>
+      </w:r>
+    </w:p>
+    <w:p>
+      <w:pPr>
+        <w:pStyle w:val="ListBullet"/>
+      </w:pPr>
+      <w:r>
+        <w:t>A failed Terra fallback is an immediate provider/worker hard stop and does not consume either of the two bounded code-recovery attempts. If Terra produces a candidate but a later deterministic, test, or review gate fails, the normal bounded recovery policy applies.</w:t>
+      </w:r>
+    </w:p>
+    <w:p>
+      <w:pPr>
+        <w:pStyle w:val="ListBullet"/>
+      </w:pPr>
+      <w:r>
         <w:t>Gemini reviewer may hit free-tier 429 RESOURCE_EXHAUSTED limits and time out.</w:t>
       </w:r>
     </w:p>
@@ -1185,6 +1201,14 @@
       </w:r>
     </w:p>
     <w:p>
+      <w:pPr>
+        <w:pStyle w:val="ListBullet"/>
+      </w:pPr>
+      <w:r>
+        <w:t>The Terra Implementer fallback is a narrowly authorized exception to the OpenCode worker tool profile. Codex runs with its workspace-write sandbox, no web search, no forwarded provider credentials, and explicit instructions to edit only the allowed project paths. Deterministic scope and protected-path gates remain authoritative immediately after it returns; sandbox access never grants publication or governance authority.</w:t>
+      </w:r>
+    </w:p>
+    <w:p>
       <w:r>
         <w:t>Tool denial is an application-level security boundary. It is not claimed to be equivalent to a separately virtualized OS sandbox.</w:t>
       </w:r>
@@ -1961,7 +1985,15 @@
         <w:pStyle w:val="ListBullet"/>
       </w:pPr>
       <w:r>
-        <w:t>any failed mandatory gate, unresolved reviewer result, scope violation, provider failure outside established retry policy, dirty or unexpected Git state, publication failure, or approval mismatch pauses automation and is recorded as an error. Automation must never reinterpret failure as approval.</w:t>
+        <w:t>an eligible implementation, validation, tester, or reviewer error may enter the bounded recovery policy below before it becomes a final failure; and</w:t>
+      </w:r>
+    </w:p>
+    <w:p>
+      <w:pPr>
+        <w:pStyle w:val="ListBullet"/>
+      </w:pPr>
+      <w:r>
+        <w:t>any unrecovered mandatory-gate failure, scope violation, provider failure outside established retry policy, dirty or unexpected Git state, publication failure, or approval mismatch pauses automation and is recorded as an error. Automation must never reinterpret failure as approval.</w:t>
       </w:r>
     </w:p>
     <w:p>
@@ -1975,6 +2007,38 @@
         <w:pStyle w:val="Heading4"/>
       </w:pPr>
       <w:r>
+        <w:t>Bounded autonomous error recovery</w:t>
+      </w:r>
+    </w:p>
+    <w:p>
+      <w:pPr/>
+      <w:r>
+        <w:t>When continuous automation is enabled, the deterministic coordinator may ask the selected coordinator model to diagnose and address an error only when the error is supported by structured, secret-free evidence and can be corrected inside the active ticket's existing allowed paths. Eligible errors are limited to implementation defects, deterministic validation failures attributable to the candidate change, tester failures, and reviewer requests for changes.</w:t>
+      </w:r>
+    </w:p>
+    <w:p>
+      <w:pPr/>
+      <w:r>
+        <w:t>Recovery is limited to two attempts per ticket. Each attempt must record the failure class, safe diagnostic summary, attempt number, proposed corrective action, changed paths, and resulting gate evidence. The coordinator must use a narrow corrective brief, preserve the original ticket scope, reject protected or expanded paths, and rerun every applicable deterministic, engine, tester, and reviewer gate. A complete PASS resets the recovery counter. Failure after the second attempt pauses automation and leaves the candidate uncommitted.</w:t>
+      </w:r>
+    </w:p>
+    <w:p>
+      <w:pPr/>
+      <w:r>
+        <w:t>The coordinator must stop immediately, without spending recovery attempts, for errors an implementation ticket cannot safely resolve: dirty or unexpected repository state; deletion approval; missing human approval; protected-path, scope, governance, or security violations; missing credentials or secure bridge; unavailable planner/provider outside existing retry policy; ambiguous or credential-bearing diagnostics; publication, branch-protection, remote-head, merge, or approval mismatch; and explicit user stop. These are recorded with a specific safe reason and required human action.</w:t>
+      </w:r>
+    </w:p>
+    <w:p>
+      <w:pPr/>
+      <w:r>
+        <w:t>Before planning new or recovery work, the coordinator must include structured local queue and open pull-request/branch context so it does not duplicate an existing ticket. If that inventory cannot be established reliably, automation pauses instead of guessing.</w:t>
+      </w:r>
+    </w:p>
+    <w:p>
+      <w:pPr>
+        <w:pStyle w:val="Heading4"/>
+      </w:pPr>
+      <w:r>
         <w:t>Ticket approval queue and publication</w:t>
       </w:r>
     </w:p>
@@ -2049,7 +2113,7 @@
     <w:p>
       <w:pPr/>
       <w:r>
-        <w:t>The request is routed to a Codex-hosted approval task or automation so the project owner can receive a mobile notification when supported by the signed-in Codex/ChatGPT client. Notification delivery is advisory; the local fail-closed gate is authoritative. Codex must record an explicit approve or reject decision for the exact manifest. A changed path set, candidate tree, branch, or request identity invalidates the decision. No deletion commit, later ticket, push, PR, or merge may proceed while this gate is unresolved.</w:t>
+        <w:t>The request remains visible in the localhost dashboard approval queue for the project owner to inspect. No recurring Codex task, background chat message, or token-consuming notification job is required. The local fail-closed gate is authoritative and must record an explicit approve or reject decision for the exact manifest. A changed path set, candidate tree, branch, or request identity invalidates the decision. No deletion commit, later ticket, push, PR, or merge may proceed while this gate is unresolved.</w:t>
       </w:r>
     </w:p>
     <w:p>
@@ -2069,7 +2133,7 @@
     <w:p>
       <w:pPr/>
       <w:r>
-        <w:t>The former routing-history surface becomes Activity log and errors. It combines structured coordinator, routing, validation, approval, and publication events. Error-bearing entries use the established red alert treatment and open an accessible detail dialog when selected. Secrets, environment values, raw credential-bearing logs, and arbitrary filesystem content must never be shown.</w:t>
+        <w:t>The former routing-history surface becomes Activity log and errors. It combines structured coordinator, routing, validation, approval, and publication events. Recovery entries show the error class, current attempt out of two, corrective action, and resulting state. Error-bearing entries use the established red alert treatment and open an accessible detail dialog containing the specific safe diagnostic and required next action when selected. Secrets, environment values, raw credential-bearing logs, and arbitrary filesystem content must never be shown.</w:t>
       </w:r>
     </w:p>
     <w:p>

</xml_diff>

<commit_message>
GOV: require resume-first autonomous coordination
</commit_message>
<xml_diff>
--- a/docs/reference-source/Wesnoth_Agent_Development_Functional_Specification.docx
+++ b/docs/reference-source/Wesnoth_Agent_Development_Functional_Specification.docx
@@ -1385,6 +1385,14 @@
       </w:r>
     </w:p>
     <w:p>
+      <w:pPr>
+        <w:pStyle w:val="ListBullet"/>
+      </w:pPr>
+      <w:r>
+        <w:t>resume_branch where applicable; null for an explicitly authorized fresh ticket</w:t>
+      </w:r>
+    </w:p>
+    <w:p>
       <w:r>
         <w:t>Ticket objectives should be bounded, testable, and explicit about exclusions when omission is important.</w:t>
       </w:r>
@@ -1472,6 +1480,22 @@
       </w:r>
     </w:p>
     <w:p>
+      <w:pPr>
+        <w:pStyle w:val="ListBullet"/>
+      </w:pPr>
+      <w:r>
+        <w:t>structured evidence identifies any safe, nonterminal ticket remnants in coordinator-managed worktrees, including failed runs whose original scope remains recoverable;</w:t>
+      </w:r>
+    </w:p>
+    <w:p>
+      <w:pPr>
+        <w:pStyle w:val="ListBullet"/>
+      </w:pPr>
+      <w:r>
+        <w:t>branches already represented by a pull request or a passing terminal result are not resumable remnants.</w:t>
+      </w:r>
+    </w:p>
+    <w:p>
       <w:r>
         <w:t>Failure stops the run.</w:t>
       </w:r>
@@ -1506,6 +1530,18 @@
       </w:r>
     </w:p>
     <w:p>
+      <w:pPr/>
+      <w:r>
+        <w:t>If safe remnants exist for the selected unfinished ticket, resolve the existing worktree from trusted Git metadata and continue it in place under its original objective, worker, allowed paths, and validation profile.</w:t>
+      </w:r>
+    </w:p>
+    <w:p>
+      <w:pPr/>
+      <w:r>
+        <w:t>Do not discard, reset, recreate, or restart resumable work. Create a new branch/worktree only when the owner's coordinator brief explicitly requests a fresh ticket or a start from scratch.</w:t>
+      </w:r>
+    </w:p>
+    <w:p>
       <w:r>
         <w:t>No worker edits the main worktree.</w:t>
       </w:r>
@@ -1953,6 +1989,22 @@
         <w:pStyle w:val="ListBullet"/>
       </w:pPr>
       <w:r>
+        <w:t>Sol must prioritize safe resumable ticket remnants before new work and may select only the exact branch supplied by the deterministic planning inventory;</w:t>
+      </w:r>
+    </w:p>
+    <w:p>
+      <w:pPr>
+        <w:pStyle w:val="ListBullet"/>
+      </w:pPr>
+      <w:r>
+        <w:t>Sol must not create fresh work unless the current owner brief explicitly authorizes a fresh or new ticket or a start from scratch;</w:t>
+      </w:r>
+    </w:p>
+    <w:p>
+      <w:pPr>
+        <w:pStyle w:val="ListBullet"/>
+      </w:pPr>
+      <w:r>
         <w:t>Python remains the authoritative state machine and must validate each ticket, create its isolated worktree, enforce path scope, and run every applicable deterministic, engine, tester, and reviewer gate;</w:t>
       </w:r>
     </w:p>
@@ -2032,6 +2084,12 @@
       <w:pPr/>
       <w:r>
         <w:t>Before planning new or recovery work, the coordinator must include structured local queue and open pull-request/branch context so it does not duplicate an existing ticket. If that inventory cannot be established reliably, automation pauses instead of guessing.</w:t>
+      </w:r>
+    </w:p>
+    <w:p>
+      <w:pPr/>
+      <w:r>
+        <w:t>The planning inventory must distinguish open pull requests, approval-queue entries, merged or closed pull-request branches, and safe nonterminal worktrees. A no-safe-ticket decision must remain visible as a paused state with its exact safe reason and required next action.</w:t>
       </w:r>
     </w:p>
     <w:p>

</xml_diff>

<commit_message>
GOV: define paired LAN dashboard control
</commit_message>
<xml_diff>
--- a/docs/reference-source/Wesnoth_Agent_Development_Functional_Specification.docx
+++ b/docs/reference-source/Wesnoth_Agent_Development_Functional_Specification.docx
@@ -370,7 +370,7 @@
     </w:p>
     <w:p>
       <w:r>
-        <w:t>A purpose-built local Wesnoth Agent Manager dashboard is a future UX layer that may visualize coordinator state, ticket history, gates, diffs, retries, PR status, and merge readiness.</w:t>
+        <w:t>A purpose-built Wesnoth Agent Manager dashboard visualizes coordinator state, ticket history, gates, diffs, retries, PR status, and merge readiness. Its Python server remains bound to loopback; a separately constrained Windows proxy may expose paired access on the private LAN.</w:t>
       </w:r>
     </w:p>
     <w:p>
@@ -1967,7 +1967,7 @@
     <w:p>
       <w:pPr/>
       <w:r>
-        <w:t>The localhost Agent Manager may offer a human-controlled automation toggle for the selected Sol coordinator mode. This is an alternate ticket-scheduling mode, not an exemption from deterministic governance.</w:t>
+        <w:t>The Agent Manager may offer a human-controlled automation toggle for the selected Sol coordinator mode. This is an alternate ticket-scheduling mode, not an exemption from deterministic governance.</w:t>
       </w:r>
     </w:p>
     <w:p>
@@ -2171,7 +2171,7 @@
     <w:p>
       <w:pPr/>
       <w:r>
-        <w:t>The request remains visible in the localhost dashboard approval queue for the project owner to inspect. No recurring Codex task, background chat message, or token-consuming notification job is required. The local fail-closed gate is authoritative and must record an explicit approve or reject decision for the exact manifest. A changed path set, candidate tree, branch, or request identity invalidates the decision. No deletion commit, later ticket, push, PR, or merge may proceed while this gate is unresolved.</w:t>
+        <w:t>The request remains visible in the dashboard approval queue for the project owner to inspect. No recurring Codex task, background chat message, or token-consuming notification job is required. The local fail-closed gate is authoritative and must record an explicit approve or reject decision for the exact manifest. A changed path set, candidate tree, branch, or request identity invalidates the decision. No deletion commit, later ticket, push, PR, or merge may proceed while this gate is unresolved.</w:t>
       </w:r>
     </w:p>
     <w:p>
@@ -2198,6 +2198,32 @@
       <w:pPr/>
       <w:r>
         <w:t>Ordinary tickets remain unable to modify controlled references. A controlled reference change must be a clearly identified governance ticket, synchronize all affected Markdown/DOCX representations and manifest values, pass the reference-package self-test, and receive its own exact-commit publication approval through the queue.</w:t>
+      </w:r>
+    </w:p>
+    <w:p>
+      <w:pPr>
+        <w:pStyle w:val="Heading4"/>
+      </w:pPr>
+      <w:r>
+        <w:t>Paired private-LAN access and clean shutdown</w:t>
+      </w:r>
+    </w:p>
+    <w:p>
+      <w:pPr/>
+      <w:r>
+        <w:t>The Python dashboard server remains bound to 127.0.0.1. The repository-owned Windows launcher may expose it through a narrow user-space proxy bound to one detected private IPv4 address and TCP port 8765. The Windows firewall rule is limited to the Private profile, that local address, and LocalSubnet sources. The dashboard displays the LAN address under system health.</w:t>
+      </w:r>
+    </w:p>
+    <w:p>
+      <w:pPr/>
+      <w:r>
+        <w:t>LAN access requires a high-entropy runtime pairing token delivered in a URL fragment. The token is stored only in a permission-restricted ignored runtime file and the paired browser's local storage; it is not an environment variable, telemetry field, provider credential, log value, query parameter, or committed file. Unpaired LAN status, coordinator-state, and mutation requests are rejected. Paired devices receive the same governed controls as localhost, including exact-origin, per-process CSRF, allowlisted-action, request-size, and deterministic controller validation.</w:t>
+      </w:r>
+    </w:p>
+    <w:p>
+      <w:pPr/>
+      <w:r>
+        <w:t>An Exit dashboard action may be accepted from localhost or a paired LAN device only while no planning, ticket-execution, or publication operation is active. The server completes shutdown and removes its own PID, version, and session records before a session-specific marker closes only the CMD process tree that launched that dashboard. The same signal stops the LAN proxy; unrelated consoles, processes, and WSL distributions are not targeted.</w:t>
       </w:r>
     </w:p>
     <w:p>
@@ -3532,7 +3558,7 @@
     </w:p>
     <w:p>
       <w:r>
-        <w:t>The future local Agent Manager dashboard should display:</w:t>
+        <w:t>The local Agent Manager dashboard displays:</w:t>
       </w:r>
     </w:p>
     <w:p>
@@ -3613,6 +3639,22 @@
       </w:pPr>
       <w:r>
         <w:t>activity log and errors with accessible error-detail dialogs;</w:t>
+      </w:r>
+    </w:p>
+    <w:p>
+      <w:pPr>
+        <w:pStyle w:val="ListBullet"/>
+      </w:pPr>
+      <w:r>
+        <w:t>paired private-LAN access with the reachable address shown under system health;</w:t>
+      </w:r>
+    </w:p>
+    <w:p>
+      <w:pPr>
+        <w:pStyle w:val="ListBullet"/>
+      </w:pPr>
+      <w:r>
+        <w:t>a safe-state Exit dashboard action scoped to its associated launcher console;</w:t>
       </w:r>
     </w:p>
     <w:p>

</xml_diff>

<commit_message>
DASH-006: Resume automation and add paired LAN control (#20)
* GOV: require resume-first autonomous coordination

* DASH-006: diagnose and resume autonomous work

* GOV: define paired LAN dashboard control

* DASH-006: add paired LAN control and clean exit

---------

Co-authored-by: Your Name <your-email@example.com>
</commit_message>
<xml_diff>
--- a/docs/reference-source/Wesnoth_Agent_Development_Functional_Specification.docx
+++ b/docs/reference-source/Wesnoth_Agent_Development_Functional_Specification.docx
@@ -370,7 +370,7 @@
     </w:p>
     <w:p>
       <w:r>
-        <w:t>A purpose-built local Wesnoth Agent Manager dashboard is a future UX layer that may visualize coordinator state, ticket history, gates, diffs, retries, PR status, and merge readiness.</w:t>
+        <w:t>A purpose-built Wesnoth Agent Manager dashboard visualizes coordinator state, ticket history, gates, diffs, retries, PR status, and merge readiness. Its Python server remains bound to loopback; a separately constrained Windows proxy may expose paired access on the private LAN.</w:t>
       </w:r>
     </w:p>
     <w:p>
@@ -1385,6 +1385,14 @@
       </w:r>
     </w:p>
     <w:p>
+      <w:pPr>
+        <w:pStyle w:val="ListBullet"/>
+      </w:pPr>
+      <w:r>
+        <w:t>resume_branch where applicable; null for an explicitly authorized fresh ticket</w:t>
+      </w:r>
+    </w:p>
+    <w:p>
       <w:r>
         <w:t>Ticket objectives should be bounded, testable, and explicit about exclusions when omission is important.</w:t>
       </w:r>
@@ -1472,6 +1480,22 @@
       </w:r>
     </w:p>
     <w:p>
+      <w:pPr>
+        <w:pStyle w:val="ListBullet"/>
+      </w:pPr>
+      <w:r>
+        <w:t>structured evidence identifies any safe, nonterminal ticket remnants in coordinator-managed worktrees, including failed runs whose original scope remains recoverable;</w:t>
+      </w:r>
+    </w:p>
+    <w:p>
+      <w:pPr>
+        <w:pStyle w:val="ListBullet"/>
+      </w:pPr>
+      <w:r>
+        <w:t>branches already represented by a pull request or a passing terminal result are not resumable remnants.</w:t>
+      </w:r>
+    </w:p>
+    <w:p>
       <w:r>
         <w:t>Failure stops the run.</w:t>
       </w:r>
@@ -1506,6 +1530,18 @@
       </w:r>
     </w:p>
     <w:p>
+      <w:pPr/>
+      <w:r>
+        <w:t>If safe remnants exist for the selected unfinished ticket, resolve the existing worktree from trusted Git metadata and continue it in place under its original objective, worker, allowed paths, and validation profile.</w:t>
+      </w:r>
+    </w:p>
+    <w:p>
+      <w:pPr/>
+      <w:r>
+        <w:t>Do not discard, reset, recreate, or restart resumable work. Create a new branch/worktree only when the owner's coordinator brief explicitly requests a fresh ticket or a start from scratch.</w:t>
+      </w:r>
+    </w:p>
+    <w:p>
       <w:r>
         <w:t>No worker edits the main worktree.</w:t>
       </w:r>
@@ -1931,7 +1967,7 @@
     <w:p>
       <w:pPr/>
       <w:r>
-        <w:t>The localhost Agent Manager may offer a human-controlled automation toggle for the selected Sol coordinator mode. This is an alternate ticket-scheduling mode, not an exemption from deterministic governance.</w:t>
+        <w:t>The Agent Manager may offer a human-controlled automation toggle for the selected Sol coordinator mode. This is an alternate ticket-scheduling mode, not an exemption from deterministic governance.</w:t>
       </w:r>
     </w:p>
     <w:p>
@@ -1953,6 +1989,22 @@
         <w:pStyle w:val="ListBullet"/>
       </w:pPr>
       <w:r>
+        <w:t>Sol must prioritize safe resumable ticket remnants before new work and may select only the exact branch supplied by the deterministic planning inventory;</w:t>
+      </w:r>
+    </w:p>
+    <w:p>
+      <w:pPr>
+        <w:pStyle w:val="ListBullet"/>
+      </w:pPr>
+      <w:r>
+        <w:t>Sol must not create fresh work unless the current owner brief explicitly authorizes a fresh or new ticket or a start from scratch;</w:t>
+      </w:r>
+    </w:p>
+    <w:p>
+      <w:pPr>
+        <w:pStyle w:val="ListBullet"/>
+      </w:pPr>
+      <w:r>
         <w:t>Python remains the authoritative state machine and must validate each ticket, create its isolated worktree, enforce path scope, and run every applicable deterministic, engine, tester, and reviewer gate;</w:t>
       </w:r>
     </w:p>
@@ -2035,6 +2087,12 @@
       </w:r>
     </w:p>
     <w:p>
+      <w:pPr/>
+      <w:r>
+        <w:t>The planning inventory must distinguish open pull requests, approval-queue entries, merged or closed pull-request branches, and safe nonterminal worktrees. A no-safe-ticket decision must remain visible as a paused state with its exact safe reason and required next action.</w:t>
+      </w:r>
+    </w:p>
+    <w:p>
       <w:pPr>
         <w:pStyle w:val="Heading4"/>
       </w:pPr>
@@ -2113,7 +2171,7 @@
     <w:p>
       <w:pPr/>
       <w:r>
-        <w:t>The request remains visible in the localhost dashboard approval queue for the project owner to inspect. No recurring Codex task, background chat message, or token-consuming notification job is required. The local fail-closed gate is authoritative and must record an explicit approve or reject decision for the exact manifest. A changed path set, candidate tree, branch, or request identity invalidates the decision. No deletion commit, later ticket, push, PR, or merge may proceed while this gate is unresolved.</w:t>
+        <w:t>The request remains visible in the dashboard approval queue for the project owner to inspect. No recurring Codex task, background chat message, or token-consuming notification job is required. The local fail-closed gate is authoritative and must record an explicit approve or reject decision for the exact manifest. A changed path set, candidate tree, branch, or request identity invalidates the decision. No deletion commit, later ticket, push, PR, or merge may proceed while this gate is unresolved.</w:t>
       </w:r>
     </w:p>
     <w:p>
@@ -2140,6 +2198,32 @@
       <w:pPr/>
       <w:r>
         <w:t>Ordinary tickets remain unable to modify controlled references. A controlled reference change must be a clearly identified governance ticket, synchronize all affected Markdown/DOCX representations and manifest values, pass the reference-package self-test, and receive its own exact-commit publication approval through the queue.</w:t>
+      </w:r>
+    </w:p>
+    <w:p>
+      <w:pPr>
+        <w:pStyle w:val="Heading4"/>
+      </w:pPr>
+      <w:r>
+        <w:t>Paired private-LAN access and clean shutdown</w:t>
+      </w:r>
+    </w:p>
+    <w:p>
+      <w:pPr/>
+      <w:r>
+        <w:t>The Python dashboard server remains bound to 127.0.0.1. The repository-owned Windows launcher may expose it through a narrow user-space proxy bound to one detected private IPv4 address and TCP port 8765. The Windows firewall rule is limited to the Private profile, that local address, and LocalSubnet sources. The dashboard displays the LAN address under system health.</w:t>
+      </w:r>
+    </w:p>
+    <w:p>
+      <w:pPr/>
+      <w:r>
+        <w:t>LAN access requires a high-entropy runtime pairing token delivered in a URL fragment. The token is stored only in a permission-restricted ignored runtime file and the paired browser's local storage; it is not an environment variable, telemetry field, provider credential, log value, query parameter, or committed file. Unpaired LAN status, coordinator-state, and mutation requests are rejected. Paired devices receive the same governed controls as localhost, including exact-origin, per-process CSRF, allowlisted-action, request-size, and deterministic controller validation.</w:t>
+      </w:r>
+    </w:p>
+    <w:p>
+      <w:pPr/>
+      <w:r>
+        <w:t>An Exit dashboard action may be accepted from localhost or a paired LAN device only while no planning, ticket-execution, or publication operation is active. The server completes shutdown and removes its own PID, version, and session records before a session-specific marker closes only the CMD process tree that launched that dashboard. The same signal stops the LAN proxy; unrelated consoles, processes, and WSL distributions are not targeted.</w:t>
       </w:r>
     </w:p>
     <w:p>
@@ -3474,7 +3558,7 @@
     </w:p>
     <w:p>
       <w:r>
-        <w:t>The future local Agent Manager dashboard should display:</w:t>
+        <w:t>The local Agent Manager dashboard displays:</w:t>
       </w:r>
     </w:p>
     <w:p>
@@ -3555,6 +3639,22 @@
       </w:pPr>
       <w:r>
         <w:t>activity log and errors with accessible error-detail dialogs;</w:t>
+      </w:r>
+    </w:p>
+    <w:p>
+      <w:pPr>
+        <w:pStyle w:val="ListBullet"/>
+      </w:pPr>
+      <w:r>
+        <w:t>paired private-LAN access with the reachable address shown under system health;</w:t>
+      </w:r>
+    </w:p>
+    <w:p>
+      <w:pPr>
+        <w:pStyle w:val="ListBullet"/>
+      </w:pPr>
+      <w:r>
+        <w:t>a safe-state Exit dashboard action scoped to its associated launcher console;</w:t>
       </w:r>
     </w:p>
     <w:p>

</xml_diff>

<commit_message>
feat: resume open PRs and extend reviewer fallback
</commit_message>
<xml_diff>
--- a/docs/reference-source/Wesnoth_Agent_Development_Functional_Specification.docx
+++ b/docs/reference-source/Wesnoth_Agent_Development_Functional_Specification.docx
@@ -968,7 +968,39 @@
           </w:tcPr>
           <w:p>
             <w:r>
-              <w:t>Fallback reviewer</w:t>
+              <w:t>Intermediate reviewer</w:t>
+            </w:r>
+          </w:p>
+        </w:tc>
+        <w:tc>
+          <w:tcPr>
+            <w:tcW w:type="dxa" w:w="3331"/>
+          </w:tcPr>
+          <w:p>
+            <w:r>
+              <w:t>Google - `google/gemini-3.8-flash`</w:t>
+            </w:r>
+          </w:p>
+        </w:tc>
+        <w:tc>
+          <w:tcPr>
+            <w:tcW w:type="dxa" w:w="3331"/>
+          </w:tcPr>
+          <w:p>
+            <w:r>
+              <w:t>First reviewer fallback for infrastructure/non-decisive primary failure</w:t>
+            </w:r>
+          </w:p>
+        </w:tc>
+      </w:tr>
+      <w:tr>
+        <w:tc>
+          <w:tcPr>
+            <w:tcW w:type="dxa" w:w="3331"/>
+          </w:tcPr>
+          <w:p>
+            <w:r>
+              <w:t>Final fallback reviewer</w:t>
             </w:r>
           </w:p>
         </w:tc>
@@ -988,7 +1020,7 @@
           </w:tcPr>
           <w:p>
             <w:r>
-              <w:t>Reviewer fallback for infrastructure/non-decisive primary failure</w:t>
+              <w:t>Final fallback when both Gemini reviewers are unavailable or non-decisive</w:t>
             </w:r>
           </w:p>
         </w:tc>
@@ -1033,15 +1065,15 @@
         <w:pStyle w:val="ListBullet"/>
       </w:pPr>
       <w:r>
-        <w:t>Gemini reviewer may hit free-tier 429 RESOURCE_EXHAUSTED limits and time out.</w:t>
-      </w:r>
-    </w:p>
-    <w:p>
-      <w:pPr>
-        <w:pStyle w:val="ListBullet"/>
-      </w:pPr>
-      <w:r>
-        <w:t>A primary reviewer returning substantive REQUEST_CHANGES must not be bypassed by asking a fallback reviewer for a more favorable answer.</w:t>
+        <w:t>A Gemini reviewer may hit free-tier 429 RESOURCE_EXHAUSTED limits and time out. Gemini 3.8 Flash is the only intermediate reviewer between Gemini 3.6 Flash and Nemotron.</w:t>
+      </w:r>
+    </w:p>
+    <w:p>
+      <w:pPr>
+        <w:pStyle w:val="ListBullet"/>
+      </w:pPr>
+      <w:r>
+        <w:t>A primary or intermediate reviewer returning substantive REQUEST_CHANGES must not be bypassed by asking a later fallback reviewer for a more favorable answer.</w:t>
       </w:r>
     </w:p>
     <w:p>
@@ -1120,6 +1152,14 @@
         <w:pStyle w:val="ListBullet"/>
       </w:pPr>
       <w:r>
+        <w:t>reviewer-intermediate</w:t>
+      </w:r>
+    </w:p>
+    <w:p>
+      <w:pPr>
+        <w:pStyle w:val="ListBullet"/>
+      </w:pPr>
+      <w:r>
         <w:t>reviewer-fallback</w:t>
       </w:r>
     </w:p>
@@ -1389,7 +1429,15 @@
         <w:pStyle w:val="ListBullet"/>
       </w:pPr>
       <w:r>
-        <w:t>resume_branch where applicable; null for an explicitly authorized fresh ticket</w:t>
+        <w:t>resume_branch when continuing a verified managed branch; null for an authorized fresh or same-contract replacement ticket</w:t>
+      </w:r>
+    </w:p>
+    <w:p>
+      <w:pPr>
+        <w:pStyle w:val="ListBullet"/>
+      </w:pPr>
+      <w:r>
+        <w:t>resume_pr_number and resume_pr_head_sha when the branch is bound to an exact open pull request</w:t>
       </w:r>
     </w:p>
     <w:p>
@@ -1484,15 +1532,15 @@
         <w:pStyle w:val="ListBullet"/>
       </w:pPr>
       <w:r>
-        <w:t>structured evidence identifies any safe, nonterminal ticket remnants in coordinator-managed worktrees, including failed runs whose original scope remains recoverable;</w:t>
-      </w:r>
-    </w:p>
-    <w:p>
-      <w:pPr>
-        <w:pStyle w:val="ListBullet"/>
-      </w:pPr>
-      <w:r>
-        <w:t>branches already represented by a pull request or a passing terminal result are not resumable remnants.</w:t>
+        <w:t>structured evidence identifies safe nonterminal remnants and eligible open pull requests in coordinator-managed worktrees, including the original contract, exact branch and head, and current path scope;</w:t>
+      </w:r>
+    </w:p>
+    <w:p>
+      <w:pPr>
+        <w:pStyle w:val="ListBullet"/>
+      </w:pPr>
+      <w:r>
+        <w:t>an open pull request is resumable only when it belongs to this repository, targets main, uses a safe agent branch, retains an exact clean managed worktree, and changes only paths allowed by its original contract.</w:t>
       </w:r>
     </w:p>
     <w:p>
@@ -1532,13 +1580,25 @@
     <w:p>
       <w:pPr/>
       <w:r>
-        <w:t>If safe remnants exist for the selected unfinished ticket, resolve the existing worktree from trusted Git metadata and continue it in place under its original objective, worker, allowed paths, and validation profile.</w:t>
+        <w:t>If safe remnants or an eligible open pull request exist for the selected ticket, resolve the managed worktree from trusted Git metadata and continue it in place under its original objective, worker, allowed paths, and validation profile.</w:t>
       </w:r>
     </w:p>
     <w:p>
       <w:pPr/>
       <w:r>
-        <w:t>Do not discard, reset, recreate, or restart resumable work. Create a new branch/worktree only when the owner's coordinator brief explicitly requests a fresh ticket or a start from scratch.</w:t>
+        <w:t>For an open pull request, verify its exact GitHub head and append current main with a normal merge commit before rerunning every original gate. Never rebase, reset, force-push, rewrite published history, or delete its branch automatically.</w:t>
+      </w:r>
+    </w:p>
+    <w:p>
+      <w:pPr/>
+      <w:r>
+        <w:t>If a contract-backed pull request cannot be resumed because its managed worktree is unavailable or GitHub reports an unmergeable conflict, create a same-contract replacement from current main. Close the old pull request only after the replacement passes every local gate, and preserve the old branch for audit and recovery. Dirty worktrees, divergent heads, missing contracts, ambiguous ownership, and protected or out-of-scope changes require human review.</w:t>
+      </w:r>
+    </w:p>
+    <w:p>
+      <w:pPr/>
+      <w:r>
+        <w:t>Do not discard, reset, recreate, or restart resumable work. Create unrelated new work only when the owner's coordinator brief explicitly requests a fresh ticket or a start from scratch; a verified same-contract replacement is limited to the retired pull request's original scope.</w:t>
       </w:r>
     </w:p>
     <w:p>
@@ -1929,13 +1989,15 @@
       </w:r>
     </w:p>
     <w:p>
-      <w:r>
-        <w:t>Fallback reviewer is used only when primary review is unavailable or non-decisive due to infrastructure conditions such as timeout or quota failure.</w:t>
-      </w:r>
-    </w:p>
-    <w:p>
-      <w:r>
-        <w:t>No reviewer shopping: if the primary reviewer substantively requests changes, the result is not sent to a fallback solely to seek approval.</w:t>
+      <w:pPr/>
+      <w:r>
+        <w:t>Gemini 3.8 Flash is used only when Gemini 3.6 Flash is unavailable or non-decisive due to infrastructure conditions such as timeout or quota failure.</w:t>
+      </w:r>
+    </w:p>
+    <w:p>
+      <w:pPr/>
+      <w:r>
+        <w:t>Nemotron is used only when both Gemini reviewers are unavailable or non-decisive. No reviewer shopping: a substantive request for changes from either Gemini reviewer is authoritative and is not sent to a later fallback solely to seek approval.</w:t>
       </w:r>
     </w:p>
     <w:p>
@@ -1989,7 +2051,7 @@
         <w:pStyle w:val="ListBullet"/>
       </w:pPr>
       <w:r>
-        <w:t>Sol must prioritize safe resumable ticket remnants before new work and may select only the exact branch supplied by the deterministic planning inventory;</w:t>
+        <w:t>Sol must prioritize safe resumable ticket remnants and eligible open pull requests before new work, and may select only an exact branch and pull-request identity supplied by the deterministic planning inventory;</w:t>
       </w:r>
     </w:p>
     <w:p>
@@ -2083,13 +2145,13 @@
     <w:p>
       <w:pPr/>
       <w:r>
-        <w:t>Before planning new or recovery work, the coordinator must include structured local queue and open pull-request/branch context so it does not duplicate an existing ticket. If that inventory cannot be established reliably, automation pauses instead of guessing.</w:t>
+        <w:t>Before planning new, resumed, replacement, or recovery work, the coordinator must include structured local queue, open pull-request, exact-head, original-contract, and managed-worktree context so it does not duplicate or abandon existing work. Terminal PASS evidence may support open-PR resumption but never bypasses current gates. If the inventory cannot be established reliably, automation pauses instead of guessing.</w:t>
       </w:r>
     </w:p>
     <w:p>
       <w:pPr/>
       <w:r>
-        <w:t>The planning inventory must distinguish open pull requests, approval-queue entries, merged or closed pull-request branches, and safe nonterminal worktrees. A no-safe-ticket decision must remain visible as a paused state with its exact safe reason and required next action.</w:t>
+        <w:t>The planning inventory must distinguish resumable open pull requests, narrowly replaceable contract-backed pull requests, approval-queue entries, merged or closed pull-request branches, and safe nonterminal worktrees. A no-safe-ticket decision must remain visible as a paused state with its exact safe reason and required next action.</w:t>
       </w:r>
     </w:p>
     <w:p>
@@ -2892,7 +2954,7 @@
         <w:pStyle w:val="ListBullet"/>
       </w:pPr>
       <w:r>
-        <w:t>reviewer primary/fallback/result;</w:t>
+        <w:t>reviewer primary/intermediate/final-fallback/result;</w:t>
       </w:r>
     </w:p>
     <w:p>
@@ -3275,7 +3337,7 @@
         <w:pStyle w:val="ListBullet"/>
       </w:pPr>
       <w:r>
-        <w:t>fallback reviewer is not a mechanism to overturn a substantive negative primary review.</w:t>
+        <w:t>neither the intermediate nor final fallback reviewer is a mechanism to overturn a substantive negative verdict from an earlier reviewer.</w:t>
       </w:r>
     </w:p>
     <w:p>
@@ -3319,8 +3381,9 @@
       </w:r>
     </w:p>
     <w:p>
-      <w:r>
-        <w:t>Additionally, ticket_runner.py and coordinator.py should prepend the same requirement to every implementer, fast-fix, tester, reviewer, and fallback-reviewer prompt.</w:t>
+      <w:pPr/>
+      <w:r>
+        <w:t>Additionally, ticket_runner.py and coordinator.py should prepend the same requirement to every implementer, fast-fix, tester, primary-reviewer, intermediate-reviewer, and final-fallback-reviewer prompt.</w:t>
       </w:r>
     </w:p>
     <w:p>

</xml_diff>

<commit_message>
feat: resume open PRs and extend reviewer fallback (#21)
Co-authored-by: Your Name <your-email@example.com>
</commit_message>
<xml_diff>
--- a/docs/reference-source/Wesnoth_Agent_Development_Functional_Specification.docx
+++ b/docs/reference-source/Wesnoth_Agent_Development_Functional_Specification.docx
@@ -968,7 +968,39 @@
           </w:tcPr>
           <w:p>
             <w:r>
-              <w:t>Fallback reviewer</w:t>
+              <w:t>Intermediate reviewer</w:t>
+            </w:r>
+          </w:p>
+        </w:tc>
+        <w:tc>
+          <w:tcPr>
+            <w:tcW w:type="dxa" w:w="3331"/>
+          </w:tcPr>
+          <w:p>
+            <w:r>
+              <w:t>Google - `google/gemini-3.8-flash`</w:t>
+            </w:r>
+          </w:p>
+        </w:tc>
+        <w:tc>
+          <w:tcPr>
+            <w:tcW w:type="dxa" w:w="3331"/>
+          </w:tcPr>
+          <w:p>
+            <w:r>
+              <w:t>First reviewer fallback for infrastructure/non-decisive primary failure</w:t>
+            </w:r>
+          </w:p>
+        </w:tc>
+      </w:tr>
+      <w:tr>
+        <w:tc>
+          <w:tcPr>
+            <w:tcW w:type="dxa" w:w="3331"/>
+          </w:tcPr>
+          <w:p>
+            <w:r>
+              <w:t>Final fallback reviewer</w:t>
             </w:r>
           </w:p>
         </w:tc>
@@ -988,7 +1020,7 @@
           </w:tcPr>
           <w:p>
             <w:r>
-              <w:t>Reviewer fallback for infrastructure/non-decisive primary failure</w:t>
+              <w:t>Final fallback when both Gemini reviewers are unavailable or non-decisive</w:t>
             </w:r>
           </w:p>
         </w:tc>
@@ -1033,15 +1065,15 @@
         <w:pStyle w:val="ListBullet"/>
       </w:pPr>
       <w:r>
-        <w:t>Gemini reviewer may hit free-tier 429 RESOURCE_EXHAUSTED limits and time out.</w:t>
-      </w:r>
-    </w:p>
-    <w:p>
-      <w:pPr>
-        <w:pStyle w:val="ListBullet"/>
-      </w:pPr>
-      <w:r>
-        <w:t>A primary reviewer returning substantive REQUEST_CHANGES must not be bypassed by asking a fallback reviewer for a more favorable answer.</w:t>
+        <w:t>A Gemini reviewer may hit free-tier 429 RESOURCE_EXHAUSTED limits and time out. Gemini 3.8 Flash is the only intermediate reviewer between Gemini 3.6 Flash and Nemotron.</w:t>
+      </w:r>
+    </w:p>
+    <w:p>
+      <w:pPr>
+        <w:pStyle w:val="ListBullet"/>
+      </w:pPr>
+      <w:r>
+        <w:t>A primary or intermediate reviewer returning substantive REQUEST_CHANGES must not be bypassed by asking a later fallback reviewer for a more favorable answer.</w:t>
       </w:r>
     </w:p>
     <w:p>
@@ -1120,6 +1152,14 @@
         <w:pStyle w:val="ListBullet"/>
       </w:pPr>
       <w:r>
+        <w:t>reviewer-intermediate</w:t>
+      </w:r>
+    </w:p>
+    <w:p>
+      <w:pPr>
+        <w:pStyle w:val="ListBullet"/>
+      </w:pPr>
+      <w:r>
         <w:t>reviewer-fallback</w:t>
       </w:r>
     </w:p>
@@ -1389,7 +1429,15 @@
         <w:pStyle w:val="ListBullet"/>
       </w:pPr>
       <w:r>
-        <w:t>resume_branch where applicable; null for an explicitly authorized fresh ticket</w:t>
+        <w:t>resume_branch when continuing a verified managed branch; null for an authorized fresh or same-contract replacement ticket</w:t>
+      </w:r>
+    </w:p>
+    <w:p>
+      <w:pPr>
+        <w:pStyle w:val="ListBullet"/>
+      </w:pPr>
+      <w:r>
+        <w:t>resume_pr_number and resume_pr_head_sha when the branch is bound to an exact open pull request</w:t>
       </w:r>
     </w:p>
     <w:p>
@@ -1484,15 +1532,15 @@
         <w:pStyle w:val="ListBullet"/>
       </w:pPr>
       <w:r>
-        <w:t>structured evidence identifies any safe, nonterminal ticket remnants in coordinator-managed worktrees, including failed runs whose original scope remains recoverable;</w:t>
-      </w:r>
-    </w:p>
-    <w:p>
-      <w:pPr>
-        <w:pStyle w:val="ListBullet"/>
-      </w:pPr>
-      <w:r>
-        <w:t>branches already represented by a pull request or a passing terminal result are not resumable remnants.</w:t>
+        <w:t>structured evidence identifies safe nonterminal remnants and eligible open pull requests in coordinator-managed worktrees, including the original contract, exact branch and head, and current path scope;</w:t>
+      </w:r>
+    </w:p>
+    <w:p>
+      <w:pPr>
+        <w:pStyle w:val="ListBullet"/>
+      </w:pPr>
+      <w:r>
+        <w:t>an open pull request is resumable only when it belongs to this repository, targets main, uses a safe agent branch, retains an exact clean managed worktree, and changes only paths allowed by its original contract.</w:t>
       </w:r>
     </w:p>
     <w:p>
@@ -1532,13 +1580,25 @@
     <w:p>
       <w:pPr/>
       <w:r>
-        <w:t>If safe remnants exist for the selected unfinished ticket, resolve the existing worktree from trusted Git metadata and continue it in place under its original objective, worker, allowed paths, and validation profile.</w:t>
+        <w:t>If safe remnants or an eligible open pull request exist for the selected ticket, resolve the managed worktree from trusted Git metadata and continue it in place under its original objective, worker, allowed paths, and validation profile.</w:t>
       </w:r>
     </w:p>
     <w:p>
       <w:pPr/>
       <w:r>
-        <w:t>Do not discard, reset, recreate, or restart resumable work. Create a new branch/worktree only when the owner's coordinator brief explicitly requests a fresh ticket or a start from scratch.</w:t>
+        <w:t>For an open pull request, verify its exact GitHub head and append current main with a normal merge commit before rerunning every original gate. Never rebase, reset, force-push, rewrite published history, or delete its branch automatically.</w:t>
+      </w:r>
+    </w:p>
+    <w:p>
+      <w:pPr/>
+      <w:r>
+        <w:t>If a contract-backed pull request cannot be resumed because its managed worktree is unavailable or GitHub reports an unmergeable conflict, create a same-contract replacement from current main. Close the old pull request only after the replacement passes every local gate, and preserve the old branch for audit and recovery. Dirty worktrees, divergent heads, missing contracts, ambiguous ownership, and protected or out-of-scope changes require human review.</w:t>
+      </w:r>
+    </w:p>
+    <w:p>
+      <w:pPr/>
+      <w:r>
+        <w:t>Do not discard, reset, recreate, or restart resumable work. Create unrelated new work only when the owner's coordinator brief explicitly requests a fresh ticket or a start from scratch; a verified same-contract replacement is limited to the retired pull request's original scope.</w:t>
       </w:r>
     </w:p>
     <w:p>
@@ -1929,13 +1989,15 @@
       </w:r>
     </w:p>
     <w:p>
-      <w:r>
-        <w:t>Fallback reviewer is used only when primary review is unavailable or non-decisive due to infrastructure conditions such as timeout or quota failure.</w:t>
-      </w:r>
-    </w:p>
-    <w:p>
-      <w:r>
-        <w:t>No reviewer shopping: if the primary reviewer substantively requests changes, the result is not sent to a fallback solely to seek approval.</w:t>
+      <w:pPr/>
+      <w:r>
+        <w:t>Gemini 3.8 Flash is used only when Gemini 3.6 Flash is unavailable or non-decisive due to infrastructure conditions such as timeout or quota failure.</w:t>
+      </w:r>
+    </w:p>
+    <w:p>
+      <w:pPr/>
+      <w:r>
+        <w:t>Nemotron is used only when both Gemini reviewers are unavailable or non-decisive. No reviewer shopping: a substantive request for changes from either Gemini reviewer is authoritative and is not sent to a later fallback solely to seek approval.</w:t>
       </w:r>
     </w:p>
     <w:p>
@@ -1989,7 +2051,7 @@
         <w:pStyle w:val="ListBullet"/>
       </w:pPr>
       <w:r>
-        <w:t>Sol must prioritize safe resumable ticket remnants before new work and may select only the exact branch supplied by the deterministic planning inventory;</w:t>
+        <w:t>Sol must prioritize safe resumable ticket remnants and eligible open pull requests before new work, and may select only an exact branch and pull-request identity supplied by the deterministic planning inventory;</w:t>
       </w:r>
     </w:p>
     <w:p>
@@ -2083,13 +2145,13 @@
     <w:p>
       <w:pPr/>
       <w:r>
-        <w:t>Before planning new or recovery work, the coordinator must include structured local queue and open pull-request/branch context so it does not duplicate an existing ticket. If that inventory cannot be established reliably, automation pauses instead of guessing.</w:t>
+        <w:t>Before planning new, resumed, replacement, or recovery work, the coordinator must include structured local queue, open pull-request, exact-head, original-contract, and managed-worktree context so it does not duplicate or abandon existing work. Terminal PASS evidence may support open-PR resumption but never bypasses current gates. If the inventory cannot be established reliably, automation pauses instead of guessing.</w:t>
       </w:r>
     </w:p>
     <w:p>
       <w:pPr/>
       <w:r>
-        <w:t>The planning inventory must distinguish open pull requests, approval-queue entries, merged or closed pull-request branches, and safe nonterminal worktrees. A no-safe-ticket decision must remain visible as a paused state with its exact safe reason and required next action.</w:t>
+        <w:t>The planning inventory must distinguish resumable open pull requests, narrowly replaceable contract-backed pull requests, approval-queue entries, merged or closed pull-request branches, and safe nonterminal worktrees. A no-safe-ticket decision must remain visible as a paused state with its exact safe reason and required next action.</w:t>
       </w:r>
     </w:p>
     <w:p>
@@ -2892,7 +2954,7 @@
         <w:pStyle w:val="ListBullet"/>
       </w:pPr>
       <w:r>
-        <w:t>reviewer primary/fallback/result;</w:t>
+        <w:t>reviewer primary/intermediate/final-fallback/result;</w:t>
       </w:r>
     </w:p>
     <w:p>
@@ -3275,7 +3337,7 @@
         <w:pStyle w:val="ListBullet"/>
       </w:pPr>
       <w:r>
-        <w:t>fallback reviewer is not a mechanism to overturn a substantive negative primary review.</w:t>
+        <w:t>neither the intermediate nor final fallback reviewer is a mechanism to overturn a substantive negative verdict from an earlier reviewer.</w:t>
       </w:r>
     </w:p>
     <w:p>
@@ -3319,8 +3381,9 @@
       </w:r>
     </w:p>
     <w:p>
-      <w:r>
-        <w:t>Additionally, ticket_runner.py and coordinator.py should prepend the same requirement to every implementer, fast-fix, tester, reviewer, and fallback-reviewer prompt.</w:t>
+      <w:pPr/>
+      <w:r>
+        <w:t>Additionally, ticket_runner.py and coordinator.py should prepend the same requirement to every implementer, fast-fix, tester, primary-reviewer, intermediate-reviewer, and final-fallback-reviewer prompt.</w:t>
       </w:r>
     </w:p>
     <w:p>

</xml_diff>

<commit_message>
DASH-011: advance live backlog scheduling
</commit_message>
<xml_diff>
--- a/docs/reference-source/Wesnoth_Agent_Development_Functional_Specification.docx
+++ b/docs/reference-source/Wesnoth_Agent_Development_Functional_Specification.docx
@@ -946,7 +946,7 @@
           </w:tcPr>
           <w:p>
             <w:r>
-              <w:t>Google - `google/gemini-3.6-flash`</w:t>
+              <w:t>Cloudflare Workers AI - `@cf/nvidia/nemotron-3-120b-a12b`</w:t>
             </w:r>
           </w:p>
         </w:tc>
@@ -956,7 +956,7 @@
           </w:tcPr>
           <w:p>
             <w:r>
-              <w:t>Independent review when quota is available</w:t>
+              <w:t>Preferred independent review</w:t>
             </w:r>
           </w:p>
         </w:tc>
@@ -1010,7 +1010,7 @@
           </w:tcPr>
           <w:p>
             <w:r>
-              <w:t>Cloudflare Workers AI - `@cf/nvidia/nemotron-3-120b-a12b`</w:t>
+              <w:t>Google - `google/gemini-3.6-flash`</w:t>
             </w:r>
           </w:p>
         </w:tc>
@@ -1020,7 +1020,7 @@
           </w:tcPr>
           <w:p>
             <w:r>
-              <w:t>Final fallback when both Gemini reviewers are unavailable or non-decisive</w:t>
+              <w:t>Final reviewer fallback when Nemotron and Gemini 3.8 Flash are unavailable or non-decisive</w:t>
             </w:r>
           </w:p>
         </w:tc>
@@ -1065,7 +1065,7 @@
         <w:pStyle w:val="ListBullet"/>
       </w:pPr>
       <w:r>
-        <w:t>A Gemini reviewer may hit free-tier 429 RESOURCE_EXHAUSTED limits and time out. Gemini 3.8 Flash is the only intermediate reviewer between Gemini 3.6 Flash and Nemotron.</w:t>
+        <w:t>A Gemini reviewer may hit free-tier 429 RESOURCE_EXHAUSTED limits and time out. The reviewer order is Nemotron, Gemini 3.8 Flash, then Gemini 3.6 Flash.</w:t>
       </w:r>
     </w:p>
     <w:p>
@@ -1598,7 +1598,7 @@
     <w:p>
       <w:pPr/>
       <w:r>
-        <w:t>Do not discard, reset, recreate, or restart resumable work. Create unrelated new work only when the owner's coordinator brief explicitly requests a fresh ticket or a start from scratch; a verified same-contract replacement is limited to the retired pull request's original scope.</w:t>
+        <w:t>Do not discard, reset, recreate, or restart resumable work. Outside active continuous automation, create unrelated new work only when the owner's coordinator brief explicitly requests a fresh ticket or a start from scratch; a verified same-contract replacement is limited to the retired pull request's original scope.</w:t>
       </w:r>
     </w:p>
     <w:p>
@@ -1985,19 +1985,19 @@
     </w:p>
     <w:p>
       <w:r>
-        <w:t>Primary reviewer runs independently.</w:t>
+        <w:t>Nemotron runs as the independent primary reviewer.</w:t>
       </w:r>
     </w:p>
     <w:p>
       <w:pPr/>
       <w:r>
-        <w:t>Gemini 3.8 Flash is used only when Gemini 3.6 Flash is unavailable or non-decisive due to infrastructure conditions such as timeout or quota failure.</w:t>
+        <w:t>Gemini 3.8 Flash is used only when Nemotron is unavailable or non-decisive due to infrastructure conditions such as timeout, quota failure, or malformed output.</w:t>
       </w:r>
     </w:p>
     <w:p>
       <w:pPr/>
       <w:r>
-        <w:t>Nemotron is used only when both Gemini reviewers are unavailable or non-decisive. No reviewer shopping: a substantive request for changes from either Gemini reviewer is authoritative and is not sent to a later fallback solely to seek approval.</w:t>
+        <w:t>Gemini 3.6 Flash is the final fallback only when Nemotron and Gemini 3.8 Flash are unavailable or non-decisive. No reviewer shopping: a substantive request for changes from any reviewer is authoritative and is not sent to a later fallback solely to seek approval.</w:t>
       </w:r>
     </w:p>
     <w:p>
@@ -2059,7 +2059,23 @@
         <w:pStyle w:val="ListBullet"/>
       </w:pPr>
       <w:r>
-        <w:t>Sol must not create fresh work unless the current owner brief explicitly authorizes a fresh or new ticket or a start from scratch;</w:t>
+        <w:t>switching automation on authorizes Sol to create one fresh bounded ticket at a time without repeated fresh-start wording in the coordinator brief;</w:t>
+      </w:r>
+    </w:p>
+    <w:p>
+      <w:pPr>
+        <w:pStyle w:val="ListBullet"/>
+      </w:pPr>
+      <w:r>
+        <w:t>structured live GitHub, worktree, approval-queue, and publication evidence is authoritative for mutable execution state; continuity prose is planning context and must not keep merged or completed work active;</w:t>
+      </w:r>
+    </w:p>
+    <w:p>
+      <w:pPr>
+        <w:pStyle w:val="ListBullet"/>
+      </w:pPr>
+      <w:r>
+        <w:t>after excluding active, queued, and published priorities and unsafe dependencies, Sol selects the highest-priority independent safe ticket remaining;</w:t>
       </w:r>
     </w:p>
     <w:p>
@@ -4084,6 +4100,8 @@
     <w:sectPr>
       <w:headerReference w:type="default" r:id="rId13"/>
       <w:footerReference w:type="default" r:id="rId14"/>
+      <w:headerReference w:type="first" r:id="rId15"/>
+      <w:headerReference w:type="even" r:id="rId16"/>
       <w:pgSz w:w="12240" w:h="15840"/>
       <w:pgMar w:top="1008" w:right="1123" w:bottom="1008" w:left="1123" w:header="720" w:footer="720" w:gutter="0"/>
       <w:cols w:space="720"/>
@@ -4117,6 +4135,26 @@
     <w:r>
       <w:t>Wesnoth Star Wars Total Conversion</w:t>
     </w:r>
+  </w:p>
+</w:hdr>
+</file>
+
+<file path=word/header2.xml><?xml version="1.0" encoding="utf-8"?>
+<w:hdr xmlns:m="http://schemas.openxmlformats.org/officeDocument/2006/math" xmlns:mc="http://schemas.openxmlformats.org/markup-compatibility/2006" xmlns:mo="http://schemas.microsoft.com/office/mac/office/2008/main" xmlns:mv="urn:schemas-microsoft-com:mac:vml" xmlns:o="urn:schemas-microsoft-com:office:office" xmlns:r="http://schemas.openxmlformats.org/officeDocument/2006/relationships" xmlns:v="urn:schemas-microsoft-com:vml" xmlns:w10="urn:schemas-microsoft-com:office:word" xmlns:w14="http://schemas.microsoft.com/office/word/2010/wordml" xmlns:w="http://schemas.openxmlformats.org/wordprocessingml/2006/main" xmlns:wne="http://schemas.microsoft.com/office/word/2006/wordml" xmlns:wp14="http://schemas.microsoft.com/office/word/2010/wordprocessingDrawing" xmlns:wp="http://schemas.openxmlformats.org/drawingml/2006/wordprocessingDrawing" xmlns:wpc="http://schemas.microsoft.com/office/word/2010/wordprocessingCanvas" xmlns:wpg="http://schemas.microsoft.com/office/word/2010/wordprocessingGroup" xmlns:wpi="http://schemas.microsoft.com/office/word/2010/wordprocessingInk" xmlns:wps="http://schemas.microsoft.com/office/word/2010/wordprocessingShape" mc:Ignorable="w14 wp14">
+  <w:p>
+    <w:pPr>
+      <w:pStyle w:val="Header"/>
+    </w:pPr>
+  </w:p>
+</w:hdr>
+</file>
+
+<file path=word/header3.xml><?xml version="1.0" encoding="utf-8"?>
+<w:hdr xmlns:m="http://schemas.openxmlformats.org/officeDocument/2006/math" xmlns:mc="http://schemas.openxmlformats.org/markup-compatibility/2006" xmlns:mo="http://schemas.microsoft.com/office/mac/office/2008/main" xmlns:mv="urn:schemas-microsoft-com:mac:vml" xmlns:o="urn:schemas-microsoft-com:office:office" xmlns:r="http://schemas.openxmlformats.org/officeDocument/2006/relationships" xmlns:v="urn:schemas-microsoft-com:vml" xmlns:w10="urn:schemas-microsoft-com:office:word" xmlns:w14="http://schemas.microsoft.com/office/word/2010/wordml" xmlns:w="http://schemas.openxmlformats.org/wordprocessingml/2006/main" xmlns:wne="http://schemas.microsoft.com/office/word/2006/wordml" xmlns:wp14="http://schemas.microsoft.com/office/word/2010/wordprocessingDrawing" xmlns:wp="http://schemas.openxmlformats.org/drawingml/2006/wordprocessingDrawing" xmlns:wpc="http://schemas.microsoft.com/office/word/2010/wordprocessingCanvas" xmlns:wpg="http://schemas.microsoft.com/office/word/2010/wordprocessingGroup" xmlns:wpi="http://schemas.microsoft.com/office/word/2010/wordprocessingInk" xmlns:wps="http://schemas.microsoft.com/office/word/2010/wordprocessingShape" mc:Ignorable="w14 wp14">
+  <w:p>
+    <w:pPr>
+      <w:pStyle w:val="Header"/>
+    </w:pPr>
   </w:p>
 </w:hdr>
 </file>

</xml_diff>

<commit_message>
DASH-011: advance live backlog scheduling (#26)
Co-authored-by: Your Name <your-email@example.com>
</commit_message>
<xml_diff>
--- a/docs/reference-source/Wesnoth_Agent_Development_Functional_Specification.docx
+++ b/docs/reference-source/Wesnoth_Agent_Development_Functional_Specification.docx
@@ -946,7 +946,7 @@
           </w:tcPr>
           <w:p>
             <w:r>
-              <w:t>Google - `google/gemini-3.6-flash`</w:t>
+              <w:t>Cloudflare Workers AI - `@cf/nvidia/nemotron-3-120b-a12b`</w:t>
             </w:r>
           </w:p>
         </w:tc>
@@ -956,7 +956,7 @@
           </w:tcPr>
           <w:p>
             <w:r>
-              <w:t>Independent review when quota is available</w:t>
+              <w:t>Preferred independent review</w:t>
             </w:r>
           </w:p>
         </w:tc>
@@ -1010,7 +1010,7 @@
           </w:tcPr>
           <w:p>
             <w:r>
-              <w:t>Cloudflare Workers AI - `@cf/nvidia/nemotron-3-120b-a12b`</w:t>
+              <w:t>Google - `google/gemini-3.6-flash`</w:t>
             </w:r>
           </w:p>
         </w:tc>
@@ -1020,7 +1020,7 @@
           </w:tcPr>
           <w:p>
             <w:r>
-              <w:t>Final fallback when both Gemini reviewers are unavailable or non-decisive</w:t>
+              <w:t>Final reviewer fallback when Nemotron and Gemini 3.8 Flash are unavailable or non-decisive</w:t>
             </w:r>
           </w:p>
         </w:tc>
@@ -1065,7 +1065,7 @@
         <w:pStyle w:val="ListBullet"/>
       </w:pPr>
       <w:r>
-        <w:t>A Gemini reviewer may hit free-tier 429 RESOURCE_EXHAUSTED limits and time out. Gemini 3.8 Flash is the only intermediate reviewer between Gemini 3.6 Flash and Nemotron.</w:t>
+        <w:t>A Gemini reviewer may hit free-tier 429 RESOURCE_EXHAUSTED limits and time out. The reviewer order is Nemotron, Gemini 3.8 Flash, then Gemini 3.6 Flash.</w:t>
       </w:r>
     </w:p>
     <w:p>
@@ -1598,7 +1598,7 @@
     <w:p>
       <w:pPr/>
       <w:r>
-        <w:t>Do not discard, reset, recreate, or restart resumable work. Create unrelated new work only when the owner's coordinator brief explicitly requests a fresh ticket or a start from scratch; a verified same-contract replacement is limited to the retired pull request's original scope.</w:t>
+        <w:t>Do not discard, reset, recreate, or restart resumable work. Outside active continuous automation, create unrelated new work only when the owner's coordinator brief explicitly requests a fresh ticket or a start from scratch; a verified same-contract replacement is limited to the retired pull request's original scope.</w:t>
       </w:r>
     </w:p>
     <w:p>
@@ -1985,19 +1985,19 @@
     </w:p>
     <w:p>
       <w:r>
-        <w:t>Primary reviewer runs independently.</w:t>
+        <w:t>Nemotron runs as the independent primary reviewer.</w:t>
       </w:r>
     </w:p>
     <w:p>
       <w:pPr/>
       <w:r>
-        <w:t>Gemini 3.8 Flash is used only when Gemini 3.6 Flash is unavailable or non-decisive due to infrastructure conditions such as timeout or quota failure.</w:t>
+        <w:t>Gemini 3.8 Flash is used only when Nemotron is unavailable or non-decisive due to infrastructure conditions such as timeout, quota failure, or malformed output.</w:t>
       </w:r>
     </w:p>
     <w:p>
       <w:pPr/>
       <w:r>
-        <w:t>Nemotron is used only when both Gemini reviewers are unavailable or non-decisive. No reviewer shopping: a substantive request for changes from either Gemini reviewer is authoritative and is not sent to a later fallback solely to seek approval.</w:t>
+        <w:t>Gemini 3.6 Flash is the final fallback only when Nemotron and Gemini 3.8 Flash are unavailable or non-decisive. No reviewer shopping: a substantive request for changes from any reviewer is authoritative and is not sent to a later fallback solely to seek approval.</w:t>
       </w:r>
     </w:p>
     <w:p>
@@ -2059,7 +2059,23 @@
         <w:pStyle w:val="ListBullet"/>
       </w:pPr>
       <w:r>
-        <w:t>Sol must not create fresh work unless the current owner brief explicitly authorizes a fresh or new ticket or a start from scratch;</w:t>
+        <w:t>switching automation on authorizes Sol to create one fresh bounded ticket at a time without repeated fresh-start wording in the coordinator brief;</w:t>
+      </w:r>
+    </w:p>
+    <w:p>
+      <w:pPr>
+        <w:pStyle w:val="ListBullet"/>
+      </w:pPr>
+      <w:r>
+        <w:t>structured live GitHub, worktree, approval-queue, and publication evidence is authoritative for mutable execution state; continuity prose is planning context and must not keep merged or completed work active;</w:t>
+      </w:r>
+    </w:p>
+    <w:p>
+      <w:pPr>
+        <w:pStyle w:val="ListBullet"/>
+      </w:pPr>
+      <w:r>
+        <w:t>after excluding active, queued, and published priorities and unsafe dependencies, Sol selects the highest-priority independent safe ticket remaining;</w:t>
       </w:r>
     </w:p>
     <w:p>
@@ -4084,6 +4100,8 @@
     <w:sectPr>
       <w:headerReference w:type="default" r:id="rId13"/>
       <w:footerReference w:type="default" r:id="rId14"/>
+      <w:headerReference w:type="first" r:id="rId15"/>
+      <w:headerReference w:type="even" r:id="rId16"/>
       <w:pgSz w:w="12240" w:h="15840"/>
       <w:pgMar w:top="1008" w:right="1123" w:bottom="1008" w:left="1123" w:header="720" w:footer="720" w:gutter="0"/>
       <w:cols w:space="720"/>
@@ -4117,6 +4135,26 @@
     <w:r>
       <w:t>Wesnoth Star Wars Total Conversion</w:t>
     </w:r>
+  </w:p>
+</w:hdr>
+</file>
+
+<file path=word/header2.xml><?xml version="1.0" encoding="utf-8"?>
+<w:hdr xmlns:m="http://schemas.openxmlformats.org/officeDocument/2006/math" xmlns:mc="http://schemas.openxmlformats.org/markup-compatibility/2006" xmlns:mo="http://schemas.microsoft.com/office/mac/office/2008/main" xmlns:mv="urn:schemas-microsoft-com:mac:vml" xmlns:o="urn:schemas-microsoft-com:office:office" xmlns:r="http://schemas.openxmlformats.org/officeDocument/2006/relationships" xmlns:v="urn:schemas-microsoft-com:vml" xmlns:w10="urn:schemas-microsoft-com:office:word" xmlns:w14="http://schemas.microsoft.com/office/word/2010/wordml" xmlns:w="http://schemas.openxmlformats.org/wordprocessingml/2006/main" xmlns:wne="http://schemas.microsoft.com/office/word/2006/wordml" xmlns:wp14="http://schemas.microsoft.com/office/word/2010/wordprocessingDrawing" xmlns:wp="http://schemas.openxmlformats.org/drawingml/2006/wordprocessingDrawing" xmlns:wpc="http://schemas.microsoft.com/office/word/2010/wordprocessingCanvas" xmlns:wpg="http://schemas.microsoft.com/office/word/2010/wordprocessingGroup" xmlns:wpi="http://schemas.microsoft.com/office/word/2010/wordprocessingInk" xmlns:wps="http://schemas.microsoft.com/office/word/2010/wordprocessingShape" mc:Ignorable="w14 wp14">
+  <w:p>
+    <w:pPr>
+      <w:pStyle w:val="Header"/>
+    </w:pPr>
+  </w:p>
+</w:hdr>
+</file>
+
+<file path=word/header3.xml><?xml version="1.0" encoding="utf-8"?>
+<w:hdr xmlns:m="http://schemas.openxmlformats.org/officeDocument/2006/math" xmlns:mc="http://schemas.openxmlformats.org/markup-compatibility/2006" xmlns:mo="http://schemas.microsoft.com/office/mac/office/2008/main" xmlns:mv="urn:schemas-microsoft-com:mac:vml" xmlns:o="urn:schemas-microsoft-com:office:office" xmlns:r="http://schemas.openxmlformats.org/officeDocument/2006/relationships" xmlns:v="urn:schemas-microsoft-com:vml" xmlns:w10="urn:schemas-microsoft-com:office:word" xmlns:w14="http://schemas.microsoft.com/office/word/2010/wordml" xmlns:w="http://schemas.openxmlformats.org/wordprocessingml/2006/main" xmlns:wne="http://schemas.microsoft.com/office/word/2006/wordml" xmlns:wp14="http://schemas.microsoft.com/office/word/2010/wordprocessingDrawing" xmlns:wp="http://schemas.openxmlformats.org/drawingml/2006/wordprocessingDrawing" xmlns:wpc="http://schemas.microsoft.com/office/word/2010/wordprocessingCanvas" xmlns:wpg="http://schemas.microsoft.com/office/word/2010/wordprocessingGroup" xmlns:wpi="http://schemas.microsoft.com/office/word/2010/wordprocessingInk" xmlns:wps="http://schemas.microsoft.com/office/word/2010/wordprocessingShape" mc:Ignorable="w14 wp14">
+  <w:p>
+    <w:pPr>
+      <w:pStyle w:val="Header"/>
+    </w:pPr>
   </w:p>
 </w:hdr>
 </file>

</xml_diff>

<commit_message>
DASH-012: make exit and recovery resilient
</commit_message>
<xml_diff>
--- a/docs/reference-source/Wesnoth_Agent_Development_Functional_Specification.docx
+++ b/docs/reference-source/Wesnoth_Agent_Development_Functional_Specification.docx
@@ -1065,6 +1065,14 @@
         <w:pStyle w:val="ListBullet"/>
       </w:pPr>
       <w:r>
+        <w:t>Implementer and Fast-Fix agents must inspect large source files through targeted search and bounded reads rather than requesting an entire large file in one tool call. This keeps provider context and token limits from turning ordinary scoped work into avoidable infrastructure failures.</w:t>
+      </w:r>
+    </w:p>
+    <w:p>
+      <w:pPr>
+        <w:pStyle w:val="ListBullet"/>
+      </w:pPr>
+      <w:r>
         <w:t>A Gemini reviewer may hit free-tier 429 RESOURCE_EXHAUSTED limits and time out. The reviewer order is Nemotron, Gemini 3.8 Flash, then Gemini 3.6 Flash.</w:t>
       </w:r>
     </w:p>
@@ -2155,6 +2163,12 @@
     <w:p>
       <w:pPr/>
       <w:r>
+        <w:t>The selected coordinator model is advisory inside this bounded loop. If its recovery-planning call fails, Python retains the retry by deriving the narrow repair brief from the existing structured failure and required-action fields. The same original allowed paths, complete gate rerun, and two-attempt ceiling still apply; planner unavailability does not silently bypass an otherwise eligible retry.</w:t>
+      </w:r>
+    </w:p>
+    <w:p>
+      <w:pPr/>
+      <w:r>
         <w:t>The coordinator must stop immediately, without spending recovery attempts, for errors an implementation ticket cannot safely resolve: dirty or unexpected repository state; deletion approval; missing human approval; protected-path, scope, governance, or security violations; missing credentials or secure bridge; unavailable planner/provider outside existing retry policy; ambiguous or credential-bearing diagnostics; publication, branch-protection, remote-head, merge, or approval mismatch; and explicit user stop. These are recorded with a specific safe reason and required human action.</w:t>
       </w:r>
     </w:p>
@@ -2301,7 +2315,7 @@
     <w:p>
       <w:pPr/>
       <w:r>
-        <w:t>An Exit dashboard action may be accepted from localhost or a paired LAN device only while no planning, ticket-execution, or publication operation is active. The server completes shutdown and removes its own PID, version, and session records before a session-specific marker closes only the CMD process tree that launched that dashboard. The same signal stops the LAN proxy; unrelated consoles, processes, and WSL distributions are not targeted.</w:t>
+        <w:t>An Exit dashboard action is available from localhost or a paired LAN device at all times. When a governed operation is active, Exit first disables automation, records an interrupted state, signals cancellation for the exact active run, and preserves its branch, worktree, and local evidence for later continuation. The native control bridge terminates only that run's secure child process tree. The server then completes shutdown, removes its own PID, version, and session records, and writes a session-specific marker that may close only the CMD process tree which launched that dashboard session. Unrelated consoles, processes, WSL distributions, branches, and worktrees are not targeted. The same session signal stops the LAN proxy.</w:t>
       </w:r>
     </w:p>
     <w:p>
@@ -3733,7 +3747,7 @@
         <w:pStyle w:val="ListBullet"/>
       </w:pPr>
       <w:r>
-        <w:t>a safe-state Exit dashboard action scoped to its associated launcher console;</w:t>
+        <w:t>an always-available Exit dashboard action that cancels only its active run, preserves work, and closes its associated launcher console;</w:t>
       </w:r>
     </w:p>
     <w:p>

</xml_diff>

<commit_message>
DASH-013: reduce redundant model usage
</commit_message>
<xml_diff>
--- a/docs/reference-source/Wesnoth_Agent_Development_Functional_Specification.docx
+++ b/docs/reference-source/Wesnoth_Agent_Development_Functional_Specification.docx
@@ -1065,7 +1065,7 @@
         <w:pStyle w:val="ListBullet"/>
       </w:pPr>
       <w:r>
-        <w:t>Implementer and Fast-Fix agents must inspect large source files through targeted search and bounded reads rather than requesting an entire large file in one tool call. This keeps provider context and token limits from turning ordinary scoped work into avoidable infrastructure failures.</w:t>
+        <w:t>Implementer and Fast-Fix agents must inspect large source files through targeted search and reads of no more than 120 lines per call rather than requesting an entire large file. Tester and reviewer reads are bounded to 160 lines. This keeps provider context and token limits from turning ordinary scoped work into avoidable infrastructure failures.</w:t>
       </w:r>
     </w:p>
     <w:p>
@@ -1305,7 +1305,7 @@
     </w:p>
     <w:p>
       <w:r>
-        <w:t>Before substantive ticket work, every LLM role must read both reference files or receive an equivalent coordinator-supplied snapshot. Root AGENTS.md must explicitly require this behavior.</w:t>
+        <w:t>Before substantive ticket work, every LLM role must read both reference files or receive an equivalent coordinator-supplied snapshot. For routine bounded work, the deterministic coordinator supplies a verified reference identity plus a compact authoritative governance digest; workers should not reread the full references unless the ticket is ambiguous or appears to conflict. Project-level planners and fresh sessions still read the full references. Root AGENTS.md must explicitly require this behavior.</w:t>
       </w:r>
     </w:p>
     <w:p>
@@ -2164,6 +2164,80 @@
       <w:pPr/>
       <w:r>
         <w:t>The selected coordinator model is advisory inside this bounded loop. If its recovery-planning call fails, Python retains the retry by deriving the narrow repair brief from the existing structured failure and required-action fields. The same original allowed paths, complete gate rerun, and two-attempt ceiling still apply; planner unavailability does not silently bypass an otherwise eligible retry.</w:t>
+      </w:r>
+    </w:p>
+    <w:p>
+      <w:pPr/>
+      <w:r>
+        <w:t>For an ordinary deterministic implementation or validation failure whose structured evidence already contains a bounded required action, Python uses that action directly and avoids a separate coordinator-model recovery call. Tester or reviewer findings may still use the selected coordinator model when interpretation is necessary. Neither optimization changes the two-attempt ceiling or permits a missing gate.</w:t>
+      </w:r>
+    </w:p>
+    <w:p>
+      <w:pPr>
+        <w:pStyle w:val="Heading4"/>
+      </w:pPr>
+      <w:r>
+        <w:t>Resource-aware model operation</w:t>
+      </w:r>
+    </w:p>
+    <w:p>
+      <w:pPr/>
+      <w:r>
+        <w:t>Provider quotas and free allocations change independently of this repository, so they are operational inputs rather than authorization boundaries. The coordinator minimizes usage without weakening gates by:</w:t>
+      </w:r>
+    </w:p>
+    <w:p>
+      <w:pPr>
+        <w:pStyle w:val="ListBullet"/>
+      </w:pPr>
+      <w:r>
+        <w:t>deterministically resuming the sole verified unfinished contract without a Sol planning call;</w:t>
+      </w:r>
+    </w:p>
+    <w:p>
+      <w:pPr>
+        <w:pStyle w:val="ListBullet"/>
+      </w:pPr>
+      <w:r>
+        <w:t>caching a validated planning decision for 15 minutes and reusing it only when the coordinator mode, brief, current main, queue, pull requests, worktrees, and planned-priority inventory have an identical fingerprint;</w:t>
+      </w:r>
+    </w:p>
+    <w:p>
+      <w:pPr>
+        <w:pStyle w:val="ListBullet"/>
+      </w:pPr>
+      <w:r>
+        <w:t>using compact reference digests, planning inventory, allowed-path lists, and validation summaries in model prompts;</w:t>
+      </w:r>
+    </w:p>
+    <w:p>
+      <w:pPr>
+        <w:pStyle w:val="ListBullet"/>
+      </w:pPr>
+      <w:r>
+        <w:t>preferring the free Fast-Fix role for mechanical one- or two-file work while retaining GPT-OSS for substantive implementation;</w:t>
+      </w:r>
+    </w:p>
+    <w:p>
+      <w:pPr>
+        <w:pStyle w:val="ListBullet"/>
+      </w:pPr>
+      <w:r>
+        <w:t>waiting at least 60 seconds between completed autonomous tickets to avoid predictable rolling per-minute quota failures and unnecessary fallbacks; and</w:t>
+      </w:r>
+    </w:p>
+    <w:p>
+      <w:pPr>
+        <w:pStyle w:val="ListBullet"/>
+      </w:pPr>
+      <w:r>
+        <w:t>invoking reviewer fallbacks only for infrastructure or non-decisive outcomes, never as duplicate review or verdict shopping.</w:t>
+      </w:r>
+    </w:p>
+    <w:p>
+      <w:pPr/>
+      <w:r>
+        <w:t>Cache entries contain no credentials or raw prompts, expire automatically, and are invalidated by any authoritative inventory change. Resource saving never skips deterministic validation, the independent tester, the decisive reviewer chain, exact-commit approval, CI, or protected-branch controls.</w:t>
       </w:r>
     </w:p>
     <w:p>
@@ -3388,13 +3462,9 @@
         <w:pStyle w:val="NoSpacing"/>
       </w:pPr>
       <w:r>
-        <w:rPr>
-          <w:rFonts w:ascii="Consolas" w:hAnsi="Consolas"/>
-          <w:sz w:val="17"/>
-        </w:rPr>
         <w:t>MANDATORY PROJECT REFERENCES</w:t>
         <w:br/>
-        <w:t>Before substantive work, read:</w:t>
+        <w:t>Before substantive work, read these references or use the deterministic coordinator's verified reference identity and authoritative governance digest:</w:t>
         <w:br/>
         <w:t>1. docs/PROJECT_SCOPE_AND_FEATURE_SET.md</w:t>
         <w:br/>
@@ -3414,6 +3484,12 @@
       <w:pPr/>
       <w:r>
         <w:t>Additionally, ticket_runner.py and coordinator.py should prepend the same requirement to every implementer, fast-fix, tester, primary-reviewer, intermediate-reviewer, and final-fallback-reviewer prompt.</w:t>
+      </w:r>
+    </w:p>
+    <w:p>
+      <w:pPr/>
+      <w:r>
+        <w:t>Routine bounded roles use the digest to avoid repeatedly consuming the complete reference package. Project-level planning, fresh sessions, ambiguity, or an apparent conflict still requires reading the relevant full controlled sources.</w:t>
       </w:r>
     </w:p>
     <w:p>

</xml_diff>

<commit_message>
DASH-012/DASH-013: resilient control and resource-aware automation (#27)
* DASH-012: make exit and recovery resilient

* DASH-013: reduce redundant model usage

---------

Co-authored-by: Your Name <your-email@example.com>
</commit_message>
<xml_diff>
--- a/docs/reference-source/Wesnoth_Agent_Development_Functional_Specification.docx
+++ b/docs/reference-source/Wesnoth_Agent_Development_Functional_Specification.docx
@@ -1065,6 +1065,14 @@
         <w:pStyle w:val="ListBullet"/>
       </w:pPr>
       <w:r>
+        <w:t>Implementer and Fast-Fix agents must inspect large source files through targeted search and reads of no more than 120 lines per call rather than requesting an entire large file. Tester and reviewer reads are bounded to 160 lines. This keeps provider context and token limits from turning ordinary scoped work into avoidable infrastructure failures.</w:t>
+      </w:r>
+    </w:p>
+    <w:p>
+      <w:pPr>
+        <w:pStyle w:val="ListBullet"/>
+      </w:pPr>
+      <w:r>
         <w:t>A Gemini reviewer may hit free-tier 429 RESOURCE_EXHAUSTED limits and time out. The reviewer order is Nemotron, Gemini 3.8 Flash, then Gemini 3.6 Flash.</w:t>
       </w:r>
     </w:p>
@@ -1297,7 +1305,7 @@
     </w:p>
     <w:p>
       <w:r>
-        <w:t>Before substantive ticket work, every LLM role must read both reference files or receive an equivalent coordinator-supplied snapshot. Root AGENTS.md must explicitly require this behavior.</w:t>
+        <w:t>Before substantive ticket work, every LLM role must read both reference files or receive an equivalent coordinator-supplied snapshot. For routine bounded work, the deterministic coordinator supplies a verified reference identity plus a compact authoritative governance digest; workers should not reread the full references unless the ticket is ambiguous or appears to conflict. Project-level planners and fresh sessions still read the full references. Root AGENTS.md must explicitly require this behavior.</w:t>
       </w:r>
     </w:p>
     <w:p>
@@ -2155,6 +2163,86 @@
     <w:p>
       <w:pPr/>
       <w:r>
+        <w:t>The selected coordinator model is advisory inside this bounded loop. If its recovery-planning call fails, Python retains the retry by deriving the narrow repair brief from the existing structured failure and required-action fields. The same original allowed paths, complete gate rerun, and two-attempt ceiling still apply; planner unavailability does not silently bypass an otherwise eligible retry.</w:t>
+      </w:r>
+    </w:p>
+    <w:p>
+      <w:pPr/>
+      <w:r>
+        <w:t>For an ordinary deterministic implementation or validation failure whose structured evidence already contains a bounded required action, Python uses that action directly and avoids a separate coordinator-model recovery call. Tester or reviewer findings may still use the selected coordinator model when interpretation is necessary. Neither optimization changes the two-attempt ceiling or permits a missing gate.</w:t>
+      </w:r>
+    </w:p>
+    <w:p>
+      <w:pPr>
+        <w:pStyle w:val="Heading4"/>
+      </w:pPr>
+      <w:r>
+        <w:t>Resource-aware model operation</w:t>
+      </w:r>
+    </w:p>
+    <w:p>
+      <w:pPr/>
+      <w:r>
+        <w:t>Provider quotas and free allocations change independently of this repository, so they are operational inputs rather than authorization boundaries. The coordinator minimizes usage without weakening gates by:</w:t>
+      </w:r>
+    </w:p>
+    <w:p>
+      <w:pPr>
+        <w:pStyle w:val="ListBullet"/>
+      </w:pPr>
+      <w:r>
+        <w:t>deterministically resuming the sole verified unfinished contract without a Sol planning call;</w:t>
+      </w:r>
+    </w:p>
+    <w:p>
+      <w:pPr>
+        <w:pStyle w:val="ListBullet"/>
+      </w:pPr>
+      <w:r>
+        <w:t>caching a validated planning decision for 15 minutes and reusing it only when the coordinator mode, brief, current main, queue, pull requests, worktrees, and planned-priority inventory have an identical fingerprint;</w:t>
+      </w:r>
+    </w:p>
+    <w:p>
+      <w:pPr>
+        <w:pStyle w:val="ListBullet"/>
+      </w:pPr>
+      <w:r>
+        <w:t>using compact reference digests, planning inventory, allowed-path lists, and validation summaries in model prompts;</w:t>
+      </w:r>
+    </w:p>
+    <w:p>
+      <w:pPr>
+        <w:pStyle w:val="ListBullet"/>
+      </w:pPr>
+      <w:r>
+        <w:t>preferring the free Fast-Fix role for mechanical one- or two-file work while retaining GPT-OSS for substantive implementation;</w:t>
+      </w:r>
+    </w:p>
+    <w:p>
+      <w:pPr>
+        <w:pStyle w:val="ListBullet"/>
+      </w:pPr>
+      <w:r>
+        <w:t>waiting at least 60 seconds between completed autonomous tickets to avoid predictable rolling per-minute quota failures and unnecessary fallbacks; and</w:t>
+      </w:r>
+    </w:p>
+    <w:p>
+      <w:pPr>
+        <w:pStyle w:val="ListBullet"/>
+      </w:pPr>
+      <w:r>
+        <w:t>invoking reviewer fallbacks only for infrastructure or non-decisive outcomes, never as duplicate review or verdict shopping.</w:t>
+      </w:r>
+    </w:p>
+    <w:p>
+      <w:pPr/>
+      <w:r>
+        <w:t>Cache entries contain no credentials or raw prompts, expire automatically, and are invalidated by any authoritative inventory change. Resource saving never skips deterministic validation, the independent tester, the decisive reviewer chain, exact-commit approval, CI, or protected-branch controls.</w:t>
+      </w:r>
+    </w:p>
+    <w:p>
+      <w:pPr/>
+      <w:r>
         <w:t>The coordinator must stop immediately, without spending recovery attempts, for errors an implementation ticket cannot safely resolve: dirty or unexpected repository state; deletion approval; missing human approval; protected-path, scope, governance, or security violations; missing credentials or secure bridge; unavailable planner/provider outside existing retry policy; ambiguous or credential-bearing diagnostics; publication, branch-protection, remote-head, merge, or approval mismatch; and explicit user stop. These are recorded with a specific safe reason and required human action.</w:t>
       </w:r>
     </w:p>
@@ -2301,7 +2389,7 @@
     <w:p>
       <w:pPr/>
       <w:r>
-        <w:t>An Exit dashboard action may be accepted from localhost or a paired LAN device only while no planning, ticket-execution, or publication operation is active. The server completes shutdown and removes its own PID, version, and session records before a session-specific marker closes only the CMD process tree that launched that dashboard. The same signal stops the LAN proxy; unrelated consoles, processes, and WSL distributions are not targeted.</w:t>
+        <w:t>An Exit dashboard action is available from localhost or a paired LAN device at all times. When a governed operation is active, Exit first disables automation, records an interrupted state, signals cancellation for the exact active run, and preserves its branch, worktree, and local evidence for later continuation. The native control bridge terminates only that run's secure child process tree. The server then completes shutdown, removes its own PID, version, and session records, and writes a session-specific marker that may close only the CMD process tree which launched that dashboard session. Unrelated consoles, processes, WSL distributions, branches, and worktrees are not targeted. The same session signal stops the LAN proxy.</w:t>
       </w:r>
     </w:p>
     <w:p>
@@ -3374,13 +3462,9 @@
         <w:pStyle w:val="NoSpacing"/>
       </w:pPr>
       <w:r>
-        <w:rPr>
-          <w:rFonts w:ascii="Consolas" w:hAnsi="Consolas"/>
-          <w:sz w:val="17"/>
-        </w:rPr>
         <w:t>MANDATORY PROJECT REFERENCES</w:t>
         <w:br/>
-        <w:t>Before substantive work, read:</w:t>
+        <w:t>Before substantive work, read these references or use the deterministic coordinator's verified reference identity and authoritative governance digest:</w:t>
         <w:br/>
         <w:t>1. docs/PROJECT_SCOPE_AND_FEATURE_SET.md</w:t>
         <w:br/>
@@ -3403,6 +3487,12 @@
       </w:r>
     </w:p>
     <w:p>
+      <w:pPr/>
+      <w:r>
+        <w:t>Routine bounded roles use the digest to avoid repeatedly consuming the complete reference package. Project-level planning, fresh sessions, ambiguity, or an apparent conflict still requires reading the relevant full controlled sources.</w:t>
+      </w:r>
+    </w:p>
+    <w:p>
       <w:r>
         <w:t>This dual mechanism prevents a single missed configuration path from silently removing project context.</w:t>
       </w:r>
@@ -3733,7 +3823,7 @@
         <w:pStyle w:val="ListBullet"/>
       </w:pPr>
       <w:r>
-        <w:t>a safe-state Exit dashboard action scoped to its associated launcher console;</w:t>
+        <w:t>an always-available Exit dashboard action that cancels only its active run, preserves work, and closes its associated launcher console;</w:t>
       </w:r>
     </w:p>
     <w:p>

</xml_diff>

<commit_message>
DASH-019 add model pacing and reviewer resilience
</commit_message>
<xml_diff>
--- a/docs/reference-source/Wesnoth_Agent_Development_Functional_Specification.docx
+++ b/docs/reference-source/Wesnoth_Agent_Development_Functional_Specification.docx
@@ -1000,7 +1000,7 @@
           </w:tcPr>
           <w:p>
             <w:r>
-              <w:t>Final fallback reviewer</w:t>
+              <w:t>Second fallback reviewer</w:t>
             </w:r>
           </w:p>
         </w:tc>
@@ -1020,7 +1020,39 @@
           </w:tcPr>
           <w:p>
             <w:r>
-              <w:t>Final reviewer fallback when Nemotron and Gemini 3.8 Flash are unavailable or non-decisive</w:t>
+              <w:t>Reviewer fallback when Nemotron and Gemini 3.8 Flash are unavailable or non-decisive</w:t>
+            </w:r>
+          </w:p>
+        </w:tc>
+      </w:tr>
+      <w:tr>
+        <w:tc>
+          <w:tcPr>
+            <w:tcW w:type="dxa" w:w="3331"/>
+          </w:tcPr>
+          <w:p>
+            <w:r>
+              <w:t>Final fallback reviewer</w:t>
+            </w:r>
+          </w:p>
+        </w:tc>
+        <w:tc>
+          <w:tcPr>
+            <w:tcW w:type="dxa" w:w="3331"/>
+          </w:tcPr>
+          <w:p>
+            <w:r>
+              <w:t>OpenAI Codex - `gpt-5.6-terra` at medium reasoning</w:t>
+            </w:r>
+          </w:p>
+        </w:tc>
+        <w:tc>
+          <w:tcPr>
+            <w:tcW w:type="dxa" w:w="3331"/>
+          </w:tcPr>
+          <w:p>
+            <w:r>
+              <w:t>Final independent reviewer only when every earlier reviewer is unavailable or non-decisive and Terra did not implement the candidate</w:t>
             </w:r>
           </w:p>
         </w:tc>
@@ -1073,7 +1105,7 @@
         <w:pStyle w:val="ListBullet"/>
       </w:pPr>
       <w:r>
-        <w:t>A Gemini reviewer may hit free-tier 429 RESOURCE_EXHAUSTED limits and time out. The reviewer order is Nemotron, Gemini 3.8 Flash, then Gemini 3.6 Flash.</w:t>
+        <w:t>A Gemini reviewer may hit free-tier 429 RESOURCE_EXHAUSTED limits and time out. The reviewer order is Nemotron, Gemini 3.8 Flash, Gemini 3.6 Flash, then Terra Medium when reviewer independence permits it.</w:t>
       </w:r>
     </w:p>
     <w:p>
@@ -2005,7 +2037,7 @@
     <w:p>
       <w:pPr/>
       <w:r>
-        <w:t>Gemini 3.6 Flash is the final fallback only when Nemotron and Gemini 3.8 Flash are unavailable or non-decisive. No reviewer shopping: a substantive request for changes from any reviewer is authoritative and is not sent to a later fallback solely to seek approval.</w:t>
+        <w:t>Gemini 3.6 Flash follows only when Nemotron and Gemini 3.8 Flash are unavailable or non-decisive. Terra Medium is the final reviewer fallback only when all three earlier reviewers are unavailable or non-decisive and Terra did not implement the candidate; a model never reviews its own implementation. No reviewer shopping: a substantive request for changes from any reviewer is authoritative and is not sent to a later fallback solely to seek approval.</w:t>
       </w:r>
     </w:p>
     <w:p>
@@ -2237,7 +2269,7 @@
     <w:p>
       <w:pPr/>
       <w:r>
-        <w:t>Cache entries contain no credentials or raw prompts, expire automatically, and are invalidated by any authoritative inventory change. Resource saving never skips deterministic validation, the independent tester, the decisive reviewer chain, exact-commit approval, CI, or protected-branch controls.</w:t>
+        <w:t>The ticket runner also applies persistent per-model launch pacing at published free-tier ceilings: 30 RPM for Groq GPT-OSS 120B, 40 RPM for NVIDIA Nemotron, and 300 RPM for Cloudflare Workers AI GLM. Services that publish only an account- or project-specific active quota remain provider-managed rather than receiving an invented repository value. A timeout, quota error, process error, or non-decisive response opens that model's circuit for the next two worktree runs. A valid negative content verdict is not a provider failure and does not open the circuit. State is persisted in the ignored runtime directory so a new runner process cannot immediately repeat a known failing provider call. Cache entries contain no credentials or raw prompts, expire automatically, and are invalidated by any authoritative inventory change. Resource saving never skips deterministic validation, the independent tester, the decisive reviewer chain, exact-commit approval, CI, or protected-branch controls.</w:t>
       </w:r>
     </w:p>
     <w:p>

</xml_diff>

<commit_message>
DASH-019: add model pacing and reviewer resilience (#33)
Enforce published free-tier launch ceilings, persist two-run provider circuits, add Terra Medium as the final independent reviewer fallback, and synchronize controlled references.
</commit_message>
<xml_diff>
--- a/docs/reference-source/Wesnoth_Agent_Development_Functional_Specification.docx
+++ b/docs/reference-source/Wesnoth_Agent_Development_Functional_Specification.docx
@@ -1000,7 +1000,7 @@
           </w:tcPr>
           <w:p>
             <w:r>
-              <w:t>Final fallback reviewer</w:t>
+              <w:t>Second fallback reviewer</w:t>
             </w:r>
           </w:p>
         </w:tc>
@@ -1020,7 +1020,39 @@
           </w:tcPr>
           <w:p>
             <w:r>
-              <w:t>Final reviewer fallback when Nemotron and Gemini 3.8 Flash are unavailable or non-decisive</w:t>
+              <w:t>Reviewer fallback when Nemotron and Gemini 3.8 Flash are unavailable or non-decisive</w:t>
+            </w:r>
+          </w:p>
+        </w:tc>
+      </w:tr>
+      <w:tr>
+        <w:tc>
+          <w:tcPr>
+            <w:tcW w:type="dxa" w:w="3331"/>
+          </w:tcPr>
+          <w:p>
+            <w:r>
+              <w:t>Final fallback reviewer</w:t>
+            </w:r>
+          </w:p>
+        </w:tc>
+        <w:tc>
+          <w:tcPr>
+            <w:tcW w:type="dxa" w:w="3331"/>
+          </w:tcPr>
+          <w:p>
+            <w:r>
+              <w:t>OpenAI Codex - `gpt-5.6-terra` at medium reasoning</w:t>
+            </w:r>
+          </w:p>
+        </w:tc>
+        <w:tc>
+          <w:tcPr>
+            <w:tcW w:type="dxa" w:w="3331"/>
+          </w:tcPr>
+          <w:p>
+            <w:r>
+              <w:t>Final independent reviewer only when every earlier reviewer is unavailable or non-decisive and Terra did not implement the candidate</w:t>
             </w:r>
           </w:p>
         </w:tc>
@@ -1073,7 +1105,7 @@
         <w:pStyle w:val="ListBullet"/>
       </w:pPr>
       <w:r>
-        <w:t>A Gemini reviewer may hit free-tier 429 RESOURCE_EXHAUSTED limits and time out. The reviewer order is Nemotron, Gemini 3.8 Flash, then Gemini 3.6 Flash.</w:t>
+        <w:t>A Gemini reviewer may hit free-tier 429 RESOURCE_EXHAUSTED limits and time out. The reviewer order is Nemotron, Gemini 3.8 Flash, Gemini 3.6 Flash, then Terra Medium when reviewer independence permits it.</w:t>
       </w:r>
     </w:p>
     <w:p>
@@ -2005,7 +2037,7 @@
     <w:p>
       <w:pPr/>
       <w:r>
-        <w:t>Gemini 3.6 Flash is the final fallback only when Nemotron and Gemini 3.8 Flash are unavailable or non-decisive. No reviewer shopping: a substantive request for changes from any reviewer is authoritative and is not sent to a later fallback solely to seek approval.</w:t>
+        <w:t>Gemini 3.6 Flash follows only when Nemotron and Gemini 3.8 Flash are unavailable or non-decisive. Terra Medium is the final reviewer fallback only when all three earlier reviewers are unavailable or non-decisive and Terra did not implement the candidate; a model never reviews its own implementation. No reviewer shopping: a substantive request for changes from any reviewer is authoritative and is not sent to a later fallback solely to seek approval.</w:t>
       </w:r>
     </w:p>
     <w:p>
@@ -2237,7 +2269,7 @@
     <w:p>
       <w:pPr/>
       <w:r>
-        <w:t>Cache entries contain no credentials or raw prompts, expire automatically, and are invalidated by any authoritative inventory change. Resource saving never skips deterministic validation, the independent tester, the decisive reviewer chain, exact-commit approval, CI, or protected-branch controls.</w:t>
+        <w:t>The ticket runner also applies persistent per-model launch pacing at published free-tier ceilings: 30 RPM for Groq GPT-OSS 120B, 40 RPM for NVIDIA Nemotron, and 300 RPM for Cloudflare Workers AI GLM. Services that publish only an account- or project-specific active quota remain provider-managed rather than receiving an invented repository value. A timeout, quota error, process error, or non-decisive response opens that model's circuit for the next two worktree runs. A valid negative content verdict is not a provider failure and does not open the circuit. State is persisted in the ignored runtime directory so a new runner process cannot immediately repeat a known failing provider call. Cache entries contain no credentials or raw prompts, expire automatically, and are invalidated by any authoritative inventory change. Resource saving never skips deterministic validation, the independent tester, the decisive reviewer chain, exact-commit approval, CI, or protected-branch controls.</w:t>
       </w:r>
     </w:p>
     <w:p>

</xml_diff>

<commit_message>
fix: add Terra tester fallback
</commit_message>
<xml_diff>
--- a/docs/reference-source/Wesnoth_Agent_Development_Functional_Specification.docx
+++ b/docs/reference-source/Wesnoth_Agent_Development_Functional_Specification.docx
@@ -914,7 +914,7 @@
           </w:tcPr>
           <w:p>
             <w:r>
-              <w:t>Cloudflare Workers AI - `@cf/zai-org/glm-4.7-flash`</w:t>
+              <w:t>Cloudflare Workers AI - `@cf/zai-org/glm-4.7-flash`; one fallback: OpenAI `gpt-5.6-terra` at medium reasoning</w:t>
             </w:r>
           </w:p>
         </w:tc>
@@ -1052,7 +1052,7 @@
           </w:tcPr>
           <w:p>
             <w:r>
-              <w:t>Final independent reviewer only when every earlier reviewer is unavailable or non-decisive and Terra did not implement the candidate</w:t>
+              <w:t>Final independent reviewer only when every earlier reviewer is unavailable or non-decisive and Terra did not implement or test the candidate</w:t>
             </w:r>
           </w:p>
         </w:tc>
@@ -1097,6 +1097,14 @@
         <w:pStyle w:val="ListBullet"/>
       </w:pPr>
       <w:r>
+        <w:t>When GLM-4.7 Flash is unavailable or returns no decisive tester verdict, the coordinator may invoke Terra Medium once as the independent read-only tester fallback. A substantive GLM FAIL remains authoritative and must not be bypassed. Terra must be withheld from testing when Terra implemented the candidate, and Terra must be withheld from final review when it already tested the candidate.</w:t>
+      </w:r>
+    </w:p>
+    <w:p>
+      <w:pPr>
+        <w:pStyle w:val="ListBullet"/>
+      </w:pPr>
+      <w:r>
         <w:t>Implementer and Fast-Fix agents must inspect large source files through targeted search and reads of no more than 120 lines per call rather than requesting an entire large file. Tester and reviewer reads are bounded to 160 lines. This keeps provider context and token limits from turning ordinary scoped work into avoidable infrastructure failures.</w:t>
       </w:r>
     </w:p>
@@ -2007,7 +2015,7 @@
     </w:p>
     <w:p>
       <w:r>
-        <w:t>A separate read-only model evaluates the implementation against the objective and available evidence.</w:t>
+        <w:t>A separate read-only model evaluates the implementation against the objective and available evidence. GLM-4.7 Flash is primary. Terra Medium may run once when GLM is unavailable or non-decisive, provided Terra did not implement the candidate.</w:t>
       </w:r>
     </w:p>
     <w:p>
@@ -2016,6 +2024,12 @@
       </w:r>
     </w:p>
     <w:p>
+      <w:pPr/>
+      <w:r>
+        <w:t>No tester shopping: a substantive tester FAIL is a gate failure. The coordinator may use the fallback only for provider, timeout, circuit-open, malformed-output, or other non-decisive infrastructure conditions.</w:t>
+      </w:r>
+    </w:p>
+    <w:p>
       <w:pPr>
         <w:pStyle w:val="Heading3"/>
       </w:pPr>
@@ -2037,7 +2051,7 @@
     <w:p>
       <w:pPr/>
       <w:r>
-        <w:t>Gemini 3.6 Flash follows only when Nemotron and Gemini 3.8 Flash are unavailable or non-decisive. Terra Medium is the final reviewer fallback only when all three earlier reviewers are unavailable or non-decisive and Terra did not implement the candidate; a model never reviews its own implementation. No reviewer shopping: a substantive request for changes from any reviewer is authoritative and is not sent to a later fallback solely to seek approval.</w:t>
+        <w:t>Gemini 3.6 Flash follows only when Nemotron and Gemini 3.8 Flash are unavailable or non-decisive. Terra Medium is the final reviewer fallback only when all three earlier reviewers are unavailable or non-decisive and Terra did not implement or test the candidate; a model never reviews its own implementation or prior testing. No reviewer shopping: a substantive request for changes from any reviewer is authoritative and is not sent to a later fallback solely to seek approval.</w:t>
       </w:r>
     </w:p>
     <w:p>

</xml_diff>

<commit_message>
fix: add Terra tester fallback (#35)
Co-authored-by: Your Name <your-email@example.com>
</commit_message>
<xml_diff>
--- a/docs/reference-source/Wesnoth_Agent_Development_Functional_Specification.docx
+++ b/docs/reference-source/Wesnoth_Agent_Development_Functional_Specification.docx
@@ -914,7 +914,7 @@
           </w:tcPr>
           <w:p>
             <w:r>
-              <w:t>Cloudflare Workers AI - `@cf/zai-org/glm-4.7-flash`</w:t>
+              <w:t>Cloudflare Workers AI - `@cf/zai-org/glm-4.7-flash`; one fallback: OpenAI `gpt-5.6-terra` at medium reasoning</w:t>
             </w:r>
           </w:p>
         </w:tc>
@@ -1052,7 +1052,7 @@
           </w:tcPr>
           <w:p>
             <w:r>
-              <w:t>Final independent reviewer only when every earlier reviewer is unavailable or non-decisive and Terra did not implement the candidate</w:t>
+              <w:t>Final independent reviewer only when every earlier reviewer is unavailable or non-decisive and Terra did not implement or test the candidate</w:t>
             </w:r>
           </w:p>
         </w:tc>
@@ -1097,6 +1097,14 @@
         <w:pStyle w:val="ListBullet"/>
       </w:pPr>
       <w:r>
+        <w:t>When GLM-4.7 Flash is unavailable or returns no decisive tester verdict, the coordinator may invoke Terra Medium once as the independent read-only tester fallback. A substantive GLM FAIL remains authoritative and must not be bypassed. Terra must be withheld from testing when Terra implemented the candidate, and Terra must be withheld from final review when it already tested the candidate.</w:t>
+      </w:r>
+    </w:p>
+    <w:p>
+      <w:pPr>
+        <w:pStyle w:val="ListBullet"/>
+      </w:pPr>
+      <w:r>
         <w:t>Implementer and Fast-Fix agents must inspect large source files through targeted search and reads of no more than 120 lines per call rather than requesting an entire large file. Tester and reviewer reads are bounded to 160 lines. This keeps provider context and token limits from turning ordinary scoped work into avoidable infrastructure failures.</w:t>
       </w:r>
     </w:p>
@@ -2007,7 +2015,7 @@
     </w:p>
     <w:p>
       <w:r>
-        <w:t>A separate read-only model evaluates the implementation against the objective and available evidence.</w:t>
+        <w:t>A separate read-only model evaluates the implementation against the objective and available evidence. GLM-4.7 Flash is primary. Terra Medium may run once when GLM is unavailable or non-decisive, provided Terra did not implement the candidate.</w:t>
       </w:r>
     </w:p>
     <w:p>
@@ -2016,6 +2024,12 @@
       </w:r>
     </w:p>
     <w:p>
+      <w:pPr/>
+      <w:r>
+        <w:t>No tester shopping: a substantive tester FAIL is a gate failure. The coordinator may use the fallback only for provider, timeout, circuit-open, malformed-output, or other non-decisive infrastructure conditions.</w:t>
+      </w:r>
+    </w:p>
+    <w:p>
       <w:pPr>
         <w:pStyle w:val="Heading3"/>
       </w:pPr>
@@ -2037,7 +2051,7 @@
     <w:p>
       <w:pPr/>
       <w:r>
-        <w:t>Gemini 3.6 Flash follows only when Nemotron and Gemini 3.8 Flash are unavailable or non-decisive. Terra Medium is the final reviewer fallback only when all three earlier reviewers are unavailable or non-decisive and Terra did not implement the candidate; a model never reviews its own implementation. No reviewer shopping: a substantive request for changes from any reviewer is authoritative and is not sent to a later fallback solely to seek approval.</w:t>
+        <w:t>Gemini 3.6 Flash follows only when Nemotron and Gemini 3.8 Flash are unavailable or non-decisive. Terra Medium is the final reviewer fallback only when all three earlier reviewers are unavailable or non-decisive and Terra did not implement or test the candidate; a model never reviews its own implementation or prior testing. No reviewer shopping: a substantive request for changes from any reviewer is authoritative and is not sent to a later fallback solely to seek approval.</w:t>
       </w:r>
     </w:p>
     <w:p>

</xml_diff>

<commit_message>
GOV: authorize guarded autonomous publication
</commit_message>
<xml_diff>
--- a/docs/reference-source/Wesnoth_Agent_Development_Functional_Specification.docx
+++ b/docs/reference-source/Wesnoth_Agent_Development_Functional_Specification.docx
@@ -2145,7 +2145,7 @@
         <w:pStyle w:val="ListBullet"/>
       </w:pPr>
       <w:r>
-        <w:t>a passing ticket may be committed locally to its ticket branch and added to a FIFO approval queue, but it must not be pushed, opened as a PR, merged, or applied to protected main without a separate explicit human approval for that exact queued commit;</w:t>
+        <w:t>a passing ticket is committed locally to its ticket branch and added to a FIFO approval queue. In manual mode, it must not be pushed, opened as a PR, merged, or applied to protected main without a separate explicit human approval for that exact queued commit. While continuous automation remains enabled, the owner's toggle decision is standing publication authorization for each subsequently completed non-deleting ticket that has a full local PASS; Python may then start the fixed exact-commit publication pipeline automatically, but may not waive, infer, or skip any publication gate;</w:t>
       </w:r>
     </w:p>
     <w:p>
@@ -2321,7 +2321,7 @@
     <w:p>
       <w:pPr/>
       <w:r>
-        <w:t>The dashboard may present one approval action for the fixed publication pipeline. That action is authorization for the exact queued commit only. The deterministic controller must then, in order:</w:t>
+        <w:t>The dashboard may present one approval action for the fixed publication pipeline. In manual mode, that action is authorization for the exact queued commit only. In continuous automation mode, the enabled toggle supplies the same authorization only for a subsequently completed non-deleting ticket with a full local PASS. The deterministic controller must then, in order:</w:t>
       </w:r>
     </w:p>
     <w:p>
@@ -2363,7 +2363,19 @@
     <w:p>
       <w:pPr/>
       <w:r>
-        <w:t>A single approval does not authorize later commits, other queue items, direct pushes to main, force pushes, branch-protection bypass, or credential access. Any head change, failed check, merge conflict, unexpected remote state, or policy rejection terminates the pipeline and requires a new review/approval.</w:t>
+        <w:t>A single manual approval does not authorize later commits, other queue items, direct pushes to main, force pushes, branch-protection bypass, or credential access. Continuous automation authorizes later qualifying tickets only while the toggle remains enabled; the first head change, failed check, merge conflict, unexpected remote state, policy rejection, unresolved deletion, or publication failure cancels that standing authorization, disables automation, and requires a new owner decision.</w:t>
+      </w:r>
+    </w:p>
+    <w:p>
+      <w:pPr/>
+      <w:r>
+        <w:t>When queued tickets form a verified dependency chain, the dashboard may group them into one ordered batch entry. A batch approval must bind every member's queue ID and exact commit SHA, verify that each later member contains its stated predecessor, and publish only the final cumulative head through one pull request. The local PASS evidence for every member remains mandatory. The resulting PR and merge evidence is recorded on every member. Independent, ambiguous, stale, deleting, or non-cumulative records must not be grouped, and partial batch failure stops fail-closed without publishing a different head.</w:t>
+      </w:r>
+    </w:p>
+    <w:p>
+      <w:pPr/>
+      <w:r>
+        <w:t>A failed or stale queue entry may offer an exact Recode with AI action and an exact Delete local remnants action. Recode must preserve the recorded contract, branch, useful remnants, and allowed paths. Deletion requires a separate confirmation bound to the queue ID, commit, managed worktree, and agent branch; it may remove only a clean local worktree and its exact local branch. It must refuse main, protected paths, dirty or mismatched worktrees, newer queue ownership, open pull requests, or any remote branch. The queue card may disappear, but a non-secret audit event remains. No other worktree, branch, remote object, file, or queue record is targeted.</w:t>
       </w:r>
     </w:p>
     <w:p>
@@ -2397,7 +2409,7 @@
     <w:p>
       <w:pPr/>
       <w:r>
-        <w:t>The dashboard places validated local commits in a Ticket approval queue. Each item has an expandable summary of purpose, expected mod impact, files, gates, dependencies, and publication state. The per-ticket approval action is enabled only when deterministic prerequisites are satisfied.</w:t>
+        <w:t>The dashboard places validated local commits in a Ticket approval queue. Each item has an expandable summary of purpose, expected mod impact, files, gates, dependencies, and publication state. Verified cumulative dependency chains appear as one expandable ordered batch. Per-ticket and batch approval actions are enabled only when deterministic prerequisites are satisfied.</w:t>
       </w:r>
     </w:p>
     <w:p>
@@ -3736,7 +3748,7 @@
         <w:pStyle w:val="ListBullet"/>
       </w:pPr>
       <w:r>
-        <w:t>require explicit human/architect authorization for merge at the current maturity level.</w:t>
+        <w:t>require explicit human/architect authorization for merge in manual mode, or an enabled continuous-automation authorization for a subsequently completed, fully passing, non-deleting exact queued commit;</w:t>
       </w:r>
     </w:p>
     <w:p>
@@ -3752,7 +3764,7 @@
         <w:pStyle w:val="ListBullet"/>
       </w:pPr>
       <w:r>
-        <w:t>maintain FIFO dependency ordering for queued autonomous tickets; and</w:t>
+        <w:t>maintain FIFO dependency ordering for queued autonomous tickets, including exact cumulative batch publication when a dependency chain is verified; and</w:t>
       </w:r>
     </w:p>
     <w:p>

</xml_diff>

<commit_message>
GOV: authorize guarded autonomous publication (#42)
Co-authored-by: Your Name <your-email@example.com>
</commit_message>
<xml_diff>
--- a/docs/reference-source/Wesnoth_Agent_Development_Functional_Specification.docx
+++ b/docs/reference-source/Wesnoth_Agent_Development_Functional_Specification.docx
@@ -2145,7 +2145,7 @@
         <w:pStyle w:val="ListBullet"/>
       </w:pPr>
       <w:r>
-        <w:t>a passing ticket may be committed locally to its ticket branch and added to a FIFO approval queue, but it must not be pushed, opened as a PR, merged, or applied to protected main without a separate explicit human approval for that exact queued commit;</w:t>
+        <w:t>a passing ticket is committed locally to its ticket branch and added to a FIFO approval queue. In manual mode, it must not be pushed, opened as a PR, merged, or applied to protected main without a separate explicit human approval for that exact queued commit. While continuous automation remains enabled, the owner's toggle decision is standing publication authorization for each subsequently completed non-deleting ticket that has a full local PASS; Python may then start the fixed exact-commit publication pipeline automatically, but may not waive, infer, or skip any publication gate;</w:t>
       </w:r>
     </w:p>
     <w:p>
@@ -2321,7 +2321,7 @@
     <w:p>
       <w:pPr/>
       <w:r>
-        <w:t>The dashboard may present one approval action for the fixed publication pipeline. That action is authorization for the exact queued commit only. The deterministic controller must then, in order:</w:t>
+        <w:t>The dashboard may present one approval action for the fixed publication pipeline. In manual mode, that action is authorization for the exact queued commit only. In continuous automation mode, the enabled toggle supplies the same authorization only for a subsequently completed non-deleting ticket with a full local PASS. The deterministic controller must then, in order:</w:t>
       </w:r>
     </w:p>
     <w:p>
@@ -2363,7 +2363,19 @@
     <w:p>
       <w:pPr/>
       <w:r>
-        <w:t>A single approval does not authorize later commits, other queue items, direct pushes to main, force pushes, branch-protection bypass, or credential access. Any head change, failed check, merge conflict, unexpected remote state, or policy rejection terminates the pipeline and requires a new review/approval.</w:t>
+        <w:t>A single manual approval does not authorize later commits, other queue items, direct pushes to main, force pushes, branch-protection bypass, or credential access. Continuous automation authorizes later qualifying tickets only while the toggle remains enabled; the first head change, failed check, merge conflict, unexpected remote state, policy rejection, unresolved deletion, or publication failure cancels that standing authorization, disables automation, and requires a new owner decision.</w:t>
+      </w:r>
+    </w:p>
+    <w:p>
+      <w:pPr/>
+      <w:r>
+        <w:t>When queued tickets form a verified dependency chain, the dashboard may group them into one ordered batch entry. A batch approval must bind every member's queue ID and exact commit SHA, verify that each later member contains its stated predecessor, and publish only the final cumulative head through one pull request. The local PASS evidence for every member remains mandatory. The resulting PR and merge evidence is recorded on every member. Independent, ambiguous, stale, deleting, or non-cumulative records must not be grouped, and partial batch failure stops fail-closed without publishing a different head.</w:t>
+      </w:r>
+    </w:p>
+    <w:p>
+      <w:pPr/>
+      <w:r>
+        <w:t>A failed or stale queue entry may offer an exact Recode with AI action and an exact Delete local remnants action. Recode must preserve the recorded contract, branch, useful remnants, and allowed paths. Deletion requires a separate confirmation bound to the queue ID, commit, managed worktree, and agent branch; it may remove only a clean local worktree and its exact local branch. It must refuse main, protected paths, dirty or mismatched worktrees, newer queue ownership, open pull requests, or any remote branch. The queue card may disappear, but a non-secret audit event remains. No other worktree, branch, remote object, file, or queue record is targeted.</w:t>
       </w:r>
     </w:p>
     <w:p>
@@ -2397,7 +2409,7 @@
     <w:p>
       <w:pPr/>
       <w:r>
-        <w:t>The dashboard places validated local commits in a Ticket approval queue. Each item has an expandable summary of purpose, expected mod impact, files, gates, dependencies, and publication state. The per-ticket approval action is enabled only when deterministic prerequisites are satisfied.</w:t>
+        <w:t>The dashboard places validated local commits in a Ticket approval queue. Each item has an expandable summary of purpose, expected mod impact, files, gates, dependencies, and publication state. Verified cumulative dependency chains appear as one expandable ordered batch. Per-ticket and batch approval actions are enabled only when deterministic prerequisites are satisfied.</w:t>
       </w:r>
     </w:p>
     <w:p>
@@ -3736,7 +3748,7 @@
         <w:pStyle w:val="ListBullet"/>
       </w:pPr>
       <w:r>
-        <w:t>require explicit human/architect authorization for merge at the current maturity level.</w:t>
+        <w:t>require explicit human/architect authorization for merge in manual mode, or an enabled continuous-automation authorization for a subsequently completed, fully passing, non-deleting exact queued commit;</w:t>
       </w:r>
     </w:p>
     <w:p>
@@ -3752,7 +3764,7 @@
         <w:pStyle w:val="ListBullet"/>
       </w:pPr>
       <w:r>
-        <w:t>maintain FIFO dependency ordering for queued autonomous tickets; and</w:t>
+        <w:t>maintain FIFO dependency ordering for queued autonomous tickets, including exact cumulative batch publication when a dependency chain is verified; and</w:t>
       </w:r>
     </w:p>
     <w:p>

</xml_diff>

<commit_message>
GOV: add Legends content directives
</commit_message>
<xml_diff>
--- a/docs/reference-source/Wesnoth_Agent_Development_Functional_Specification.docx
+++ b/docs/reference-source/Wesnoth_Agent_Development_Functional_Specification.docx
@@ -105,6 +105,24 @@
     <w:p>
       <w:r>
         <w:t>9. Project references are mandatory context. All agents must operate from the same feature/scope and architecture references.</w:t>
+      </w:r>
+    </w:p>
+    <w:p>
+      <w:pPr/>
+      <w:r>
+        <w:t>10. Lore fidelity and original expression coexist. Player-facing content uses authentic post-Return of the Jedi Expanded Universe (Legends) terminology, while dialogue, code, art, audio, and other expressive implementation remain original.</w:t>
+      </w:r>
+    </w:p>
+    <w:p>
+      <w:pPr/>
+      <w:r>
+        <w:t>11. Project identifiers are namespaced. New project-owned WML/Lua identifiers use the sw_ prefix while localized player-facing fields use full lore names.</w:t>
+      </w:r>
+    </w:p>
+    <w:p>
+      <w:pPr/>
+      <w:r>
+        <w:t>12. Distribution is free and non-commercial. Architecture and dependencies must remain suitable for official Battle for Wesnoth add-on-server distribution without proprietary Star Wars game binaries or assets.</w:t>
       </w:r>
     </w:p>
     <w:p>
@@ -3460,6 +3478,62 @@
       </w:pPr>
       <w:r>
         <w:t>do not copy copyrighted Star Wars prose, dialogue, art, audio, or proprietary assets;</w:t>
+      </w:r>
+    </w:p>
+    <w:p>
+      <w:pPr>
+        <w:pStyle w:val="ListBullet"/>
+      </w:pPr>
+      <w:r>
+        <w:t>use authentic post-Return of the Jedi Expanded Universe (Legends) terminology in player-facing unit, faction, ability, objective, story, and newly written dialogue content when relevant to the ticket;</w:t>
+      </w:r>
+    </w:p>
+    <w:p>
+      <w:pPr>
+        <w:pStyle w:val="ListBullet"/>
+      </w:pPr>
+      <w:r>
+        <w:t>keep all dialogue and story prose original; authentic names and terminology never authorize quotations or close paraphrases of protected expression;</w:t>
+      </w:r>
+    </w:p>
+    <w:p>
+      <w:pPr>
+        <w:pStyle w:val="ListBullet"/>
+      </w:pPr>
+      <w:r>
+        <w:t>give new project-owned WML/Lua IDs a clear sw_ namespace prefix while using complete lore-facing names in localized name=, description=, and story= values;</w:t>
+      </w:r>
+    </w:p>
+    <w:p>
+      <w:pPr>
+        <w:pStyle w:val="ListBullet"/>
+      </w:pPr>
+      <w:r>
+        <w:t>generate custom WML/Lua, macros, terrain logic, events, and scenario configuration from scratch, without extracting or depending on proprietary Star Wars game binaries, source code, data, or assets;</w:t>
+      </w:r>
+    </w:p>
+    <w:p>
+      <w:pPr>
+        <w:pStyle w:val="ListBullet"/>
+      </w:pPr>
+      <w:r>
+        <w:t>keep code and dependencies suitable for free, non-commercial distribution on the official Battle for Wesnoth add-on server;</w:t>
+      </w:r>
+    </w:p>
+    <w:p>
+      <w:pPr>
+        <w:pStyle w:val="ListBullet"/>
+      </w:pPr>
+      <w:r>
+        <w:t>when asked to return code rather than edit an assigned worktree, provide the complete ready-to-use scoped WML/Lua file or snippet in its intended Wesnoth structure, with useful inline comments for event triggers, variable handling, and balance mechanics;</w:t>
+      </w:r>
+    </w:p>
+    <w:p>
+      <w:pPr>
+        <w:pStyle w:val="ListBullet"/>
+      </w:pPr>
+      <w:r>
+        <w:t>translate combat concepts into Wesnoth's turn-based tactical hex framework;</w:t>
       </w:r>
     </w:p>
     <w:p>

</xml_diff>

<commit_message>
GOV: add Legends content directives (#47)
Co-authored-by: Your Name <your-email@example.com>
</commit_message>
<xml_diff>
--- a/docs/reference-source/Wesnoth_Agent_Development_Functional_Specification.docx
+++ b/docs/reference-source/Wesnoth_Agent_Development_Functional_Specification.docx
@@ -105,6 +105,24 @@
     <w:p>
       <w:r>
         <w:t>9. Project references are mandatory context. All agents must operate from the same feature/scope and architecture references.</w:t>
+      </w:r>
+    </w:p>
+    <w:p>
+      <w:pPr/>
+      <w:r>
+        <w:t>10. Lore fidelity and original expression coexist. Player-facing content uses authentic post-Return of the Jedi Expanded Universe (Legends) terminology, while dialogue, code, art, audio, and other expressive implementation remain original.</w:t>
+      </w:r>
+    </w:p>
+    <w:p>
+      <w:pPr/>
+      <w:r>
+        <w:t>11. Project identifiers are namespaced. New project-owned WML/Lua identifiers use the sw_ prefix while localized player-facing fields use full lore names.</w:t>
+      </w:r>
+    </w:p>
+    <w:p>
+      <w:pPr/>
+      <w:r>
+        <w:t>12. Distribution is free and non-commercial. Architecture and dependencies must remain suitable for official Battle for Wesnoth add-on-server distribution without proprietary Star Wars game binaries or assets.</w:t>
       </w:r>
     </w:p>
     <w:p>
@@ -3460,6 +3478,62 @@
       </w:pPr>
       <w:r>
         <w:t>do not copy copyrighted Star Wars prose, dialogue, art, audio, or proprietary assets;</w:t>
+      </w:r>
+    </w:p>
+    <w:p>
+      <w:pPr>
+        <w:pStyle w:val="ListBullet"/>
+      </w:pPr>
+      <w:r>
+        <w:t>use authentic post-Return of the Jedi Expanded Universe (Legends) terminology in player-facing unit, faction, ability, objective, story, and newly written dialogue content when relevant to the ticket;</w:t>
+      </w:r>
+    </w:p>
+    <w:p>
+      <w:pPr>
+        <w:pStyle w:val="ListBullet"/>
+      </w:pPr>
+      <w:r>
+        <w:t>keep all dialogue and story prose original; authentic names and terminology never authorize quotations or close paraphrases of protected expression;</w:t>
+      </w:r>
+    </w:p>
+    <w:p>
+      <w:pPr>
+        <w:pStyle w:val="ListBullet"/>
+      </w:pPr>
+      <w:r>
+        <w:t>give new project-owned WML/Lua IDs a clear sw_ namespace prefix while using complete lore-facing names in localized name=, description=, and story= values;</w:t>
+      </w:r>
+    </w:p>
+    <w:p>
+      <w:pPr>
+        <w:pStyle w:val="ListBullet"/>
+      </w:pPr>
+      <w:r>
+        <w:t>generate custom WML/Lua, macros, terrain logic, events, and scenario configuration from scratch, without extracting or depending on proprietary Star Wars game binaries, source code, data, or assets;</w:t>
+      </w:r>
+    </w:p>
+    <w:p>
+      <w:pPr>
+        <w:pStyle w:val="ListBullet"/>
+      </w:pPr>
+      <w:r>
+        <w:t>keep code and dependencies suitable for free, non-commercial distribution on the official Battle for Wesnoth add-on server;</w:t>
+      </w:r>
+    </w:p>
+    <w:p>
+      <w:pPr>
+        <w:pStyle w:val="ListBullet"/>
+      </w:pPr>
+      <w:r>
+        <w:t>when asked to return code rather than edit an assigned worktree, provide the complete ready-to-use scoped WML/Lua file or snippet in its intended Wesnoth structure, with useful inline comments for event triggers, variable handling, and balance mechanics;</w:t>
+      </w:r>
+    </w:p>
+    <w:p>
+      <w:pPr>
+        <w:pStyle w:val="ListBullet"/>
+      </w:pPr>
+      <w:r>
+        <w:t>translate combat concepts into Wesnoth's turn-based tactical hex framework;</w:t>
       </w:r>
     </w:p>
     <w:p>

</xml_diff>

<commit_message>
GOV: add autonomous backlog refill
</commit_message>
<xml_diff>
--- a/docs/reference-source/Wesnoth_Agent_Development_Functional_Specification.docx
+++ b/docs/reference-source/Wesnoth_Agent_Development_Functional_Specification.docx
@@ -160,6 +160,14 @@
       </w:pPr>
       <w:r>
         <w:t>define bounded tickets;</w:t>
+      </w:r>
+    </w:p>
+    <w:p>
+      <w:pPr>
+        <w:pStyle w:val="ListBullet"/>
+      </w:pPr>
+      <w:r>
+        <w:t>replenish the ordered implementation backlog when continuous automation has no safe existing, resumable, or documented pending ticket;</w:t>
       </w:r>
     </w:p>
     <w:p>
@@ -2123,6 +2131,14 @@
         <w:pStyle w:val="ListBullet"/>
       </w:pPr>
       <w:r>
+        <w:t>when no safe current backlog ticket exists, Sol may generate one small ordered set of bounded implementation contracts in a single compact read-only call; Python validates and persists the safe contracts under ignored runtime state, selects them in order without another planning call, and requests another set only after the current generated set is exhausted or no longer safe;</w:t>
+      </w:r>
+    </w:p>
+    <w:p>
+      <w:pPr>
+        <w:pStyle w:val="ListBullet"/>
+      </w:pPr>
+      <w:r>
         <w:t>Sol must prioritize safe resumable ticket remnants and eligible open pull requests before new work, and may select only an exact branch and pull-request identity supplied by the deterministic planning inventory;</w:t>
       </w:r>
     </w:p>
@@ -2296,6 +2312,12 @@
       </w:pPr>
       <w:r>
         <w:t>invoking reviewer fallbacks only for infrastructure or non-decisive outcomes, never as duplicate review or verdict shopping.</w:t>
+      </w:r>
+    </w:p>
+    <w:p>
+      <w:pPr/>
+      <w:r>
+        <w:t>Backlog replenishment follows the same resource rule. The coordinator sends only a compact inventory of completed priorities, recent publication impacts, queued work, open pull requests, current main, and the owner brief. One call generates a small ordered set; subsequent ticket selection is deterministic and requires no Sol call. Every selected contract is revalidated against current repository state before execution. Invalid or overlapping generated entries are skipped, and a new set is requested only when no generated entry remains safe. If the refill model cannot produce any safe bounded implementation contract, automation pauses with the specific reason instead of looping or burning tokens.</w:t>
       </w:r>
     </w:p>
     <w:p>

</xml_diff>

<commit_message>
GOV: add autonomous backlog refill (#52)
Co-authored-by: Your Name <your-email@example.com>
</commit_message>
<xml_diff>
--- a/docs/reference-source/Wesnoth_Agent_Development_Functional_Specification.docx
+++ b/docs/reference-source/Wesnoth_Agent_Development_Functional_Specification.docx
@@ -160,6 +160,14 @@
       </w:pPr>
       <w:r>
         <w:t>define bounded tickets;</w:t>
+      </w:r>
+    </w:p>
+    <w:p>
+      <w:pPr>
+        <w:pStyle w:val="ListBullet"/>
+      </w:pPr>
+      <w:r>
+        <w:t>replenish the ordered implementation backlog when continuous automation has no safe existing, resumable, or documented pending ticket;</w:t>
       </w:r>
     </w:p>
     <w:p>
@@ -2123,6 +2131,14 @@
         <w:pStyle w:val="ListBullet"/>
       </w:pPr>
       <w:r>
+        <w:t>when no safe current backlog ticket exists, Sol may generate one small ordered set of bounded implementation contracts in a single compact read-only call; Python validates and persists the safe contracts under ignored runtime state, selects them in order without another planning call, and requests another set only after the current generated set is exhausted or no longer safe;</w:t>
+      </w:r>
+    </w:p>
+    <w:p>
+      <w:pPr>
+        <w:pStyle w:val="ListBullet"/>
+      </w:pPr>
+      <w:r>
         <w:t>Sol must prioritize safe resumable ticket remnants and eligible open pull requests before new work, and may select only an exact branch and pull-request identity supplied by the deterministic planning inventory;</w:t>
       </w:r>
     </w:p>
@@ -2296,6 +2312,12 @@
       </w:pPr>
       <w:r>
         <w:t>invoking reviewer fallbacks only for infrastructure or non-decisive outcomes, never as duplicate review or verdict shopping.</w:t>
+      </w:r>
+    </w:p>
+    <w:p>
+      <w:pPr/>
+      <w:r>
+        <w:t>Backlog replenishment follows the same resource rule. The coordinator sends only a compact inventory of completed priorities, recent publication impacts, queued work, open pull requests, current main, and the owner brief. One call generates a small ordered set; subsequent ticket selection is deterministic and requires no Sol call. Every selected contract is revalidated against current repository state before execution. Invalid or overlapping generated entries are skipped, and a new set is requested only when no generated entry remains safe. If the refill model cannot produce any safe bounded implementation contract, automation pauses with the specific reason instead of looping or burning tokens.</w:t>
       </w:r>
     </w:p>
     <w:p>

</xml_diff>

<commit_message>
GOV: keep planned tickets rolling
</commit_message>
<xml_diff>
--- a/docs/reference-source/Wesnoth_Agent_Development_Functional_Specification.docx
+++ b/docs/reference-source/Wesnoth_Agent_Development_Functional_Specification.docx
@@ -908,7 +908,7 @@
           </w:tcPr>
           <w:p>
             <w:r>
-              <w:t>OpenCode Zen - `opencode/ling-3.0-flash-fin-free`</w:t>
+              <w:t>OpenCode Zen - `opencode/ling-3.0-flash-fin-free`; one fallback: OpenAI `gpt-5.6-terra` at low reasoning</w:t>
             </w:r>
           </w:p>
         </w:tc>
@@ -1107,7 +1107,7 @@
         <w:pStyle w:val="ListBullet"/>
       </w:pPr>
       <w:r>
-        <w:t>When the primary GPT-OSS Implementer process fails, the coordinator may invoke exactly one GPT-5.6 Terra fallback at medium reasoning in the same isolated worktree. The fallback uses workspace-write sandboxing, disabled web search, an ephemeral session, a credential-stripped environment, the original objective, and the original allowed-path boundary. It may not commit, merge, push, broaden scope, or run as a Fast-Fix fallback.</w:t>
+        <w:t>When the primary GPT-OSS Implementer process fails, the coordinator may invoke exactly one GPT-5.6 Terra fallback at medium reasoning in the same isolated worktree. When the primary Fast-Fix process fails, the coordinator may invoke exactly one GPT-5.6 Terra fallback at low reasoning in that worktree. Each fallback uses workspace-write sandboxing, disabled web search, an ephemeral session, a credential-stripped environment, the original objective, and the original allowed-path boundary. It may not test, commit, merge, push, delete, or broaden scope.</w:t>
       </w:r>
     </w:p>
     <w:p>
@@ -1156,6 +1156,11 @@
       </w:pPr>
       <w:r>
         <w:t>Retired or unavailable provider model IDs must be treated as infrastructure failures and corrected deliberately, not silently rerouted in a way that weakens review policy.</w:t>
+      </w:r>
+    </w:p>
+    <w:p>
+      <w:r>
+        <w:t>The dashboard planned-ticket selector is a live rolling view derived from the coordinator's validated planning inventory. It contains pending static and generated tickets only, refreshes while the dashboard is open, and removes a ticket after publication evidence marks it complete. This display performs no model call and does not replace Python's ticket validation at execution time.</w:t>
       </w:r>
     </w:p>
     <w:p>

</xml_diff>

<commit_message>
GOV: keep planned tickets rolling (#59)
Co-authored-by: Your Name <your-email@example.com>
</commit_message>
<xml_diff>
--- a/docs/reference-source/Wesnoth_Agent_Development_Functional_Specification.docx
+++ b/docs/reference-source/Wesnoth_Agent_Development_Functional_Specification.docx
@@ -908,7 +908,7 @@
           </w:tcPr>
           <w:p>
             <w:r>
-              <w:t>OpenCode Zen - `opencode/ling-3.0-flash-fin-free`</w:t>
+              <w:t>OpenCode Zen - `opencode/ling-3.0-flash-fin-free`; one fallback: OpenAI `gpt-5.6-terra` at low reasoning</w:t>
             </w:r>
           </w:p>
         </w:tc>
@@ -1107,7 +1107,7 @@
         <w:pStyle w:val="ListBullet"/>
       </w:pPr>
       <w:r>
-        <w:t>When the primary GPT-OSS Implementer process fails, the coordinator may invoke exactly one GPT-5.6 Terra fallback at medium reasoning in the same isolated worktree. The fallback uses workspace-write sandboxing, disabled web search, an ephemeral session, a credential-stripped environment, the original objective, and the original allowed-path boundary. It may not commit, merge, push, broaden scope, or run as a Fast-Fix fallback.</w:t>
+        <w:t>When the primary GPT-OSS Implementer process fails, the coordinator may invoke exactly one GPT-5.6 Terra fallback at medium reasoning in the same isolated worktree. When the primary Fast-Fix process fails, the coordinator may invoke exactly one GPT-5.6 Terra fallback at low reasoning in that worktree. Each fallback uses workspace-write sandboxing, disabled web search, an ephemeral session, a credential-stripped environment, the original objective, and the original allowed-path boundary. It may not test, commit, merge, push, delete, or broaden scope.</w:t>
       </w:r>
     </w:p>
     <w:p>
@@ -1156,6 +1156,11 @@
       </w:pPr>
       <w:r>
         <w:t>Retired or unavailable provider model IDs must be treated as infrastructure failures and corrected deliberately, not silently rerouted in a way that weakens review policy.</w:t>
+      </w:r>
+    </w:p>
+    <w:p>
+      <w:r>
+        <w:t>The dashboard planned-ticket selector is a live rolling view derived from the coordinator's validated planning inventory. It contains pending static and generated tickets only, refreshes while the dashboard is open, and removes a ticket after publication evidence marks it complete. This display performs no model call and does not replace Python's ticket validation at execution time.</w:t>
       </w:r>
     </w:p>
     <w:p>

</xml_diff>

<commit_message>
GOV: enforce Codex write fallback
</commit_message>
<xml_diff>
--- a/docs/reference-source/Wesnoth_Agent_Development_Functional_Specification.docx
+++ b/docs/reference-source/Wesnoth_Agent_Development_Functional_Specification.docx
@@ -1108,6 +1108,14 @@
       </w:pPr>
       <w:r>
         <w:t>When the primary GPT-OSS Implementer process fails, the coordinator may invoke exactly one GPT-5.6 Terra fallback at medium reasoning in the same isolated worktree. When the primary Fast-Fix process fails, the coordinator may invoke exactly one GPT-5.6 Terra fallback at low reasoning in that worktree. Each fallback uses workspace-write sandboxing, disabled web search, an ephemeral session, a credential-stripped environment, the original objective, and the original allowed-path boundary. It may not test, commit, merge, push, delete, or broaden scope.</w:t>
+      </w:r>
+    </w:p>
+    <w:p>
+      <w:pPr>
+        <w:pStyle w:val="ListBullet"/>
+      </w:pPr>
+      <w:r>
+        <w:t>Codex implementation fallbacks request the CLI's auto-reviewed workspace-write mode and verify the effective sandbox reported in the subprocess transcript. If Codex reports read-only or any mode other than workspace-write, Python classifies the fallback as unavailable and stops that worktree run immediately. A zero process exit code without the requested write sandbox is never implementation success and must not consume repeated no-change recovery attempts.</w:t>
       </w:r>
     </w:p>
     <w:p>

</xml_diff>

<commit_message>
GOV: enforce Codex write fallback (#61)
Co-authored-by: Your Name <your-email@example.com>
</commit_message>
<xml_diff>
--- a/docs/reference-source/Wesnoth_Agent_Development_Functional_Specification.docx
+++ b/docs/reference-source/Wesnoth_Agent_Development_Functional_Specification.docx
@@ -1108,6 +1108,14 @@
       </w:pPr>
       <w:r>
         <w:t>When the primary GPT-OSS Implementer process fails, the coordinator may invoke exactly one GPT-5.6 Terra fallback at medium reasoning in the same isolated worktree. When the primary Fast-Fix process fails, the coordinator may invoke exactly one GPT-5.6 Terra fallback at low reasoning in that worktree. Each fallback uses workspace-write sandboxing, disabled web search, an ephemeral session, a credential-stripped environment, the original objective, and the original allowed-path boundary. It may not test, commit, merge, push, delete, or broaden scope.</w:t>
+      </w:r>
+    </w:p>
+    <w:p>
+      <w:pPr>
+        <w:pStyle w:val="ListBullet"/>
+      </w:pPr>
+      <w:r>
+        <w:t>Codex implementation fallbacks request the CLI's auto-reviewed workspace-write mode and verify the effective sandbox reported in the subprocess transcript. If Codex reports read-only or any mode other than workspace-write, Python classifies the fallback as unavailable and stops that worktree run immediately. A zero process exit code without the requested write sandbox is never implementation success and must not consume repeated no-change recovery attempts.</w:t>
       </w:r>
     </w:p>
     <w:p>

</xml_diff>

<commit_message>
DASH: repair native Codex fallbacks
</commit_message>
<xml_diff>
--- a/docs/reference-source/Wesnoth_Agent_Development_Functional_Specification.docx
+++ b/docs/reference-source/Wesnoth_Agent_Development_Functional_Specification.docx
@@ -499,17 +499,17 @@
     </w:p>
     <w:p>
       <w:r>
-        <w:t>Ticket worktrees are created outside the main worktree, under:</w:t>
-      </w:r>
-    </w:p>
-    <w:p>
-      <w:r>
-        <w:t>~/projects/wesnoth-starwars-worktrees/</w:t>
-      </w:r>
-    </w:p>
-    <w:p>
-      <w:r>
-        <w:t>Workers operate only inside their assigned worktree.</w:t>
+        <w:t>Ticket worktrees are created outside the main worktree. Write-capable Codex fallbacks use the launcher-configured Windows-backed root exposed in WSL as:</w:t>
+      </w:r>
+    </w:p>
+    <w:p>
+      <w:r>
+        <w:t>/mnt/c/Users/&lt;Windows user&gt;/Documents/Codex/WesnothAgentWorktrees/</w:t>
+      </w:r>
+    </w:p>
+    <w:p>
+      <w:r>
+        <w:t>Workers operate only inside their assigned worktree. The coordinator continues to inventory the former ~/projects/wesnoth-starwars-worktrees/ root so unfinished tickets are not abandoned. On exact-branch resumption it moves the registered worktree to the Windows-backed root. If a cross-filesystem move is unavailable, Python may recreate only an unchanged clean worktree at the exact existing branch; dirty remnants are preserved and processing stops rather than discarding work.</w:t>
       </w:r>
     </w:p>
     <w:p>
@@ -1107,15 +1107,15 @@
         <w:pStyle w:val="ListBullet"/>
       </w:pPr>
       <w:r>
-        <w:t>When the primary GPT-OSS Implementer process fails, the coordinator may invoke exactly one GPT-5.6 Terra fallback at medium reasoning in the same isolated worktree. When the primary Fast-Fix process fails, the coordinator may invoke exactly one GPT-5.6 Terra fallback at low reasoning in that worktree. Each fallback uses workspace-write sandboxing, disabled web search, an ephemeral session, a credential-stripped environment, the original objective, and the original allowed-path boundary. It may not test, commit, merge, push, delete, or broaden scope.</w:t>
-      </w:r>
-    </w:p>
-    <w:p>
-      <w:pPr>
-        <w:pStyle w:val="ListBullet"/>
-      </w:pPr>
-      <w:r>
-        <w:t>Codex implementation fallbacks request the CLI's auto-reviewed workspace-write mode and verify the effective sandbox reported in the subprocess transcript. If Codex reports read-only or any mode other than workspace-write, Python classifies the fallback as unavailable and stops that worktree run immediately. A zero process exit code without the requested write sandbox is never implementation success and must not consume repeated no-change recovery attempts.</w:t>
+        <w:t>When the primary GPT-OSS Implementer process fails, the coordinator may invoke exactly one GPT-5.6 Terra fallback at medium reasoning in the same isolated worktree. When the primary Fast-Fix process fails, the coordinator may invoke exactly one GPT-5.6 Terra fallback at low reasoning in that worktree. Each fallback uses the Codex CLI's auto-reviewed write path from a native Windows-backed worktree, disabled web search, an ephemeral session, a credential-stripped environment, the original objective, and the original allowed-path boundary. It may not test, commit, merge, push, delete, or broaden scope.</w:t>
+      </w:r>
+    </w:p>
+    <w:p>
+      <w:pPr>
+        <w:pStyle w:val="ListBullet"/>
+      </w:pPr>
+      <w:r>
+        <w:t>Codex 0.153.4 reports sandbox: read-only for its base command sandbox even when --approve-for-me is active and approved patches are applied through automatic review. Python therefore requires a native drive-letter worktree, invokes --approve-for-me without the incompatible explicit --sandbox workspace-write option, requires approval: on-request transcript evidence, and then relies on the process result plus deterministic Git diff, scope, protected-path, validation, tester, and reviewer gates. A UNC or WSL-only worktree, missing approval evidence, or unsupported sandbox report is a local infrastructure hard stop. It must not be recorded as a provider failure or open Terra's two-run provider circuit.</w:t>
       </w:r>
     </w:p>
     <w:p>
@@ -1332,7 +1332,7 @@
         <w:pStyle w:val="ListBullet"/>
       </w:pPr>
       <w:r>
-        <w:t>The Terra Implementer fallback is a narrowly authorized exception to the OpenCode worker tool profile. Codex runs with its workspace-write sandbox, no web search, no forwarded provider credentials, and explicit instructions to edit only the allowed project paths. Deterministic scope and protected-path gates remain authoritative immediately after it returns; sandbox access never grants publication or governance authority.</w:t>
+        <w:t>The Terra Implementer fallback is a narrowly authorized exception to the OpenCode worker tool profile. Codex runs through automatic review in a native Windows-backed managed worktree, with no web search, no forwarded provider credentials, and explicit instructions to edit only the allowed project paths. Its base shell may remain read-only while approved patch operations write through the application review path. Deterministic Git diff, scope, and protected-path gates remain authoritative immediately after it returns; patch approval never grants publication or governance authority.</w:t>
       </w:r>
     </w:p>
     <w:p>
@@ -1661,7 +1661,7 @@
         <w:pStyle w:val="ListBullet"/>
       </w:pPr>
       <w:r>
-        <w:t>worktree: ~/projects/wesnoth-starwars-worktrees/&lt;ticket&gt;-&lt;timestamp&gt;.</w:t>
+        <w:t>worktree: /mnt/c/Users/&lt;Windows user&gt;/Documents/Codex/WesnothAgentWorktrees/&lt;ticket&gt;-&lt;timestamp&gt; when launched through the supported Windows workflow.</w:t>
       </w:r>
     </w:p>
     <w:p>

</xml_diff>

<commit_message>
DASH: repair native Codex fallbacks (#62)
Co-authored-by: Your Name <your-email@example.com>
</commit_message>
<xml_diff>
--- a/docs/reference-source/Wesnoth_Agent_Development_Functional_Specification.docx
+++ b/docs/reference-source/Wesnoth_Agent_Development_Functional_Specification.docx
@@ -499,17 +499,17 @@
     </w:p>
     <w:p>
       <w:r>
-        <w:t>Ticket worktrees are created outside the main worktree, under:</w:t>
-      </w:r>
-    </w:p>
-    <w:p>
-      <w:r>
-        <w:t>~/projects/wesnoth-starwars-worktrees/</w:t>
-      </w:r>
-    </w:p>
-    <w:p>
-      <w:r>
-        <w:t>Workers operate only inside their assigned worktree.</w:t>
+        <w:t>Ticket worktrees are created outside the main worktree. Write-capable Codex fallbacks use the launcher-configured Windows-backed root exposed in WSL as:</w:t>
+      </w:r>
+    </w:p>
+    <w:p>
+      <w:r>
+        <w:t>/mnt/c/Users/&lt;Windows user&gt;/Documents/Codex/WesnothAgentWorktrees/</w:t>
+      </w:r>
+    </w:p>
+    <w:p>
+      <w:r>
+        <w:t>Workers operate only inside their assigned worktree. The coordinator continues to inventory the former ~/projects/wesnoth-starwars-worktrees/ root so unfinished tickets are not abandoned. On exact-branch resumption it moves the registered worktree to the Windows-backed root. If a cross-filesystem move is unavailable, Python may recreate only an unchanged clean worktree at the exact existing branch; dirty remnants are preserved and processing stops rather than discarding work.</w:t>
       </w:r>
     </w:p>
     <w:p>
@@ -1107,15 +1107,15 @@
         <w:pStyle w:val="ListBullet"/>
       </w:pPr>
       <w:r>
-        <w:t>When the primary GPT-OSS Implementer process fails, the coordinator may invoke exactly one GPT-5.6 Terra fallback at medium reasoning in the same isolated worktree. When the primary Fast-Fix process fails, the coordinator may invoke exactly one GPT-5.6 Terra fallback at low reasoning in that worktree. Each fallback uses workspace-write sandboxing, disabled web search, an ephemeral session, a credential-stripped environment, the original objective, and the original allowed-path boundary. It may not test, commit, merge, push, delete, or broaden scope.</w:t>
-      </w:r>
-    </w:p>
-    <w:p>
-      <w:pPr>
-        <w:pStyle w:val="ListBullet"/>
-      </w:pPr>
-      <w:r>
-        <w:t>Codex implementation fallbacks request the CLI's auto-reviewed workspace-write mode and verify the effective sandbox reported in the subprocess transcript. If Codex reports read-only or any mode other than workspace-write, Python classifies the fallback as unavailable and stops that worktree run immediately. A zero process exit code without the requested write sandbox is never implementation success and must not consume repeated no-change recovery attempts.</w:t>
+        <w:t>When the primary GPT-OSS Implementer process fails, the coordinator may invoke exactly one GPT-5.6 Terra fallback at medium reasoning in the same isolated worktree. When the primary Fast-Fix process fails, the coordinator may invoke exactly one GPT-5.6 Terra fallback at low reasoning in that worktree. Each fallback uses the Codex CLI's auto-reviewed write path from a native Windows-backed worktree, disabled web search, an ephemeral session, a credential-stripped environment, the original objective, and the original allowed-path boundary. It may not test, commit, merge, push, delete, or broaden scope.</w:t>
+      </w:r>
+    </w:p>
+    <w:p>
+      <w:pPr>
+        <w:pStyle w:val="ListBullet"/>
+      </w:pPr>
+      <w:r>
+        <w:t>Codex 0.153.4 reports sandbox: read-only for its base command sandbox even when --approve-for-me is active and approved patches are applied through automatic review. Python therefore requires a native drive-letter worktree, invokes --approve-for-me without the incompatible explicit --sandbox workspace-write option, requires approval: on-request transcript evidence, and then relies on the process result plus deterministic Git diff, scope, protected-path, validation, tester, and reviewer gates. A UNC or WSL-only worktree, missing approval evidence, or unsupported sandbox report is a local infrastructure hard stop. It must not be recorded as a provider failure or open Terra's two-run provider circuit.</w:t>
       </w:r>
     </w:p>
     <w:p>
@@ -1332,7 +1332,7 @@
         <w:pStyle w:val="ListBullet"/>
       </w:pPr>
       <w:r>
-        <w:t>The Terra Implementer fallback is a narrowly authorized exception to the OpenCode worker tool profile. Codex runs with its workspace-write sandbox, no web search, no forwarded provider credentials, and explicit instructions to edit only the allowed project paths. Deterministic scope and protected-path gates remain authoritative immediately after it returns; sandbox access never grants publication or governance authority.</w:t>
+        <w:t>The Terra Implementer fallback is a narrowly authorized exception to the OpenCode worker tool profile. Codex runs through automatic review in a native Windows-backed managed worktree, with no web search, no forwarded provider credentials, and explicit instructions to edit only the allowed project paths. Its base shell may remain read-only while approved patch operations write through the application review path. Deterministic Git diff, scope, and protected-path gates remain authoritative immediately after it returns; patch approval never grants publication or governance authority.</w:t>
       </w:r>
     </w:p>
     <w:p>
@@ -1661,7 +1661,7 @@
         <w:pStyle w:val="ListBullet"/>
       </w:pPr>
       <w:r>
-        <w:t>worktree: ~/projects/wesnoth-starwars-worktrees/&lt;ticket&gt;-&lt;timestamp&gt;.</w:t>
+        <w:t>worktree: /mnt/c/Users/&lt;Windows user&gt;/Documents/Codex/WesnothAgentWorktrees/&lt;ticket&gt;-&lt;timestamp&gt; when launched through the supported Windows workflow.</w:t>
       </w:r>
     </w:p>
     <w:p>

</xml_diff>

<commit_message>
GOVERNANCE: define current model worker routing
</commit_message>
<xml_diff>
--- a/docs/reference-source/Wesnoth_Agent_Development_Functional_Specification.docx
+++ b/docs/reference-source/Wesnoth_Agent_Development_Functional_Specification.docx
@@ -803,7 +803,7 @@
     </w:p>
     <w:p>
       <w:r>
-        <w:t>Baseline routing:</w:t>
+        <w:t>Current routing:</w:t>
       </w:r>
     </w:p>
     <w:tbl>
@@ -876,7 +876,7 @@
           </w:tcPr>
           <w:p>
             <w:r>
-              <w:t>Groq - `groq/openai/gpt-oss-120b`; one fallback: OpenAI `gpt-5.6-terra` at medium reasoning</w:t>
+              <w:t>OpenAI Codex - `gpt-5.6-terra` at medium reasoning; one fallback: `gpt-5.6-luna` at low reasoning</w:t>
             </w:r>
           </w:p>
         </w:tc>
@@ -908,7 +908,7 @@
           </w:tcPr>
           <w:p>
             <w:r>
-              <w:t>OpenCode Zen - `opencode/ling-3.0-flash-fin-free`; one fallback: OpenAI `gpt-5.6-terra` at low reasoning</w:t>
+              <w:t>OpenAI Codex - `gpt-5.6-luna` at medium reasoning; one fallback: `gpt-5.6-luna` at low reasoning</w:t>
             </w:r>
           </w:p>
         </w:tc>
@@ -940,7 +940,7 @@
           </w:tcPr>
           <w:p>
             <w:r>
-              <w:t>Cloudflare Workers AI - `@cf/zai-org/glm-4.7-flash`; one fallback: OpenAI `gpt-5.6-terra` at medium reasoning</w:t>
+              <w:t>OpenAI Codex - `gpt-5.6-luna` at medium reasoning; one fallback: `gpt-5.6-luna` at low reasoning</w:t>
             </w:r>
           </w:p>
         </w:tc>
@@ -994,7 +994,7 @@
           </w:tcPr>
           <w:p>
             <w:r>
-              <w:t>Intermediate reviewer</w:t>
+              <w:t>Reviewer fallback</w:t>
             </w:r>
           </w:p>
         </w:tc>
@@ -1004,7 +1004,7 @@
           </w:tcPr>
           <w:p>
             <w:r>
-              <w:t>Google - `google/gemini-3.8-flash`</w:t>
+              <w:t>OpenAI Codex - `gpt-5.6-luna` at low reasoning</w:t>
             </w:r>
           </w:p>
         </w:tc>
@@ -1014,71 +1014,7 @@
           </w:tcPr>
           <w:p>
             <w:r>
-              <w:t>First reviewer fallback for infrastructure/non-decisive primary failure</w:t>
-            </w:r>
-          </w:p>
-        </w:tc>
-      </w:tr>
-      <w:tr>
-        <w:tc>
-          <w:tcPr>
-            <w:tcW w:type="dxa" w:w="3331"/>
-          </w:tcPr>
-          <w:p>
-            <w:r>
-              <w:t>Second fallback reviewer</w:t>
-            </w:r>
-          </w:p>
-        </w:tc>
-        <w:tc>
-          <w:tcPr>
-            <w:tcW w:type="dxa" w:w="3331"/>
-          </w:tcPr>
-          <w:p>
-            <w:r>
-              <w:t>Google - `google/gemini-3.6-flash`</w:t>
-            </w:r>
-          </w:p>
-        </w:tc>
-        <w:tc>
-          <w:tcPr>
-            <w:tcW w:type="dxa" w:w="3331"/>
-          </w:tcPr>
-          <w:p>
-            <w:r>
-              <w:t>Reviewer fallback when Nemotron and Gemini 3.8 Flash are unavailable or non-decisive</w:t>
-            </w:r>
-          </w:p>
-        </w:tc>
-      </w:tr>
-      <w:tr>
-        <w:tc>
-          <w:tcPr>
-            <w:tcW w:type="dxa" w:w="3331"/>
-          </w:tcPr>
-          <w:p>
-            <w:r>
-              <w:t>Final fallback reviewer</w:t>
-            </w:r>
-          </w:p>
-        </w:tc>
-        <w:tc>
-          <w:tcPr>
-            <w:tcW w:type="dxa" w:w="3331"/>
-          </w:tcPr>
-          <w:p>
-            <w:r>
-              <w:t>OpenAI Codex - `gpt-5.6-terra` at medium reasoning</w:t>
-            </w:r>
-          </w:p>
-        </w:tc>
-        <w:tc>
-          <w:tcPr>
-            <w:tcW w:type="dxa" w:w="3331"/>
-          </w:tcPr>
-          <w:p>
-            <w:r>
-              <w:t>Final independent reviewer only when every earlier reviewer is unavailable or non-decisive and Terra did not implement or test the candidate</w:t>
+              <w:t>Only when Nemotron is unavailable or non-decisive</w:t>
             </w:r>
           </w:p>
         </w:tc>
@@ -1099,15 +1035,15 @@
         <w:pStyle w:val="ListBullet"/>
       </w:pPr>
       <w:r>
-        <w:t>Groq GPT-OSS 120B has successfully implemented tickets but may occasionally emit malformed tool-call output. This is a provider/tool-generation failure class, not necessarily a code failure.</w:t>
-      </w:r>
-    </w:p>
-    <w:p>
-      <w:pPr>
-        <w:pStyle w:val="ListBullet"/>
-      </w:pPr>
-      <w:r>
-        <w:t>When the primary GPT-OSS Implementer process fails, the coordinator may invoke exactly one GPT-5.6 Terra fallback at medium reasoning in the same isolated worktree. When the primary Fast-Fix process fails, the coordinator may invoke exactly one GPT-5.6 Terra fallback at low reasoning in that worktree. Each fallback uses the Codex CLI's auto-reviewed write path from a native Windows-backed worktree, disabled web search, an ephemeral session, a credential-stripped environment, the original objective, and the original allowed-path boundary. It may not test, commit, merge, push, delete, or broaden scope.</w:t>
+        <w:t>Terra Medium is the primary implementation model. Luna Medium is used for bounded Fast-Fix and independent Tester work; deterministic validation remains model-free.</w:t>
+      </w:r>
+    </w:p>
+    <w:p>
+      <w:pPr>
+        <w:pStyle w:val="ListBullet"/>
+      </w:pPr>
+      <w:r>
+        <w:t>When an Implementer, Fast-Fix, Tester, or Reviewer invocation is unavailable or non-decisive, the coordinator may invoke exactly one GPT-5.6 Luna Light fallback for that same stage. A substantive FAIL or REQUEST_CHANGES is authoritative and must not be bypassed. Write-capable Terra and Luna calls use the Codex CLI's auto-reviewed write path from a native Windows-backed worktree, disabled web search, an ephemeral session, a credential-stripped environment, the original objective, and the original allowed-path boundary. They may not test, commit, merge, push, delete, or broaden scope.</w:t>
       </w:r>
     </w:p>
     <w:p>
@@ -1123,15 +1059,15 @@
         <w:pStyle w:val="ListBullet"/>
       </w:pPr>
       <w:r>
-        <w:t>A failed Terra fallback is an immediate provider/worker hard stop and does not consume either of the two bounded code-recovery attempts. If Terra produces a candidate but a later deterministic, test, or review gate fails, the normal bounded recovery policy applies.</w:t>
-      </w:r>
-    </w:p>
-    <w:p>
-      <w:pPr>
-        <w:pStyle w:val="ListBullet"/>
-      </w:pPr>
-      <w:r>
-        <w:t>When GLM-4.7 Flash is unavailable or returns no decisive tester verdict, the coordinator may invoke Terra Medium once as the independent read-only tester fallback. A substantive GLM FAIL remains authoritative and must not be bypassed. Terra must be withheld from testing when Terra implemented the candidate, and Terra must be withheld from final review when it already tested the candidate.</w:t>
+        <w:t>A failed Luna Light fallback is an immediate provider/worker hard stop and does not consume either of the two bounded code-recovery attempts. If a worker produces a candidate but a later deterministic, test, or review gate fails, the normal bounded recovery policy applies.</w:t>
+      </w:r>
+    </w:p>
+    <w:p>
+      <w:pPr>
+        <w:pStyle w:val="ListBullet"/>
+      </w:pPr>
+      <w:r>
+        <w:t>The Tester uses Luna Medium in a read-only sandbox and may use Luna Light once when unavailable or non-decisive. A substantive tester FAIL remains authoritative and must not be bypassed. The Reviewer uses independent Nemotron first and may use Luna Light once only for an unavailable or non-decisive primary review.</w:t>
       </w:r>
     </w:p>
     <w:p>
@@ -1147,7 +1083,7 @@
         <w:pStyle w:val="ListBullet"/>
       </w:pPr>
       <w:r>
-        <w:t>A Gemini reviewer may hit free-tier 429 RESOURCE_EXHAUSTED limits and time out. The reviewer order is Nemotron, Gemini 3.8 Flash, Gemini 3.6 Flash, then Terra Medium when reviewer independence permits it.</w:t>
+        <w:t>Nemotron 3 120B is the independent primary reviewer. Luna Light is its only configured fallback; unavailable legacy Google routes are not used in unattended review.</w:t>
       </w:r>
     </w:p>
     <w:p>
@@ -1172,6 +1108,11 @@
       </w:r>
     </w:p>
     <w:p>
+      <w:r>
+        <w:t>For each model-backed worker, the dashboard records and displays the exact coordinator dispatch text actually supplied to that worker. This is a redacted runtime record, not a reconstructed summary: credential-like values are removed before it enters shared dashboard state. The record makes the role's current instruction auditable without exposing environment values or implying that a worker received only the original ticket prose.</w:t>
+      </w:r>
+    </w:p>
+    <w:p>
       <w:pPr>
         <w:pStyle w:val="Heading2"/>
       </w:pPr>
@@ -1332,7 +1273,7 @@
         <w:pStyle w:val="ListBullet"/>
       </w:pPr>
       <w:r>
-        <w:t>The Terra Implementer fallback is a narrowly authorized exception to the OpenCode worker tool profile. Codex runs through automatic review in a native Windows-backed managed worktree, with no web search, no forwarded provider credentials, and explicit instructions to edit only the allowed project paths. Its base shell may remain read-only while approved patch operations write through the application review path. Deterministic Git diff, scope, and protected-path gates remain authoritative immediately after it returns; patch approval never grants publication or governance authority.</w:t>
+        <w:t>Write-capable Terra and Luna worker calls are narrowly authorized exceptions to the OpenCode worker tool profile. Codex runs through automatic review in a native Windows-backed managed worktree, with no web search, no forwarded provider credentials, and explicit instructions to edit only the allowed project paths. Its base shell may remain read-only while approved patch operations write through the application review path. Deterministic Git diff, scope, and protected-path gates remain authoritative immediately after it returns; patch approval never grants publication or governance authority.</w:t>
       </w:r>
     </w:p>
     <w:p>
@@ -2054,7 +1995,7 @@
     </w:p>
     <w:p>
       <w:r>
-        <w:t>A separate read-only model evaluates the implementation against the objective and available evidence. GLM-4.7 Flash is primary. Terra Medium may run once when GLM is unavailable or non-decisive, provided Terra did not implement the candidate.</w:t>
+        <w:t>A separate read-only Luna Medium tester evaluates the implementation against the objective and available evidence. Luna Light may run once only when Luna Medium is unavailable or non-decisive.</w:t>
       </w:r>
     </w:p>
     <w:p>
@@ -2078,19 +2019,19 @@
     </w:p>
     <w:p>
       <w:r>
-        <w:t>Nemotron runs as the independent primary reviewer.</w:t>
+        <w:t>Nemotron 3 120B runs as the independent primary reviewer.</w:t>
       </w:r>
     </w:p>
     <w:p>
       <w:pPr/>
       <w:r>
-        <w:t>Gemini 3.8 Flash is used only when Nemotron is unavailable or non-decisive due to infrastructure conditions such as timeout, quota failure, or malformed output.</w:t>
+        <w:t>Luna Light is used only when Nemotron is unavailable or non-decisive due to an infrastructure condition such as timeout, quota failure, or malformed output.</w:t>
       </w:r>
     </w:p>
     <w:p>
       <w:pPr/>
       <w:r>
-        <w:t>Gemini 3.6 Flash follows only when Nemotron and Gemini 3.8 Flash are unavailable or non-decisive. Terra Medium is the final reviewer fallback only when all three earlier reviewers are unavailable or non-decisive and Terra did not implement or test the candidate; a model never reviews its own implementation or prior testing. No reviewer shopping: a substantive request for changes from any reviewer is authoritative and is not sent to a later fallback solely to seek approval.</w:t>
+        <w:t>No reviewer shopping: a substantive request for changes from Nemotron or Luna Light is authoritative and is not sent to a later model solely to seek approval.</w:t>
       </w:r>
     </w:p>
     <w:p>
@@ -2308,7 +2249,7 @@
         <w:pStyle w:val="ListBullet"/>
       </w:pPr>
       <w:r>
-        <w:t>preferring the free Fast-Fix role for mechanical one- or two-file work while retaining GPT-OSS for substantive implementation;</w:t>
+        <w:t>using Luna Medium for mechanical Fast-Fix work and Terra Medium for substantive implementation;</w:t>
       </w:r>
     </w:p>
     <w:p>
@@ -2336,7 +2277,7 @@
     <w:p>
       <w:pPr/>
       <w:r>
-        <w:t>The ticket runner also applies persistent per-model launch pacing at published free-tier ceilings: 30 RPM for Groq GPT-OSS 120B, 40 RPM for NVIDIA Nemotron, and 300 RPM for Cloudflare Workers AI GLM. Services that publish only an account- or project-specific active quota remain provider-managed rather than receiving an invented repository value. A timeout, quota error, process error, or non-decisive response opens that model's circuit for the next two worktree runs. A valid negative content verdict is not a provider failure and does not open the circuit. State is persisted in the ignored runtime directory so a new runner process cannot immediately repeat a known failing provider call. Cache entries contain no credentials or raw prompts, expire automatically, and are invalidated by any authoritative inventory change. Resource saving never skips deterministic validation, the independent tester, the decisive reviewer chain, exact-commit approval, CI, or protected-branch controls.</w:t>
+        <w:t>The ticket runner applies persistent per-model launch pacing at the published 40 RPM Nemotron ceiling. Codex account usage remains account-managed. A timeout, quota error, process error, or non-decisive response opens that exact policy route's circuit for the next two worktree runs; Luna Medium and Luna Light are tracked separately so the one configured fallback remains available. A valid negative content verdict is not a provider failure and does not open a circuit. State is persisted in the ignored runtime directory so a new runner process cannot immediately repeat a known failing provider call. Cache entries contain no credentials or raw prompts, expire automatically, and are invalidated by any authoritative inventory change. Resource saving never skips deterministic validation, the independent tester, the decisive reviewer chain, exact-commit approval, CI, or protected-branch controls.</w:t>
       </w:r>
     </w:p>
     <w:p>

</xml_diff>

<commit_message>
GOVERNANCE: define current model worker routing (#113)
Co-authored-by: Your Name <your-email@example.com>
</commit_message>
<xml_diff>
--- a/docs/reference-source/Wesnoth_Agent_Development_Functional_Specification.docx
+++ b/docs/reference-source/Wesnoth_Agent_Development_Functional_Specification.docx
@@ -803,7 +803,7 @@
     </w:p>
     <w:p>
       <w:r>
-        <w:t>Baseline routing:</w:t>
+        <w:t>Current routing:</w:t>
       </w:r>
     </w:p>
     <w:tbl>
@@ -876,7 +876,7 @@
           </w:tcPr>
           <w:p>
             <w:r>
-              <w:t>Groq - `groq/openai/gpt-oss-120b`; one fallback: OpenAI `gpt-5.6-terra` at medium reasoning</w:t>
+              <w:t>OpenAI Codex - `gpt-5.6-terra` at medium reasoning; one fallback: `gpt-5.6-luna` at low reasoning</w:t>
             </w:r>
           </w:p>
         </w:tc>
@@ -908,7 +908,7 @@
           </w:tcPr>
           <w:p>
             <w:r>
-              <w:t>OpenCode Zen - `opencode/ling-3.0-flash-fin-free`; one fallback: OpenAI `gpt-5.6-terra` at low reasoning</w:t>
+              <w:t>OpenAI Codex - `gpt-5.6-luna` at medium reasoning; one fallback: `gpt-5.6-luna` at low reasoning</w:t>
             </w:r>
           </w:p>
         </w:tc>
@@ -940,7 +940,7 @@
           </w:tcPr>
           <w:p>
             <w:r>
-              <w:t>Cloudflare Workers AI - `@cf/zai-org/glm-4.7-flash`; one fallback: OpenAI `gpt-5.6-terra` at medium reasoning</w:t>
+              <w:t>OpenAI Codex - `gpt-5.6-luna` at medium reasoning; one fallback: `gpt-5.6-luna` at low reasoning</w:t>
             </w:r>
           </w:p>
         </w:tc>
@@ -994,7 +994,7 @@
           </w:tcPr>
           <w:p>
             <w:r>
-              <w:t>Intermediate reviewer</w:t>
+              <w:t>Reviewer fallback</w:t>
             </w:r>
           </w:p>
         </w:tc>
@@ -1004,7 +1004,7 @@
           </w:tcPr>
           <w:p>
             <w:r>
-              <w:t>Google - `google/gemini-3.8-flash`</w:t>
+              <w:t>OpenAI Codex - `gpt-5.6-luna` at low reasoning</w:t>
             </w:r>
           </w:p>
         </w:tc>
@@ -1014,71 +1014,7 @@
           </w:tcPr>
           <w:p>
             <w:r>
-              <w:t>First reviewer fallback for infrastructure/non-decisive primary failure</w:t>
-            </w:r>
-          </w:p>
-        </w:tc>
-      </w:tr>
-      <w:tr>
-        <w:tc>
-          <w:tcPr>
-            <w:tcW w:type="dxa" w:w="3331"/>
-          </w:tcPr>
-          <w:p>
-            <w:r>
-              <w:t>Second fallback reviewer</w:t>
-            </w:r>
-          </w:p>
-        </w:tc>
-        <w:tc>
-          <w:tcPr>
-            <w:tcW w:type="dxa" w:w="3331"/>
-          </w:tcPr>
-          <w:p>
-            <w:r>
-              <w:t>Google - `google/gemini-3.6-flash`</w:t>
-            </w:r>
-          </w:p>
-        </w:tc>
-        <w:tc>
-          <w:tcPr>
-            <w:tcW w:type="dxa" w:w="3331"/>
-          </w:tcPr>
-          <w:p>
-            <w:r>
-              <w:t>Reviewer fallback when Nemotron and Gemini 3.8 Flash are unavailable or non-decisive</w:t>
-            </w:r>
-          </w:p>
-        </w:tc>
-      </w:tr>
-      <w:tr>
-        <w:tc>
-          <w:tcPr>
-            <w:tcW w:type="dxa" w:w="3331"/>
-          </w:tcPr>
-          <w:p>
-            <w:r>
-              <w:t>Final fallback reviewer</w:t>
-            </w:r>
-          </w:p>
-        </w:tc>
-        <w:tc>
-          <w:tcPr>
-            <w:tcW w:type="dxa" w:w="3331"/>
-          </w:tcPr>
-          <w:p>
-            <w:r>
-              <w:t>OpenAI Codex - `gpt-5.6-terra` at medium reasoning</w:t>
-            </w:r>
-          </w:p>
-        </w:tc>
-        <w:tc>
-          <w:tcPr>
-            <w:tcW w:type="dxa" w:w="3331"/>
-          </w:tcPr>
-          <w:p>
-            <w:r>
-              <w:t>Final independent reviewer only when every earlier reviewer is unavailable or non-decisive and Terra did not implement or test the candidate</w:t>
+              <w:t>Only when Nemotron is unavailable or non-decisive</w:t>
             </w:r>
           </w:p>
         </w:tc>
@@ -1099,15 +1035,15 @@
         <w:pStyle w:val="ListBullet"/>
       </w:pPr>
       <w:r>
-        <w:t>Groq GPT-OSS 120B has successfully implemented tickets but may occasionally emit malformed tool-call output. This is a provider/tool-generation failure class, not necessarily a code failure.</w:t>
-      </w:r>
-    </w:p>
-    <w:p>
-      <w:pPr>
-        <w:pStyle w:val="ListBullet"/>
-      </w:pPr>
-      <w:r>
-        <w:t>When the primary GPT-OSS Implementer process fails, the coordinator may invoke exactly one GPT-5.6 Terra fallback at medium reasoning in the same isolated worktree. When the primary Fast-Fix process fails, the coordinator may invoke exactly one GPT-5.6 Terra fallback at low reasoning in that worktree. Each fallback uses the Codex CLI's auto-reviewed write path from a native Windows-backed worktree, disabled web search, an ephemeral session, a credential-stripped environment, the original objective, and the original allowed-path boundary. It may not test, commit, merge, push, delete, or broaden scope.</w:t>
+        <w:t>Terra Medium is the primary implementation model. Luna Medium is used for bounded Fast-Fix and independent Tester work; deterministic validation remains model-free.</w:t>
+      </w:r>
+    </w:p>
+    <w:p>
+      <w:pPr>
+        <w:pStyle w:val="ListBullet"/>
+      </w:pPr>
+      <w:r>
+        <w:t>When an Implementer, Fast-Fix, Tester, or Reviewer invocation is unavailable or non-decisive, the coordinator may invoke exactly one GPT-5.6 Luna Light fallback for that same stage. A substantive FAIL or REQUEST_CHANGES is authoritative and must not be bypassed. Write-capable Terra and Luna calls use the Codex CLI's auto-reviewed write path from a native Windows-backed worktree, disabled web search, an ephemeral session, a credential-stripped environment, the original objective, and the original allowed-path boundary. They may not test, commit, merge, push, delete, or broaden scope.</w:t>
       </w:r>
     </w:p>
     <w:p>
@@ -1123,15 +1059,15 @@
         <w:pStyle w:val="ListBullet"/>
       </w:pPr>
       <w:r>
-        <w:t>A failed Terra fallback is an immediate provider/worker hard stop and does not consume either of the two bounded code-recovery attempts. If Terra produces a candidate but a later deterministic, test, or review gate fails, the normal bounded recovery policy applies.</w:t>
-      </w:r>
-    </w:p>
-    <w:p>
-      <w:pPr>
-        <w:pStyle w:val="ListBullet"/>
-      </w:pPr>
-      <w:r>
-        <w:t>When GLM-4.7 Flash is unavailable or returns no decisive tester verdict, the coordinator may invoke Terra Medium once as the independent read-only tester fallback. A substantive GLM FAIL remains authoritative and must not be bypassed. Terra must be withheld from testing when Terra implemented the candidate, and Terra must be withheld from final review when it already tested the candidate.</w:t>
+        <w:t>A failed Luna Light fallback is an immediate provider/worker hard stop and does not consume either of the two bounded code-recovery attempts. If a worker produces a candidate but a later deterministic, test, or review gate fails, the normal bounded recovery policy applies.</w:t>
+      </w:r>
+    </w:p>
+    <w:p>
+      <w:pPr>
+        <w:pStyle w:val="ListBullet"/>
+      </w:pPr>
+      <w:r>
+        <w:t>The Tester uses Luna Medium in a read-only sandbox and may use Luna Light once when unavailable or non-decisive. A substantive tester FAIL remains authoritative and must not be bypassed. The Reviewer uses independent Nemotron first and may use Luna Light once only for an unavailable or non-decisive primary review.</w:t>
       </w:r>
     </w:p>
     <w:p>
@@ -1147,7 +1083,7 @@
         <w:pStyle w:val="ListBullet"/>
       </w:pPr>
       <w:r>
-        <w:t>A Gemini reviewer may hit free-tier 429 RESOURCE_EXHAUSTED limits and time out. The reviewer order is Nemotron, Gemini 3.8 Flash, Gemini 3.6 Flash, then Terra Medium when reviewer independence permits it.</w:t>
+        <w:t>Nemotron 3 120B is the independent primary reviewer. Luna Light is its only configured fallback; unavailable legacy Google routes are not used in unattended review.</w:t>
       </w:r>
     </w:p>
     <w:p>
@@ -1172,6 +1108,11 @@
       </w:r>
     </w:p>
     <w:p>
+      <w:r>
+        <w:t>For each model-backed worker, the dashboard records and displays the exact coordinator dispatch text actually supplied to that worker. This is a redacted runtime record, not a reconstructed summary: credential-like values are removed before it enters shared dashboard state. The record makes the role's current instruction auditable without exposing environment values or implying that a worker received only the original ticket prose.</w:t>
+      </w:r>
+    </w:p>
+    <w:p>
       <w:pPr>
         <w:pStyle w:val="Heading2"/>
       </w:pPr>
@@ -1332,7 +1273,7 @@
         <w:pStyle w:val="ListBullet"/>
       </w:pPr>
       <w:r>
-        <w:t>The Terra Implementer fallback is a narrowly authorized exception to the OpenCode worker tool profile. Codex runs through automatic review in a native Windows-backed managed worktree, with no web search, no forwarded provider credentials, and explicit instructions to edit only the allowed project paths. Its base shell may remain read-only while approved patch operations write through the application review path. Deterministic Git diff, scope, and protected-path gates remain authoritative immediately after it returns; patch approval never grants publication or governance authority.</w:t>
+        <w:t>Write-capable Terra and Luna worker calls are narrowly authorized exceptions to the OpenCode worker tool profile. Codex runs through automatic review in a native Windows-backed managed worktree, with no web search, no forwarded provider credentials, and explicit instructions to edit only the allowed project paths. Its base shell may remain read-only while approved patch operations write through the application review path. Deterministic Git diff, scope, and protected-path gates remain authoritative immediately after it returns; patch approval never grants publication or governance authority.</w:t>
       </w:r>
     </w:p>
     <w:p>
@@ -2054,7 +1995,7 @@
     </w:p>
     <w:p>
       <w:r>
-        <w:t>A separate read-only model evaluates the implementation against the objective and available evidence. GLM-4.7 Flash is primary. Terra Medium may run once when GLM is unavailable or non-decisive, provided Terra did not implement the candidate.</w:t>
+        <w:t>A separate read-only Luna Medium tester evaluates the implementation against the objective and available evidence. Luna Light may run once only when Luna Medium is unavailable or non-decisive.</w:t>
       </w:r>
     </w:p>
     <w:p>
@@ -2078,19 +2019,19 @@
     </w:p>
     <w:p>
       <w:r>
-        <w:t>Nemotron runs as the independent primary reviewer.</w:t>
+        <w:t>Nemotron 3 120B runs as the independent primary reviewer.</w:t>
       </w:r>
     </w:p>
     <w:p>
       <w:pPr/>
       <w:r>
-        <w:t>Gemini 3.8 Flash is used only when Nemotron is unavailable or non-decisive due to infrastructure conditions such as timeout, quota failure, or malformed output.</w:t>
+        <w:t>Luna Light is used only when Nemotron is unavailable or non-decisive due to an infrastructure condition such as timeout, quota failure, or malformed output.</w:t>
       </w:r>
     </w:p>
     <w:p>
       <w:pPr/>
       <w:r>
-        <w:t>Gemini 3.6 Flash follows only when Nemotron and Gemini 3.8 Flash are unavailable or non-decisive. Terra Medium is the final reviewer fallback only when all three earlier reviewers are unavailable or non-decisive and Terra did not implement or test the candidate; a model never reviews its own implementation or prior testing. No reviewer shopping: a substantive request for changes from any reviewer is authoritative and is not sent to a later fallback solely to seek approval.</w:t>
+        <w:t>No reviewer shopping: a substantive request for changes from Nemotron or Luna Light is authoritative and is not sent to a later model solely to seek approval.</w:t>
       </w:r>
     </w:p>
     <w:p>
@@ -2308,7 +2249,7 @@
         <w:pStyle w:val="ListBullet"/>
       </w:pPr>
       <w:r>
-        <w:t>preferring the free Fast-Fix role for mechanical one- or two-file work while retaining GPT-OSS for substantive implementation;</w:t>
+        <w:t>using Luna Medium for mechanical Fast-Fix work and Terra Medium for substantive implementation;</w:t>
       </w:r>
     </w:p>
     <w:p>
@@ -2336,7 +2277,7 @@
     <w:p>
       <w:pPr/>
       <w:r>
-        <w:t>The ticket runner also applies persistent per-model launch pacing at published free-tier ceilings: 30 RPM for Groq GPT-OSS 120B, 40 RPM for NVIDIA Nemotron, and 300 RPM for Cloudflare Workers AI GLM. Services that publish only an account- or project-specific active quota remain provider-managed rather than receiving an invented repository value. A timeout, quota error, process error, or non-decisive response opens that model's circuit for the next two worktree runs. A valid negative content verdict is not a provider failure and does not open the circuit. State is persisted in the ignored runtime directory so a new runner process cannot immediately repeat a known failing provider call. Cache entries contain no credentials or raw prompts, expire automatically, and are invalidated by any authoritative inventory change. Resource saving never skips deterministic validation, the independent tester, the decisive reviewer chain, exact-commit approval, CI, or protected-branch controls.</w:t>
+        <w:t>The ticket runner applies persistent per-model launch pacing at the published 40 RPM Nemotron ceiling. Codex account usage remains account-managed. A timeout, quota error, process error, or non-decisive response opens that exact policy route's circuit for the next two worktree runs; Luna Medium and Luna Light are tracked separately so the one configured fallback remains available. A valid negative content verdict is not a provider failure and does not open a circuit. State is persisted in the ignored runtime directory so a new runner process cannot immediately repeat a known failing provider call. Cache entries contain no credentials or raw prompts, expire automatically, and are invalidated by any authoritative inventory change. Resource saving never skips deterministic validation, the independent tester, the decisive reviewer chain, exact-commit approval, CI, or protected-branch controls.</w:t>
       </w:r>
     </w:p>
     <w:p>

</xml_diff>